<commit_message>
doc(rapport): Ajout de chapitre
</commit_message>
<xml_diff>
--- a/DOC/src/AugustoRomain-P_DB_GestionAeroport-Rapport.docx
+++ b/DOC/src/AugustoRomain-P_DB_GestionAeroport-Rapport.docx
@@ -3425,21 +3425,7 @@
         <w:rPr>
           <w:rFonts w:ascii="Calibri" w:hAnsi="Calibri" w:cs="Calibri"/>
         </w:rPr>
-        <w:t xml:space="preserve">L’aéroport international </w:t>
-      </w:r>
-      <w:proofErr w:type="spellStart"/>
-      <w:r>
-        <w:rPr>
-          <w:rFonts w:ascii="Calibri" w:hAnsi="Calibri" w:cs="Calibri"/>
-        </w:rPr>
-        <w:t>SkyConnect</w:t>
-      </w:r>
-      <w:proofErr w:type="spellEnd"/>
-      <w:r>
-        <w:rPr>
-          <w:rFonts w:ascii="Calibri" w:hAnsi="Calibri" w:cs="Calibri"/>
-        </w:rPr>
-        <w:t xml:space="preserve"> repose sur une infrastructure complexe qui permet d’assurer un suivi rigoureux des vols et des passagers. Pour garantir une gestion fluide des opérations, un système de gestion de bases de données a été conçu. Ce système repose sur</w:t>
+        <w:t>L’aéroport international SkyConnect repose sur une infrastructure complexe qui permet d’assurer un suivi rigoureux des vols et des passagers. Pour garantir une gestion fluide des opérations, un système de gestion de bases de données a été conçu. Ce système repose sur</w:t>
       </w:r>
       <w:r>
         <w:rPr>
@@ -4127,7 +4113,6 @@
         </w:rPr>
         <w:t xml:space="preserve">L’interconnexion entre ces différentes entités assure une gestion fluide et efficace du trafic aérien. En utilisant ce modèle, l’aéroport </w:t>
       </w:r>
-      <w:proofErr w:type="spellStart"/>
       <w:r>
         <w:rPr>
           <w:rFonts w:ascii="Calibri" w:hAnsi="Calibri" w:cs="Calibri"/>
@@ -4136,7 +4121,6 @@
         </w:rPr>
         <w:t>SkyConnect</w:t>
       </w:r>
-      <w:proofErr w:type="spellEnd"/>
       <w:r>
         <w:rPr>
           <w:rFonts w:ascii="Calibri" w:hAnsi="Calibri" w:cs="Calibri"/>
@@ -4301,15 +4285,7 @@
         <w:ind w:left="284"/>
       </w:pPr>
       <w:r>
-        <w:t xml:space="preserve">Pour comprendre ce que la méthode MERISE et quelles sont les étapes de construction d’un MCD, j’ai utilisé </w:t>
-      </w:r>
-      <w:proofErr w:type="spellStart"/>
-      <w:r>
-        <w:t>ChatGPT</w:t>
-      </w:r>
-      <w:proofErr w:type="spellEnd"/>
-      <w:r>
-        <w:t xml:space="preserve"> ce qui m’a permis de bien comprendre cette méthode et de l’utiliser. </w:t>
+        <w:t xml:space="preserve">Pour comprendre ce que la méthode MERISE et quelles sont les étapes de construction d’un MCD, j’ai utilisé ChatGPT ce qui m’a permis de bien comprendre cette méthode et de l’utiliser. </w:t>
       </w:r>
     </w:p>
     <w:p>
@@ -4337,15 +4313,7 @@
         <w:ind w:left="284"/>
       </w:pPr>
       <w:r>
-        <w:t xml:space="preserve">Prompt </w:t>
-      </w:r>
-      <w:proofErr w:type="spellStart"/>
-      <w:r>
-        <w:t>ChatGPT</w:t>
-      </w:r>
-      <w:proofErr w:type="spellEnd"/>
-      <w:r>
-        <w:t xml:space="preserve"> : </w:t>
+        <w:t xml:space="preserve">Prompt ChatGPT : </w:t>
       </w:r>
     </w:p>
     <w:p>
@@ -5102,22 +5070,12 @@
                 <w:rFonts w:ascii="Calibri" w:hAnsi="Calibri" w:cs="Calibri"/>
               </w:rPr>
             </w:pPr>
-            <w:proofErr w:type="spellStart"/>
-            <w:proofErr w:type="gramStart"/>
-            <w:r>
-              <w:rPr>
-                <w:rFonts w:ascii="Calibri" w:hAnsi="Calibri" w:cs="Calibri"/>
-              </w:rPr>
-              <w:t>aeroport</w:t>
-            </w:r>
-            <w:proofErr w:type="gramEnd"/>
-            <w:r>
-              <w:rPr>
-                <w:rFonts w:ascii="Calibri" w:hAnsi="Calibri" w:cs="Calibri"/>
-              </w:rPr>
-              <w:t>_id</w:t>
-            </w:r>
-            <w:proofErr w:type="spellEnd"/>
+            <w:r>
+              <w:rPr>
+                <w:rFonts w:ascii="Calibri" w:hAnsi="Calibri" w:cs="Calibri"/>
+              </w:rPr>
+              <w:t>aeroport_id</w:t>
+            </w:r>
           </w:p>
         </w:tc>
         <w:tc>
@@ -5171,22 +5129,12 @@
                 <w:rFonts w:ascii="Calibri" w:hAnsi="Calibri" w:cs="Calibri"/>
               </w:rPr>
             </w:pPr>
-            <w:proofErr w:type="spellStart"/>
-            <w:proofErr w:type="gramStart"/>
-            <w:r>
-              <w:rPr>
-                <w:rFonts w:ascii="Calibri" w:hAnsi="Calibri" w:cs="Calibri"/>
-              </w:rPr>
-              <w:t>aeroport</w:t>
-            </w:r>
-            <w:proofErr w:type="gramEnd"/>
-            <w:r>
-              <w:rPr>
-                <w:rFonts w:ascii="Calibri" w:hAnsi="Calibri" w:cs="Calibri"/>
-              </w:rPr>
-              <w:t>_nom</w:t>
-            </w:r>
-            <w:proofErr w:type="spellEnd"/>
+            <w:r>
+              <w:rPr>
+                <w:rFonts w:ascii="Calibri" w:hAnsi="Calibri" w:cs="Calibri"/>
+              </w:rPr>
+              <w:t>aeroport_nom</w:t>
+            </w:r>
           </w:p>
         </w:tc>
         <w:tc>
@@ -5240,22 +5188,12 @@
                 <w:rFonts w:ascii="Calibri" w:hAnsi="Calibri" w:cs="Calibri"/>
               </w:rPr>
             </w:pPr>
-            <w:proofErr w:type="spellStart"/>
-            <w:proofErr w:type="gramStart"/>
-            <w:r>
-              <w:rPr>
-                <w:rFonts w:ascii="Calibri" w:hAnsi="Calibri" w:cs="Calibri"/>
-              </w:rPr>
-              <w:t>aeroport</w:t>
-            </w:r>
-            <w:proofErr w:type="gramEnd"/>
-            <w:r>
-              <w:rPr>
-                <w:rFonts w:ascii="Calibri" w:hAnsi="Calibri" w:cs="Calibri"/>
-              </w:rPr>
-              <w:t>_code_iata</w:t>
-            </w:r>
-            <w:proofErr w:type="spellEnd"/>
+            <w:r>
+              <w:rPr>
+                <w:rFonts w:ascii="Calibri" w:hAnsi="Calibri" w:cs="Calibri"/>
+              </w:rPr>
+              <w:t>aeroport_code_iata</w:t>
+            </w:r>
           </w:p>
         </w:tc>
         <w:tc>
@@ -5309,22 +5247,12 @@
                 <w:rFonts w:ascii="Calibri" w:hAnsi="Calibri" w:cs="Calibri"/>
               </w:rPr>
             </w:pPr>
-            <w:proofErr w:type="spellStart"/>
-            <w:proofErr w:type="gramStart"/>
-            <w:r>
-              <w:rPr>
-                <w:rFonts w:ascii="Calibri" w:hAnsi="Calibri" w:cs="Calibri"/>
-              </w:rPr>
-              <w:t>aeroport</w:t>
-            </w:r>
-            <w:proofErr w:type="gramEnd"/>
-            <w:r>
-              <w:rPr>
-                <w:rFonts w:ascii="Calibri" w:hAnsi="Calibri" w:cs="Calibri"/>
-              </w:rPr>
-              <w:t>_code_icao</w:t>
-            </w:r>
-            <w:proofErr w:type="spellEnd"/>
+            <w:r>
+              <w:rPr>
+                <w:rFonts w:ascii="Calibri" w:hAnsi="Calibri" w:cs="Calibri"/>
+              </w:rPr>
+              <w:t>aeroport_code_icao</w:t>
+            </w:r>
           </w:p>
         </w:tc>
         <w:tc>
@@ -5455,22 +5383,12 @@
                 <w:rFonts w:ascii="Calibri" w:hAnsi="Calibri" w:cs="Calibri"/>
               </w:rPr>
             </w:pPr>
-            <w:proofErr w:type="spellStart"/>
-            <w:proofErr w:type="gramStart"/>
-            <w:r>
-              <w:rPr>
-                <w:rFonts w:ascii="Calibri" w:hAnsi="Calibri" w:cs="Calibri"/>
-              </w:rPr>
-              <w:t>compagnie</w:t>
-            </w:r>
-            <w:proofErr w:type="gramEnd"/>
-            <w:r>
-              <w:rPr>
-                <w:rFonts w:ascii="Calibri" w:hAnsi="Calibri" w:cs="Calibri"/>
-              </w:rPr>
-              <w:t>_id</w:t>
-            </w:r>
-            <w:proofErr w:type="spellEnd"/>
+            <w:r>
+              <w:rPr>
+                <w:rFonts w:ascii="Calibri" w:hAnsi="Calibri" w:cs="Calibri"/>
+              </w:rPr>
+              <w:t>compagnie_id</w:t>
+            </w:r>
           </w:p>
         </w:tc>
         <w:tc>
@@ -5524,22 +5442,12 @@
                 <w:rFonts w:ascii="Calibri" w:hAnsi="Calibri" w:cs="Calibri"/>
               </w:rPr>
             </w:pPr>
-            <w:proofErr w:type="spellStart"/>
-            <w:proofErr w:type="gramStart"/>
-            <w:r>
-              <w:rPr>
-                <w:rFonts w:ascii="Calibri" w:hAnsi="Calibri" w:cs="Calibri"/>
-              </w:rPr>
-              <w:t>compagnie</w:t>
-            </w:r>
-            <w:proofErr w:type="gramEnd"/>
-            <w:r>
-              <w:rPr>
-                <w:rFonts w:ascii="Calibri" w:hAnsi="Calibri" w:cs="Calibri"/>
-              </w:rPr>
-              <w:t>_nom</w:t>
-            </w:r>
-            <w:proofErr w:type="spellEnd"/>
+            <w:r>
+              <w:rPr>
+                <w:rFonts w:ascii="Calibri" w:hAnsi="Calibri" w:cs="Calibri"/>
+              </w:rPr>
+              <w:t>compagnie_nom</w:t>
+            </w:r>
           </w:p>
         </w:tc>
         <w:tc>
@@ -5593,22 +5501,12 @@
                 <w:rFonts w:ascii="Calibri" w:hAnsi="Calibri" w:cs="Calibri"/>
               </w:rPr>
             </w:pPr>
-            <w:proofErr w:type="spellStart"/>
-            <w:proofErr w:type="gramStart"/>
-            <w:r>
-              <w:rPr>
-                <w:rFonts w:ascii="Calibri" w:hAnsi="Calibri" w:cs="Calibri"/>
-              </w:rPr>
-              <w:t>compagnie</w:t>
-            </w:r>
-            <w:proofErr w:type="gramEnd"/>
-            <w:r>
-              <w:rPr>
-                <w:rFonts w:ascii="Calibri" w:hAnsi="Calibri" w:cs="Calibri"/>
-              </w:rPr>
-              <w:t>_code_iata</w:t>
-            </w:r>
-            <w:proofErr w:type="spellEnd"/>
+            <w:r>
+              <w:rPr>
+                <w:rFonts w:ascii="Calibri" w:hAnsi="Calibri" w:cs="Calibri"/>
+              </w:rPr>
+              <w:t>compagnie_code_iata</w:t>
+            </w:r>
           </w:p>
         </w:tc>
         <w:tc>
@@ -5739,22 +5637,12 @@
                 <w:rFonts w:ascii="Calibri" w:hAnsi="Calibri" w:cs="Calibri"/>
               </w:rPr>
             </w:pPr>
-            <w:proofErr w:type="spellStart"/>
-            <w:proofErr w:type="gramStart"/>
-            <w:r>
-              <w:rPr>
-                <w:rFonts w:ascii="Calibri" w:hAnsi="Calibri" w:cs="Calibri"/>
-              </w:rPr>
-              <w:t>avion</w:t>
-            </w:r>
-            <w:proofErr w:type="gramEnd"/>
-            <w:r>
-              <w:rPr>
-                <w:rFonts w:ascii="Calibri" w:hAnsi="Calibri" w:cs="Calibri"/>
-              </w:rPr>
-              <w:t>_id</w:t>
-            </w:r>
-            <w:proofErr w:type="spellEnd"/>
+            <w:r>
+              <w:rPr>
+                <w:rFonts w:ascii="Calibri" w:hAnsi="Calibri" w:cs="Calibri"/>
+              </w:rPr>
+              <w:t>avion_id</w:t>
+            </w:r>
           </w:p>
         </w:tc>
         <w:tc>
@@ -5808,22 +5696,12 @@
                 <w:rFonts w:ascii="Calibri" w:hAnsi="Calibri" w:cs="Calibri"/>
               </w:rPr>
             </w:pPr>
-            <w:proofErr w:type="spellStart"/>
-            <w:proofErr w:type="gramStart"/>
-            <w:r>
-              <w:rPr>
-                <w:rFonts w:ascii="Calibri" w:hAnsi="Calibri" w:cs="Calibri"/>
-              </w:rPr>
-              <w:t>avion</w:t>
-            </w:r>
-            <w:proofErr w:type="gramEnd"/>
-            <w:r>
-              <w:rPr>
-                <w:rFonts w:ascii="Calibri" w:hAnsi="Calibri" w:cs="Calibri"/>
-              </w:rPr>
-              <w:t>_immatriculation</w:t>
-            </w:r>
-            <w:proofErr w:type="spellEnd"/>
+            <w:r>
+              <w:rPr>
+                <w:rFonts w:ascii="Calibri" w:hAnsi="Calibri" w:cs="Calibri"/>
+              </w:rPr>
+              <w:t>avion_immatriculation</w:t>
+            </w:r>
           </w:p>
         </w:tc>
         <w:tc>
@@ -5877,22 +5755,12 @@
                 <w:rFonts w:ascii="Calibri" w:hAnsi="Calibri" w:cs="Calibri"/>
               </w:rPr>
             </w:pPr>
-            <w:proofErr w:type="spellStart"/>
-            <w:proofErr w:type="gramStart"/>
-            <w:r>
-              <w:rPr>
-                <w:rFonts w:ascii="Calibri" w:hAnsi="Calibri" w:cs="Calibri"/>
-              </w:rPr>
-              <w:t>avion</w:t>
-            </w:r>
-            <w:proofErr w:type="gramEnd"/>
-            <w:r>
-              <w:rPr>
-                <w:rFonts w:ascii="Calibri" w:hAnsi="Calibri" w:cs="Calibri"/>
-              </w:rPr>
-              <w:t>_capacite</w:t>
-            </w:r>
-            <w:proofErr w:type="spellEnd"/>
+            <w:r>
+              <w:rPr>
+                <w:rFonts w:ascii="Calibri" w:hAnsi="Calibri" w:cs="Calibri"/>
+              </w:rPr>
+              <w:t>avion_capacite</w:t>
+            </w:r>
           </w:p>
         </w:tc>
         <w:tc>
@@ -6023,22 +5891,12 @@
                 <w:rFonts w:ascii="Calibri" w:hAnsi="Calibri" w:cs="Calibri"/>
               </w:rPr>
             </w:pPr>
-            <w:proofErr w:type="spellStart"/>
-            <w:proofErr w:type="gramStart"/>
-            <w:r>
-              <w:rPr>
-                <w:rFonts w:ascii="Calibri" w:hAnsi="Calibri" w:cs="Calibri"/>
-              </w:rPr>
-              <w:t>type</w:t>
-            </w:r>
-            <w:proofErr w:type="gramEnd"/>
-            <w:r>
-              <w:rPr>
-                <w:rFonts w:ascii="Calibri" w:hAnsi="Calibri" w:cs="Calibri"/>
-              </w:rPr>
-              <w:t>_avion_id</w:t>
-            </w:r>
-            <w:proofErr w:type="spellEnd"/>
+            <w:r>
+              <w:rPr>
+                <w:rFonts w:ascii="Calibri" w:hAnsi="Calibri" w:cs="Calibri"/>
+              </w:rPr>
+              <w:t>type_avion_id</w:t>
+            </w:r>
           </w:p>
         </w:tc>
         <w:tc>
@@ -6092,22 +5950,12 @@
                 <w:rFonts w:ascii="Calibri" w:hAnsi="Calibri" w:cs="Calibri"/>
               </w:rPr>
             </w:pPr>
-            <w:proofErr w:type="spellStart"/>
-            <w:proofErr w:type="gramStart"/>
-            <w:r>
-              <w:rPr>
-                <w:rFonts w:ascii="Calibri" w:hAnsi="Calibri" w:cs="Calibri"/>
-              </w:rPr>
-              <w:t>type</w:t>
-            </w:r>
-            <w:proofErr w:type="gramEnd"/>
-            <w:r>
-              <w:rPr>
-                <w:rFonts w:ascii="Calibri" w:hAnsi="Calibri" w:cs="Calibri"/>
-              </w:rPr>
-              <w:t>_avion_nom</w:t>
-            </w:r>
-            <w:proofErr w:type="spellEnd"/>
+            <w:r>
+              <w:rPr>
+                <w:rFonts w:ascii="Calibri" w:hAnsi="Calibri" w:cs="Calibri"/>
+              </w:rPr>
+              <w:t>type_avion_nom</w:t>
+            </w:r>
           </w:p>
         </w:tc>
         <w:tc>
@@ -6161,22 +6009,12 @@
                 <w:rFonts w:ascii="Calibri" w:hAnsi="Calibri" w:cs="Calibri"/>
               </w:rPr>
             </w:pPr>
-            <w:proofErr w:type="spellStart"/>
-            <w:proofErr w:type="gramStart"/>
-            <w:r>
-              <w:rPr>
-                <w:rFonts w:ascii="Calibri" w:hAnsi="Calibri" w:cs="Calibri"/>
-              </w:rPr>
-              <w:t>type</w:t>
-            </w:r>
-            <w:proofErr w:type="gramEnd"/>
-            <w:r>
-              <w:rPr>
-                <w:rFonts w:ascii="Calibri" w:hAnsi="Calibri" w:cs="Calibri"/>
-              </w:rPr>
-              <w:t>_avion_description</w:t>
-            </w:r>
-            <w:proofErr w:type="spellEnd"/>
+            <w:r>
+              <w:rPr>
+                <w:rFonts w:ascii="Calibri" w:hAnsi="Calibri" w:cs="Calibri"/>
+              </w:rPr>
+              <w:t>type_avion_description</w:t>
+            </w:r>
           </w:p>
         </w:tc>
         <w:tc>
@@ -6307,22 +6145,12 @@
                 <w:rFonts w:ascii="Calibri" w:hAnsi="Calibri" w:cs="Calibri"/>
               </w:rPr>
             </w:pPr>
-            <w:proofErr w:type="spellStart"/>
-            <w:proofErr w:type="gramStart"/>
-            <w:r>
-              <w:rPr>
-                <w:rFonts w:ascii="Calibri" w:hAnsi="Calibri" w:cs="Calibri"/>
-              </w:rPr>
-              <w:t>programme</w:t>
-            </w:r>
-            <w:proofErr w:type="gramEnd"/>
-            <w:r>
-              <w:rPr>
-                <w:rFonts w:ascii="Calibri" w:hAnsi="Calibri" w:cs="Calibri"/>
-              </w:rPr>
-              <w:t>_vol_id</w:t>
-            </w:r>
-            <w:proofErr w:type="spellEnd"/>
+            <w:r>
+              <w:rPr>
+                <w:rFonts w:ascii="Calibri" w:hAnsi="Calibri" w:cs="Calibri"/>
+              </w:rPr>
+              <w:t>programme_vol_id</w:t>
+            </w:r>
           </w:p>
         </w:tc>
         <w:tc>
@@ -6376,22 +6204,12 @@
                 <w:rFonts w:ascii="Calibri" w:hAnsi="Calibri" w:cs="Calibri"/>
               </w:rPr>
             </w:pPr>
-            <w:proofErr w:type="spellStart"/>
-            <w:proofErr w:type="gramStart"/>
-            <w:r>
-              <w:rPr>
-                <w:rFonts w:ascii="Calibri" w:hAnsi="Calibri" w:cs="Calibri"/>
-              </w:rPr>
-              <w:t>vol</w:t>
-            </w:r>
-            <w:proofErr w:type="gramEnd"/>
-            <w:r>
-              <w:rPr>
-                <w:rFonts w:ascii="Calibri" w:hAnsi="Calibri" w:cs="Calibri"/>
-              </w:rPr>
-              <w:t>_numero</w:t>
-            </w:r>
-            <w:proofErr w:type="spellEnd"/>
+            <w:r>
+              <w:rPr>
+                <w:rFonts w:ascii="Calibri" w:hAnsi="Calibri" w:cs="Calibri"/>
+              </w:rPr>
+              <w:t>vol_numero</w:t>
+            </w:r>
           </w:p>
         </w:tc>
         <w:tc>
@@ -6445,22 +6263,12 @@
                 <w:rFonts w:ascii="Calibri" w:hAnsi="Calibri" w:cs="Calibri"/>
               </w:rPr>
             </w:pPr>
-            <w:proofErr w:type="spellStart"/>
-            <w:proofErr w:type="gramStart"/>
-            <w:r>
-              <w:rPr>
-                <w:rFonts w:ascii="Calibri" w:hAnsi="Calibri" w:cs="Calibri"/>
-              </w:rPr>
-              <w:t>programme</w:t>
-            </w:r>
-            <w:proofErr w:type="gramEnd"/>
-            <w:r>
-              <w:rPr>
-                <w:rFonts w:ascii="Calibri" w:hAnsi="Calibri" w:cs="Calibri"/>
-              </w:rPr>
-              <w:t>_heure_depart</w:t>
-            </w:r>
-            <w:proofErr w:type="spellEnd"/>
+            <w:r>
+              <w:rPr>
+                <w:rFonts w:ascii="Calibri" w:hAnsi="Calibri" w:cs="Calibri"/>
+              </w:rPr>
+              <w:t>programme_heure_depart</w:t>
+            </w:r>
           </w:p>
         </w:tc>
         <w:tc>
@@ -6514,22 +6322,12 @@
                 <w:rFonts w:ascii="Calibri" w:hAnsi="Calibri" w:cs="Calibri"/>
               </w:rPr>
             </w:pPr>
-            <w:proofErr w:type="spellStart"/>
-            <w:proofErr w:type="gramStart"/>
-            <w:r>
-              <w:rPr>
-                <w:rFonts w:ascii="Calibri" w:hAnsi="Calibri" w:cs="Calibri"/>
-              </w:rPr>
-              <w:t>programme</w:t>
-            </w:r>
-            <w:proofErr w:type="gramEnd"/>
-            <w:r>
-              <w:rPr>
-                <w:rFonts w:ascii="Calibri" w:hAnsi="Calibri" w:cs="Calibri"/>
-              </w:rPr>
-              <w:t>_heure_arrivee</w:t>
-            </w:r>
-            <w:proofErr w:type="spellEnd"/>
+            <w:r>
+              <w:rPr>
+                <w:rFonts w:ascii="Calibri" w:hAnsi="Calibri" w:cs="Calibri"/>
+              </w:rPr>
+              <w:t>programme_heure_arrivee</w:t>
+            </w:r>
           </w:p>
         </w:tc>
         <w:tc>
@@ -6660,22 +6458,12 @@
                 <w:rFonts w:ascii="Calibri" w:hAnsi="Calibri" w:cs="Calibri"/>
               </w:rPr>
             </w:pPr>
-            <w:proofErr w:type="spellStart"/>
-            <w:proofErr w:type="gramStart"/>
-            <w:r>
-              <w:rPr>
-                <w:rFonts w:ascii="Calibri" w:hAnsi="Calibri" w:cs="Calibri"/>
-              </w:rPr>
-              <w:t>jour</w:t>
-            </w:r>
-            <w:proofErr w:type="gramEnd"/>
-            <w:r>
-              <w:rPr>
-                <w:rFonts w:ascii="Calibri" w:hAnsi="Calibri" w:cs="Calibri"/>
-              </w:rPr>
-              <w:t>_semaine_id</w:t>
-            </w:r>
-            <w:proofErr w:type="spellEnd"/>
+            <w:r>
+              <w:rPr>
+                <w:rFonts w:ascii="Calibri" w:hAnsi="Calibri" w:cs="Calibri"/>
+              </w:rPr>
+              <w:t>jour_semaine_id</w:t>
+            </w:r>
           </w:p>
         </w:tc>
         <w:tc>
@@ -6729,22 +6517,12 @@
                 <w:rFonts w:ascii="Calibri" w:hAnsi="Calibri" w:cs="Calibri"/>
               </w:rPr>
             </w:pPr>
-            <w:proofErr w:type="spellStart"/>
-            <w:proofErr w:type="gramStart"/>
-            <w:r>
-              <w:rPr>
-                <w:rFonts w:ascii="Calibri" w:hAnsi="Calibri" w:cs="Calibri"/>
-              </w:rPr>
-              <w:t>jour</w:t>
-            </w:r>
-            <w:proofErr w:type="gramEnd"/>
-            <w:r>
-              <w:rPr>
-                <w:rFonts w:ascii="Calibri" w:hAnsi="Calibri" w:cs="Calibri"/>
-              </w:rPr>
-              <w:t>_semaine_libelle</w:t>
-            </w:r>
-            <w:proofErr w:type="spellEnd"/>
+            <w:r>
+              <w:rPr>
+                <w:rFonts w:ascii="Calibri" w:hAnsi="Calibri" w:cs="Calibri"/>
+              </w:rPr>
+              <w:t>jour_semaine_libelle</w:t>
+            </w:r>
           </w:p>
         </w:tc>
         <w:tc>
@@ -6875,22 +6653,12 @@
                 <w:rFonts w:ascii="Calibri" w:hAnsi="Calibri" w:cs="Calibri"/>
               </w:rPr>
             </w:pPr>
-            <w:proofErr w:type="spellStart"/>
-            <w:proofErr w:type="gramStart"/>
-            <w:r>
-              <w:rPr>
-                <w:rFonts w:ascii="Calibri" w:hAnsi="Calibri" w:cs="Calibri"/>
-              </w:rPr>
-              <w:t>vol</w:t>
-            </w:r>
-            <w:proofErr w:type="gramEnd"/>
-            <w:r>
-              <w:rPr>
-                <w:rFonts w:ascii="Calibri" w:hAnsi="Calibri" w:cs="Calibri"/>
-              </w:rPr>
-              <w:t>_id</w:t>
-            </w:r>
-            <w:proofErr w:type="spellEnd"/>
+            <w:r>
+              <w:rPr>
+                <w:rFonts w:ascii="Calibri" w:hAnsi="Calibri" w:cs="Calibri"/>
+              </w:rPr>
+              <w:t>vol_id</w:t>
+            </w:r>
           </w:p>
         </w:tc>
         <w:tc>
@@ -6944,22 +6712,12 @@
                 <w:rFonts w:ascii="Calibri" w:hAnsi="Calibri" w:cs="Calibri"/>
               </w:rPr>
             </w:pPr>
-            <w:proofErr w:type="spellStart"/>
-            <w:proofErr w:type="gramStart"/>
-            <w:r>
-              <w:rPr>
-                <w:rFonts w:ascii="Calibri" w:hAnsi="Calibri" w:cs="Calibri"/>
-              </w:rPr>
-              <w:t>vol</w:t>
-            </w:r>
-            <w:proofErr w:type="gramEnd"/>
-            <w:r>
-              <w:rPr>
-                <w:rFonts w:ascii="Calibri" w:hAnsi="Calibri" w:cs="Calibri"/>
-              </w:rPr>
-              <w:t>_date</w:t>
-            </w:r>
-            <w:proofErr w:type="spellEnd"/>
+            <w:r>
+              <w:rPr>
+                <w:rFonts w:ascii="Calibri" w:hAnsi="Calibri" w:cs="Calibri"/>
+              </w:rPr>
+              <w:t>vol_date</w:t>
+            </w:r>
           </w:p>
         </w:tc>
         <w:tc>
@@ -7013,22 +6771,12 @@
                 <w:rFonts w:ascii="Calibri" w:hAnsi="Calibri" w:cs="Calibri"/>
               </w:rPr>
             </w:pPr>
-            <w:proofErr w:type="spellStart"/>
-            <w:proofErr w:type="gramStart"/>
-            <w:r>
-              <w:rPr>
-                <w:rFonts w:ascii="Calibri" w:hAnsi="Calibri" w:cs="Calibri"/>
-              </w:rPr>
-              <w:t>vol</w:t>
-            </w:r>
-            <w:proofErr w:type="gramEnd"/>
-            <w:r>
-              <w:rPr>
-                <w:rFonts w:ascii="Calibri" w:hAnsi="Calibri" w:cs="Calibri"/>
-              </w:rPr>
-              <w:t>_heure_depart</w:t>
-            </w:r>
-            <w:proofErr w:type="spellEnd"/>
+            <w:r>
+              <w:rPr>
+                <w:rFonts w:ascii="Calibri" w:hAnsi="Calibri" w:cs="Calibri"/>
+              </w:rPr>
+              <w:t>vol_heure_depart</w:t>
+            </w:r>
           </w:p>
         </w:tc>
         <w:tc>
@@ -7082,22 +6830,12 @@
                 <w:rFonts w:ascii="Calibri" w:hAnsi="Calibri" w:cs="Calibri"/>
               </w:rPr>
             </w:pPr>
-            <w:proofErr w:type="spellStart"/>
-            <w:proofErr w:type="gramStart"/>
-            <w:r>
-              <w:rPr>
-                <w:rFonts w:ascii="Calibri" w:hAnsi="Calibri" w:cs="Calibri"/>
-              </w:rPr>
-              <w:t>vol</w:t>
-            </w:r>
-            <w:proofErr w:type="gramEnd"/>
-            <w:r>
-              <w:rPr>
-                <w:rFonts w:ascii="Calibri" w:hAnsi="Calibri" w:cs="Calibri"/>
-              </w:rPr>
-              <w:t>_heure_arrivee</w:t>
-            </w:r>
-            <w:proofErr w:type="spellEnd"/>
+            <w:r>
+              <w:rPr>
+                <w:rFonts w:ascii="Calibri" w:hAnsi="Calibri" w:cs="Calibri"/>
+              </w:rPr>
+              <w:t>vol_heure_arrivee</w:t>
+            </w:r>
           </w:p>
         </w:tc>
         <w:tc>
@@ -7228,22 +6966,12 @@
                 <w:rFonts w:ascii="Calibri" w:hAnsi="Calibri" w:cs="Calibri"/>
               </w:rPr>
             </w:pPr>
-            <w:proofErr w:type="spellStart"/>
-            <w:proofErr w:type="gramStart"/>
-            <w:r>
-              <w:rPr>
-                <w:rFonts w:ascii="Calibri" w:hAnsi="Calibri" w:cs="Calibri"/>
-              </w:rPr>
-              <w:t>passager</w:t>
-            </w:r>
-            <w:proofErr w:type="gramEnd"/>
-            <w:r>
-              <w:rPr>
-                <w:rFonts w:ascii="Calibri" w:hAnsi="Calibri" w:cs="Calibri"/>
-              </w:rPr>
-              <w:t>_id</w:t>
-            </w:r>
-            <w:proofErr w:type="spellEnd"/>
+            <w:r>
+              <w:rPr>
+                <w:rFonts w:ascii="Calibri" w:hAnsi="Calibri" w:cs="Calibri"/>
+              </w:rPr>
+              <w:t>passager_id</w:t>
+            </w:r>
           </w:p>
         </w:tc>
         <w:tc>
@@ -7297,22 +7025,12 @@
                 <w:rFonts w:ascii="Calibri" w:hAnsi="Calibri" w:cs="Calibri"/>
               </w:rPr>
             </w:pPr>
-            <w:proofErr w:type="spellStart"/>
-            <w:proofErr w:type="gramStart"/>
-            <w:r>
-              <w:rPr>
-                <w:rFonts w:ascii="Calibri" w:hAnsi="Calibri" w:cs="Calibri"/>
-              </w:rPr>
-              <w:t>passager</w:t>
-            </w:r>
-            <w:proofErr w:type="gramEnd"/>
-            <w:r>
-              <w:rPr>
-                <w:rFonts w:ascii="Calibri" w:hAnsi="Calibri" w:cs="Calibri"/>
-              </w:rPr>
-              <w:t>_numero_passeport</w:t>
-            </w:r>
-            <w:proofErr w:type="spellEnd"/>
+            <w:r>
+              <w:rPr>
+                <w:rFonts w:ascii="Calibri" w:hAnsi="Calibri" w:cs="Calibri"/>
+              </w:rPr>
+              <w:t>passager_numero_passeport</w:t>
+            </w:r>
           </w:p>
         </w:tc>
         <w:tc>
@@ -7366,22 +7084,12 @@
                 <w:rFonts w:ascii="Calibri" w:hAnsi="Calibri" w:cs="Calibri"/>
               </w:rPr>
             </w:pPr>
-            <w:proofErr w:type="spellStart"/>
-            <w:proofErr w:type="gramStart"/>
-            <w:r>
-              <w:rPr>
-                <w:rFonts w:ascii="Calibri" w:hAnsi="Calibri" w:cs="Calibri"/>
-              </w:rPr>
-              <w:t>passager</w:t>
-            </w:r>
-            <w:proofErr w:type="gramEnd"/>
-            <w:r>
-              <w:rPr>
-                <w:rFonts w:ascii="Calibri" w:hAnsi="Calibri" w:cs="Calibri"/>
-              </w:rPr>
-              <w:t>_nom</w:t>
-            </w:r>
-            <w:proofErr w:type="spellEnd"/>
+            <w:r>
+              <w:rPr>
+                <w:rFonts w:ascii="Calibri" w:hAnsi="Calibri" w:cs="Calibri"/>
+              </w:rPr>
+              <w:t>passager_nom</w:t>
+            </w:r>
           </w:p>
         </w:tc>
         <w:tc>
@@ -7435,22 +7143,12 @@
                 <w:rFonts w:ascii="Calibri" w:hAnsi="Calibri" w:cs="Calibri"/>
               </w:rPr>
             </w:pPr>
-            <w:proofErr w:type="spellStart"/>
-            <w:proofErr w:type="gramStart"/>
-            <w:r>
-              <w:rPr>
-                <w:rFonts w:ascii="Calibri" w:hAnsi="Calibri" w:cs="Calibri"/>
-              </w:rPr>
-              <w:t>passager</w:t>
-            </w:r>
-            <w:proofErr w:type="gramEnd"/>
-            <w:r>
-              <w:rPr>
-                <w:rFonts w:ascii="Calibri" w:hAnsi="Calibri" w:cs="Calibri"/>
-              </w:rPr>
-              <w:t>_prenom</w:t>
-            </w:r>
-            <w:proofErr w:type="spellEnd"/>
+            <w:r>
+              <w:rPr>
+                <w:rFonts w:ascii="Calibri" w:hAnsi="Calibri" w:cs="Calibri"/>
+              </w:rPr>
+              <w:t>passager_prenom</w:t>
+            </w:r>
           </w:p>
         </w:tc>
         <w:tc>
@@ -7581,22 +7279,12 @@
                 <w:rFonts w:ascii="Calibri" w:hAnsi="Calibri" w:cs="Calibri"/>
               </w:rPr>
             </w:pPr>
-            <w:proofErr w:type="spellStart"/>
-            <w:proofErr w:type="gramStart"/>
-            <w:r>
-              <w:rPr>
-                <w:rFonts w:ascii="Calibri" w:hAnsi="Calibri" w:cs="Calibri"/>
-              </w:rPr>
-              <w:t>reservation</w:t>
-            </w:r>
-            <w:proofErr w:type="gramEnd"/>
-            <w:r>
-              <w:rPr>
-                <w:rFonts w:ascii="Calibri" w:hAnsi="Calibri" w:cs="Calibri"/>
-              </w:rPr>
-              <w:t>_id</w:t>
-            </w:r>
-            <w:proofErr w:type="spellEnd"/>
+            <w:r>
+              <w:rPr>
+                <w:rFonts w:ascii="Calibri" w:hAnsi="Calibri" w:cs="Calibri"/>
+              </w:rPr>
+              <w:t>reservation_id</w:t>
+            </w:r>
           </w:p>
         </w:tc>
         <w:tc>
@@ -7650,22 +7338,12 @@
                 <w:rFonts w:ascii="Calibri" w:hAnsi="Calibri" w:cs="Calibri"/>
               </w:rPr>
             </w:pPr>
-            <w:proofErr w:type="spellStart"/>
-            <w:proofErr w:type="gramStart"/>
-            <w:r>
-              <w:rPr>
-                <w:rFonts w:ascii="Calibri" w:hAnsi="Calibri" w:cs="Calibri"/>
-              </w:rPr>
-              <w:t>reservation</w:t>
-            </w:r>
-            <w:proofErr w:type="gramEnd"/>
-            <w:r>
-              <w:rPr>
-                <w:rFonts w:ascii="Calibri" w:hAnsi="Calibri" w:cs="Calibri"/>
-              </w:rPr>
-              <w:t>_siege</w:t>
-            </w:r>
-            <w:proofErr w:type="spellEnd"/>
+            <w:r>
+              <w:rPr>
+                <w:rFonts w:ascii="Calibri" w:hAnsi="Calibri" w:cs="Calibri"/>
+              </w:rPr>
+              <w:t>reservation_siege</w:t>
+            </w:r>
           </w:p>
         </w:tc>
         <w:tc>
@@ -7719,22 +7397,12 @@
                 <w:rFonts w:ascii="Calibri" w:hAnsi="Calibri" w:cs="Calibri"/>
               </w:rPr>
             </w:pPr>
-            <w:proofErr w:type="spellStart"/>
-            <w:proofErr w:type="gramStart"/>
-            <w:r>
-              <w:rPr>
-                <w:rFonts w:ascii="Calibri" w:hAnsi="Calibri" w:cs="Calibri"/>
-              </w:rPr>
-              <w:t>reservation</w:t>
-            </w:r>
-            <w:proofErr w:type="gramEnd"/>
-            <w:r>
-              <w:rPr>
-                <w:rFonts w:ascii="Calibri" w:hAnsi="Calibri" w:cs="Calibri"/>
-              </w:rPr>
-              <w:t>_prix</w:t>
-            </w:r>
-            <w:proofErr w:type="spellEnd"/>
+            <w:r>
+              <w:rPr>
+                <w:rFonts w:ascii="Calibri" w:hAnsi="Calibri" w:cs="Calibri"/>
+              </w:rPr>
+              <w:t>reservation_prix</w:t>
+            </w:r>
           </w:p>
         </w:tc>
         <w:tc>
@@ -8332,7 +8000,7 @@
           <w:szCs w:val="32"/>
         </w:rPr>
         <w:lastRenderedPageBreak/>
-        <w:t>3.1.6 Cardinalités</w:t>
+        <w:t>3.1.6 Cardinalité</w:t>
       </w:r>
       <w:bookmarkEnd w:id="9"/>
     </w:p>
@@ -9376,7 +9044,102 @@
         </w:tc>
       </w:tr>
     </w:tbl>
-    <w:p/>
+    <w:p>
+      <w:pPr>
+        <w:ind w:left="284"/>
+      </w:pPr>
+    </w:p>
+    <w:p>
+      <w:pPr>
+        <w:rPr>
+          <w:rFonts w:ascii="Calibri" w:eastAsiaTheme="majorEastAsia" w:hAnsi="Calibri" w:cs="Calibri"/>
+          <w:b/>
+          <w:bCs/>
+          <w:color w:val="0F4761" w:themeColor="accent1" w:themeShade="BF"/>
+          <w:sz w:val="32"/>
+          <w:szCs w:val="32"/>
+        </w:rPr>
+      </w:pPr>
+      <w:r>
+        <w:rPr>
+          <w:rFonts w:ascii="Calibri" w:hAnsi="Calibri" w:cs="Calibri"/>
+          <w:b/>
+          <w:bCs/>
+          <w:sz w:val="32"/>
+          <w:szCs w:val="32"/>
+        </w:rPr>
+        <w:br w:type="page"/>
+      </w:r>
+    </w:p>
+    <w:p>
+      <w:pPr>
+        <w:pStyle w:val="Titre3"/>
+        <w:ind w:left="284"/>
+        <w:rPr>
+          <w:rFonts w:ascii="Calibri" w:hAnsi="Calibri" w:cs="Calibri"/>
+          <w:b/>
+          <w:bCs/>
+          <w:sz w:val="32"/>
+          <w:szCs w:val="32"/>
+        </w:rPr>
+      </w:pPr>
+      <w:r>
+        <w:rPr>
+          <w:rFonts w:ascii="Calibri" w:hAnsi="Calibri" w:cs="Calibri"/>
+          <w:b/>
+          <w:bCs/>
+          <w:sz w:val="32"/>
+          <w:szCs w:val="32"/>
+        </w:rPr>
+        <w:lastRenderedPageBreak/>
+        <w:t>3.1.7 MCD</w:t>
+      </w:r>
+    </w:p>
+    <w:p>
+      <w:pPr>
+        <w:rPr>
+          <w:rFonts w:ascii="Calibri" w:eastAsiaTheme="majorEastAsia" w:hAnsi="Calibri" w:cs="Calibri"/>
+          <w:b/>
+          <w:bCs/>
+          <w:color w:val="0F4761" w:themeColor="accent1" w:themeShade="BF"/>
+          <w:sz w:val="32"/>
+          <w:szCs w:val="32"/>
+        </w:rPr>
+      </w:pPr>
+      <w:r>
+        <w:rPr>
+          <w:rFonts w:ascii="Calibri" w:hAnsi="Calibri" w:cs="Calibri"/>
+          <w:b/>
+          <w:bCs/>
+          <w:sz w:val="32"/>
+          <w:szCs w:val="32"/>
+        </w:rPr>
+        <w:br w:type="page"/>
+      </w:r>
+    </w:p>
+    <w:p>
+      <w:pPr>
+        <w:pStyle w:val="Titre3"/>
+        <w:ind w:left="284"/>
+        <w:rPr>
+          <w:rFonts w:ascii="Calibri" w:hAnsi="Calibri" w:cs="Calibri"/>
+          <w:b/>
+          <w:bCs/>
+          <w:sz w:val="32"/>
+          <w:szCs w:val="32"/>
+        </w:rPr>
+      </w:pPr>
+      <w:r>
+        <w:rPr>
+          <w:rFonts w:ascii="Calibri" w:hAnsi="Calibri" w:cs="Calibri"/>
+          <w:b/>
+          <w:bCs/>
+          <w:sz w:val="32"/>
+          <w:szCs w:val="32"/>
+        </w:rPr>
+        <w:t>3.1.8 MLD</w:t>
+      </w:r>
+    </w:p>
     <w:p>
       <w:r>
         <w:br w:type="page"/>
@@ -9403,7 +9166,6 @@
           <w:sz w:val="36"/>
           <w:szCs w:val="36"/>
         </w:rPr>
-        <w:lastRenderedPageBreak/>
         <w:t>3.2 Création des tables de la base de données</w:t>
       </w:r>
       <w:bookmarkEnd w:id="10"/>
@@ -9432,21 +9194,7 @@
         <w:rPr>
           <w:rFonts w:ascii="Calibri" w:hAnsi="Calibri" w:cs="Calibri"/>
         </w:rPr>
-        <w:t xml:space="preserve"> une base de données se nommant « </w:t>
-      </w:r>
-      <w:proofErr w:type="spellStart"/>
-      <w:r>
-        <w:rPr>
-          <w:rFonts w:ascii="Calibri" w:hAnsi="Calibri" w:cs="Calibri"/>
-        </w:rPr>
-        <w:t>db_aeroport</w:t>
-      </w:r>
-      <w:proofErr w:type="spellEnd"/>
-      <w:r>
-        <w:rPr>
-          <w:rFonts w:ascii="Calibri" w:hAnsi="Calibri" w:cs="Calibri"/>
-        </w:rPr>
-        <w:t xml:space="preserve"> », puis j’y est inséré le code </w:t>
+        <w:t xml:space="preserve"> une base de données se nommant « db_aeroport », puis j’y est inséré le code </w:t>
       </w:r>
       <w:r>
         <w:rPr>
@@ -9520,23 +9268,7 @@
         </w:rPr>
       </w:pPr>
       <w:r>
-        <w:t xml:space="preserve">Création de la </w:t>
-      </w:r>
-      <w:proofErr w:type="spellStart"/>
-      <w:r>
-        <w:t>bdd</w:t>
-      </w:r>
-      <w:proofErr w:type="spellEnd"/>
-      <w:r>
-        <w:t xml:space="preserve"> </w:t>
-      </w:r>
-      <w:proofErr w:type="spellStart"/>
-      <w:r>
-        <w:t>db_aeroport</w:t>
-      </w:r>
-      <w:proofErr w:type="spellEnd"/>
-      <w:r>
-        <w:t xml:space="preserve"> </w:t>
+        <w:t xml:space="preserve">Création de la bdd db_aeroport </w:t>
       </w:r>
       <w:fldSimple w:instr=" SEQ Création_de_la_bdd_db_aeroport \* ARABIC ">
         <w:r>
@@ -9559,35 +9291,7 @@
         <w:rPr>
           <w:rFonts w:ascii="Calibri" w:hAnsi="Calibri" w:cs="Calibri"/>
         </w:rPr>
-        <w:t xml:space="preserve">Sur la capture d’écran on </w:t>
-      </w:r>
-      <w:proofErr w:type="spellStart"/>
-      <w:r>
-        <w:rPr>
-          <w:rFonts w:ascii="Calibri" w:hAnsi="Calibri" w:cs="Calibri"/>
-        </w:rPr>
-        <w:t>peu</w:t>
-      </w:r>
-      <w:proofErr w:type="spellEnd"/>
-      <w:r>
-        <w:rPr>
-          <w:rFonts w:ascii="Calibri" w:hAnsi="Calibri" w:cs="Calibri"/>
-        </w:rPr>
-        <w:t xml:space="preserve"> voir que la base de données </w:t>
-      </w:r>
-      <w:proofErr w:type="spellStart"/>
-      <w:r>
-        <w:rPr>
-          <w:rFonts w:ascii="Calibri" w:hAnsi="Calibri" w:cs="Calibri"/>
-        </w:rPr>
-        <w:t>à</w:t>
-      </w:r>
-      <w:proofErr w:type="spellEnd"/>
-      <w:r>
-        <w:rPr>
-          <w:rFonts w:ascii="Calibri" w:hAnsi="Calibri" w:cs="Calibri"/>
-        </w:rPr>
-        <w:t xml:space="preserve"> été créer avec succès sans erreur.</w:t>
+        <w:t>Sur la capture d’écran on peu voir que la base de données à été créer avec succès sans erreur.</w:t>
       </w:r>
     </w:p>
     <w:p>
@@ -9655,23 +9359,7 @@
         </w:rPr>
       </w:pPr>
       <w:r>
-        <w:t xml:space="preserve">Contenu de la </w:t>
-      </w:r>
-      <w:proofErr w:type="spellStart"/>
-      <w:r>
-        <w:t>bdd</w:t>
-      </w:r>
-      <w:proofErr w:type="spellEnd"/>
-      <w:r>
-        <w:t xml:space="preserve"> </w:t>
-      </w:r>
-      <w:proofErr w:type="spellStart"/>
-      <w:r>
-        <w:t>db_aeroport</w:t>
-      </w:r>
-      <w:proofErr w:type="spellEnd"/>
-      <w:r>
-        <w:t xml:space="preserve"> </w:t>
+        <w:t xml:space="preserve">Contenu de la bdd db_aeroport </w:t>
       </w:r>
       <w:fldSimple w:instr=" SEQ Contenu_de_la_bdd_db_aeroport \* ARABIC ">
         <w:r>
@@ -9761,63 +9449,7 @@
         <w:rPr>
           <w:rFonts w:ascii="Calibri" w:hAnsi="Calibri" w:cs="Calibri"/>
         </w:rPr>
-        <w:t xml:space="preserve">Les fichiers TSV sont chargés dans les tables avec les commandes SQL ci-dessous. Un espace est prévu après chaque commande pour ajouter la capture d’écran de son exécution. Les fichiers TSV sont placés dans le dossier « </w:t>
-      </w:r>
-      <w:proofErr w:type="spellStart"/>
-      <w:r>
-        <w:rPr>
-          <w:rFonts w:ascii="Calibri" w:hAnsi="Calibri" w:cs="Calibri"/>
-        </w:rPr>
-        <w:t>mysql</w:t>
-      </w:r>
-      <w:proofErr w:type="spellEnd"/>
-      <w:r>
-        <w:rPr>
-          <w:rFonts w:ascii="Calibri" w:hAnsi="Calibri" w:cs="Calibri"/>
-        </w:rPr>
-        <w:t xml:space="preserve">-files », car s’ils ne sont pas dans ce dossier, leur chargement déclenche une erreur liée à « </w:t>
-      </w:r>
-      <w:proofErr w:type="spellStart"/>
-      <w:r>
-        <w:rPr>
-          <w:rFonts w:ascii="Calibri" w:hAnsi="Calibri" w:cs="Calibri"/>
-        </w:rPr>
-        <w:t>secure_file_priv</w:t>
-      </w:r>
-      <w:proofErr w:type="spellEnd"/>
-      <w:r>
-        <w:rPr>
-          <w:rFonts w:ascii="Calibri" w:hAnsi="Calibri" w:cs="Calibri"/>
-        </w:rPr>
-        <w:t xml:space="preserve"> ». La commande « SHOW VARIABLES LIKE '</w:t>
-      </w:r>
-      <w:proofErr w:type="spellStart"/>
-      <w:r>
-        <w:rPr>
-          <w:rFonts w:ascii="Calibri" w:hAnsi="Calibri" w:cs="Calibri"/>
-        </w:rPr>
-        <w:t>secure_file_priv</w:t>
-      </w:r>
-      <w:proofErr w:type="spellEnd"/>
-      <w:r>
-        <w:rPr>
-          <w:rFonts w:ascii="Calibri" w:hAnsi="Calibri" w:cs="Calibri"/>
-        </w:rPr>
-        <w:t>'; » permet de vérifier le dossier autorisé. Dans notre cas, elle renvoie « /var/lib/</w:t>
-      </w:r>
-      <w:proofErr w:type="spellStart"/>
-      <w:r>
-        <w:rPr>
-          <w:rFonts w:ascii="Calibri" w:hAnsi="Calibri" w:cs="Calibri"/>
-        </w:rPr>
-        <w:t>mysql</w:t>
-      </w:r>
-      <w:proofErr w:type="spellEnd"/>
-      <w:r>
-        <w:rPr>
-          <w:rFonts w:ascii="Calibri" w:hAnsi="Calibri" w:cs="Calibri"/>
-        </w:rPr>
-        <w:t>-files/ ».</w:t>
+        <w:t>Les fichiers TSV sont chargés dans les tables avec les commandes SQL ci-dessous. Un espace est prévu après chaque commande pour ajouter la capture d’écran de son exécution. Les fichiers TSV sont placés dans le dossier « mysql-files », car s’ils ne sont pas dans ce dossier, leur chargement déclenche une erreur liée à « secure_file_priv ». La commande « SHOW VARIABLES LIKE 'secure_file_priv'; » permet de vérifier le dossier autorisé. Dans notre cas, elle renvoie « /var/lib/mysql-files/ ».</w:t>
       </w:r>
     </w:p>
     <w:p>
@@ -9892,19 +9524,8 @@
                 <w:color w:val="FFFFFF"/>
                 <w:sz w:val="20"/>
               </w:rPr>
-              <w:t xml:space="preserve">SQL   /   </w:t>
-            </w:r>
-            <w:proofErr w:type="spellStart"/>
-            <w:r>
-              <w:rPr>
-                <w:rFonts w:ascii="Calibri" w:hAnsi="Calibri"/>
-                <w:b/>
-                <w:color w:val="FFFFFF"/>
-                <w:sz w:val="20"/>
-              </w:rPr>
-              <w:t>t_aeroport.tsv</w:t>
-            </w:r>
-            <w:proofErr w:type="spellEnd"/>
+              <w:t>SQL   /   t_aeroport.tsv</w:t>
+            </w:r>
           </w:p>
         </w:tc>
       </w:tr>
@@ -10023,60 +9644,24 @@
                 <w:color w:val="06734E"/>
                 <w:sz w:val="18"/>
               </w:rPr>
-              <w:t>'/var/lib/</w:t>
-            </w:r>
-            <w:proofErr w:type="spellStart"/>
+              <w:t>'/var/lib/mysql-files/t</w:t>
+            </w:r>
             <w:r>
               <w:rPr>
                 <w:rFonts w:ascii="DejaVu Sans Mono" w:hAnsi="DejaVu Sans Mono"/>
                 <w:color w:val="06734E"/>
                 <w:sz w:val="18"/>
-              </w:rPr>
-              <w:t>mysql</w:t>
-            </w:r>
-            <w:proofErr w:type="spellEnd"/>
+                <w:szCs w:val="18"/>
+              </w:rPr>
+              <w:t>_</w:t>
+            </w:r>
             <w:r>
               <w:rPr>
                 <w:rFonts w:ascii="DejaVu Sans Mono" w:hAnsi="DejaVu Sans Mono"/>
                 <w:color w:val="06734E"/>
                 <w:sz w:val="18"/>
               </w:rPr>
-              <w:t>-files/</w:t>
-            </w:r>
-            <w:proofErr w:type="spellStart"/>
-            <w:r>
-              <w:rPr>
-                <w:rFonts w:ascii="DejaVu Sans Mono" w:hAnsi="DejaVu Sans Mono"/>
-                <w:color w:val="06734E"/>
-                <w:sz w:val="18"/>
-              </w:rPr>
-              <w:t>t</w:t>
-            </w:r>
-            <w:r>
-              <w:rPr>
-                <w:rFonts w:ascii="DejaVu Sans Mono" w:hAnsi="DejaVu Sans Mono"/>
-                <w:color w:val="06734E"/>
-                <w:sz w:val="18"/>
-                <w:szCs w:val="18"/>
-              </w:rPr>
-              <w:t>_</w:t>
-            </w:r>
-            <w:r>
-              <w:rPr>
-                <w:rFonts w:ascii="DejaVu Sans Mono" w:hAnsi="DejaVu Sans Mono"/>
-                <w:color w:val="06734E"/>
-                <w:sz w:val="18"/>
-              </w:rPr>
-              <w:t>aeroport.tsv</w:t>
-            </w:r>
-            <w:proofErr w:type="spellEnd"/>
-            <w:r>
-              <w:rPr>
-                <w:rFonts w:ascii="DejaVu Sans Mono" w:hAnsi="DejaVu Sans Mono"/>
-                <w:color w:val="06734E"/>
-                <w:sz w:val="18"/>
-              </w:rPr>
-              <w:t>'</w:t>
+              <w:t>aeroport.tsv'</w:t>
             </w:r>
           </w:p>
         </w:tc>
@@ -10171,18 +9756,8 @@
                 <w:color w:val="25364B"/>
                 <w:sz w:val="18"/>
               </w:rPr>
-              <w:t xml:space="preserve"> </w:t>
-            </w:r>
-            <w:proofErr w:type="spellStart"/>
-            <w:r>
-              <w:rPr>
-                <w:rFonts w:ascii="DejaVu Sans Mono" w:hAnsi="DejaVu Sans Mono"/>
-                <w:color w:val="25364B"/>
-                <w:sz w:val="18"/>
-              </w:rPr>
-              <w:t>t_aeroport</w:t>
-            </w:r>
-            <w:proofErr w:type="spellEnd"/>
+              <w:t xml:space="preserve"> t_aeroport</w:t>
+            </w:r>
           </w:p>
         </w:tc>
       </w:tr>
@@ -10692,35 +10267,7 @@
                 <w:color w:val="25364B"/>
                 <w:sz w:val="18"/>
               </w:rPr>
-              <w:t>(</w:t>
-            </w:r>
-            <w:proofErr w:type="spellStart"/>
-            <w:proofErr w:type="gramStart"/>
-            <w:r>
-              <w:rPr>
-                <w:rFonts w:ascii="DejaVu Sans Mono" w:hAnsi="DejaVu Sans Mono"/>
-                <w:color w:val="25364B"/>
-                <w:sz w:val="18"/>
-              </w:rPr>
-              <w:t>aeroport</w:t>
-            </w:r>
-            <w:proofErr w:type="gramEnd"/>
-            <w:r>
-              <w:rPr>
-                <w:rFonts w:ascii="DejaVu Sans Mono" w:hAnsi="DejaVu Sans Mono"/>
-                <w:color w:val="25364B"/>
-                <w:sz w:val="18"/>
-              </w:rPr>
-              <w:t>_id</w:t>
-            </w:r>
-            <w:proofErr w:type="spellEnd"/>
-            <w:r>
-              <w:rPr>
-                <w:rFonts w:ascii="DejaVu Sans Mono" w:hAnsi="DejaVu Sans Mono"/>
-                <w:color w:val="25364B"/>
-                <w:sz w:val="18"/>
-              </w:rPr>
-              <w:t xml:space="preserve">, </w:t>
+              <w:t xml:space="preserve">(aeroport_id, </w:t>
             </w:r>
             <w:r>
               <w:rPr>
@@ -10891,35 +10438,7 @@
                 <w:color w:val="25364B"/>
                 <w:sz w:val="18"/>
               </w:rPr>
-              <w:t xml:space="preserve">    </w:t>
-            </w:r>
-            <w:proofErr w:type="spellStart"/>
-            <w:proofErr w:type="gramStart"/>
-            <w:r>
-              <w:rPr>
-                <w:rFonts w:ascii="DejaVu Sans Mono" w:hAnsi="DejaVu Sans Mono"/>
-                <w:color w:val="25364B"/>
-                <w:sz w:val="18"/>
-              </w:rPr>
-              <w:t>code</w:t>
-            </w:r>
-            <w:proofErr w:type="gramEnd"/>
-            <w:r>
-              <w:rPr>
-                <w:rFonts w:ascii="DejaVu Sans Mono" w:hAnsi="DejaVu Sans Mono"/>
-                <w:color w:val="25364B"/>
-                <w:sz w:val="18"/>
-              </w:rPr>
-              <w:t>_iata</w:t>
-            </w:r>
-            <w:proofErr w:type="spellEnd"/>
-            <w:r>
-              <w:rPr>
-                <w:rFonts w:ascii="DejaVu Sans Mono" w:hAnsi="DejaVu Sans Mono"/>
-                <w:color w:val="25364B"/>
-                <w:sz w:val="18"/>
-              </w:rPr>
-              <w:t xml:space="preserve"> = </w:t>
+              <w:t xml:space="preserve">    code_iata = </w:t>
             </w:r>
             <w:r>
               <w:rPr>
@@ -11037,35 +10556,7 @@
                 <w:color w:val="25364B"/>
                 <w:sz w:val="18"/>
               </w:rPr>
-              <w:t xml:space="preserve">    </w:t>
-            </w:r>
-            <w:proofErr w:type="spellStart"/>
-            <w:proofErr w:type="gramStart"/>
-            <w:r>
-              <w:rPr>
-                <w:rFonts w:ascii="DejaVu Sans Mono" w:hAnsi="DejaVu Sans Mono"/>
-                <w:color w:val="25364B"/>
-                <w:sz w:val="18"/>
-              </w:rPr>
-              <w:t>code</w:t>
-            </w:r>
-            <w:proofErr w:type="gramEnd"/>
-            <w:r>
-              <w:rPr>
-                <w:rFonts w:ascii="DejaVu Sans Mono" w:hAnsi="DejaVu Sans Mono"/>
-                <w:color w:val="25364B"/>
-                <w:sz w:val="18"/>
-              </w:rPr>
-              <w:t>_icao</w:t>
-            </w:r>
-            <w:proofErr w:type="spellEnd"/>
-            <w:r>
-              <w:rPr>
-                <w:rFonts w:ascii="DejaVu Sans Mono" w:hAnsi="DejaVu Sans Mono"/>
-                <w:color w:val="25364B"/>
-                <w:sz w:val="18"/>
-              </w:rPr>
-              <w:t xml:space="preserve"> = </w:t>
+              <w:t xml:space="preserve">    code_icao = </w:t>
             </w:r>
             <w:r>
               <w:rPr>
@@ -11186,36 +10677,8 @@
                 <w:color w:val="25364B"/>
                 <w:sz w:val="20"/>
               </w:rPr>
-              <w:t xml:space="preserve">PhpMyAdmin   /   </w:t>
-            </w:r>
-            <w:proofErr w:type="spellStart"/>
-            <w:r>
-              <w:rPr>
-                <w:rFonts w:ascii="Calibri" w:hAnsi="Calibri"/>
-                <w:color w:val="25364B"/>
-                <w:sz w:val="20"/>
-              </w:rPr>
-              <w:t>db_aeroport</w:t>
-            </w:r>
-            <w:proofErr w:type="spellEnd"/>
-            <w:r>
-              <w:rPr>
-                <w:rFonts w:ascii="Calibri" w:hAnsi="Calibri"/>
-                <w:color w:val="25364B"/>
-                <w:sz w:val="20"/>
-              </w:rPr>
-              <w:t xml:space="preserve">   /   </w:t>
-            </w:r>
-            <w:proofErr w:type="spellStart"/>
-            <w:r>
-              <w:rPr>
-                <w:rFonts w:ascii="Calibri" w:hAnsi="Calibri"/>
-                <w:color w:val="25364B"/>
-                <w:sz w:val="20"/>
-              </w:rPr>
-              <w:t>t_aeroport</w:t>
-            </w:r>
-            <w:proofErr w:type="spellEnd"/>
+              <w:t>PhpMyAdmin   /   db_aeroport   /   t_aeroport</w:t>
+            </w:r>
           </w:p>
         </w:tc>
       </w:tr>
@@ -11379,19 +10842,8 @@
                 <w:color w:val="FFFFFF"/>
                 <w:sz w:val="20"/>
               </w:rPr>
-              <w:t xml:space="preserve">SQL   /   </w:t>
-            </w:r>
-            <w:proofErr w:type="spellStart"/>
-            <w:r>
-              <w:rPr>
-                <w:rFonts w:ascii="Calibri" w:hAnsi="Calibri"/>
-                <w:b/>
-                <w:color w:val="FFFFFF"/>
-                <w:sz w:val="20"/>
-              </w:rPr>
-              <w:t>t_compagnie.tsv</w:t>
-            </w:r>
-            <w:proofErr w:type="spellEnd"/>
+              <w:t>SQL   /   t_compagnie.tsv</w:t>
+            </w:r>
           </w:p>
         </w:tc>
       </w:tr>
@@ -11510,60 +10962,24 @@
                 <w:color w:val="06734E"/>
                 <w:sz w:val="18"/>
               </w:rPr>
-              <w:t>'/var/lib/</w:t>
-            </w:r>
-            <w:proofErr w:type="spellStart"/>
+              <w:t>'/var/lib/mysql-files/t</w:t>
+            </w:r>
             <w:r>
               <w:rPr>
                 <w:rFonts w:ascii="DejaVu Sans Mono" w:hAnsi="DejaVu Sans Mono"/>
                 <w:color w:val="06734E"/>
                 <w:sz w:val="18"/>
-              </w:rPr>
-              <w:t>mysql</w:t>
-            </w:r>
-            <w:proofErr w:type="spellEnd"/>
+                <w:szCs w:val="18"/>
+              </w:rPr>
+              <w:t>_</w:t>
+            </w:r>
             <w:r>
               <w:rPr>
                 <w:rFonts w:ascii="DejaVu Sans Mono" w:hAnsi="DejaVu Sans Mono"/>
                 <w:color w:val="06734E"/>
                 <w:sz w:val="18"/>
               </w:rPr>
-              <w:t>-files/</w:t>
-            </w:r>
-            <w:proofErr w:type="spellStart"/>
-            <w:r>
-              <w:rPr>
-                <w:rFonts w:ascii="DejaVu Sans Mono" w:hAnsi="DejaVu Sans Mono"/>
-                <w:color w:val="06734E"/>
-                <w:sz w:val="18"/>
-              </w:rPr>
-              <w:t>t</w:t>
-            </w:r>
-            <w:r>
-              <w:rPr>
-                <w:rFonts w:ascii="DejaVu Sans Mono" w:hAnsi="DejaVu Sans Mono"/>
-                <w:color w:val="06734E"/>
-                <w:sz w:val="18"/>
-                <w:szCs w:val="18"/>
-              </w:rPr>
-              <w:t>_</w:t>
-            </w:r>
-            <w:r>
-              <w:rPr>
-                <w:rFonts w:ascii="DejaVu Sans Mono" w:hAnsi="DejaVu Sans Mono"/>
-                <w:color w:val="06734E"/>
-                <w:sz w:val="18"/>
-              </w:rPr>
-              <w:t>compagnie.tsv</w:t>
-            </w:r>
-            <w:proofErr w:type="spellEnd"/>
-            <w:r>
-              <w:rPr>
-                <w:rFonts w:ascii="DejaVu Sans Mono" w:hAnsi="DejaVu Sans Mono"/>
-                <w:color w:val="06734E"/>
-                <w:sz w:val="18"/>
-              </w:rPr>
-              <w:t>'</w:t>
+              <w:t>compagnie.tsv'</w:t>
             </w:r>
           </w:p>
         </w:tc>
@@ -11658,18 +11074,8 @@
                 <w:color w:val="25364B"/>
                 <w:sz w:val="18"/>
               </w:rPr>
-              <w:t xml:space="preserve"> </w:t>
-            </w:r>
-            <w:proofErr w:type="spellStart"/>
-            <w:r>
-              <w:rPr>
-                <w:rFonts w:ascii="DejaVu Sans Mono" w:hAnsi="DejaVu Sans Mono"/>
-                <w:color w:val="25364B"/>
-                <w:sz w:val="18"/>
-              </w:rPr>
-              <w:t>t_compagnie</w:t>
-            </w:r>
-            <w:proofErr w:type="spellEnd"/>
+              <w:t xml:space="preserve"> t_compagnie</w:t>
+            </w:r>
           </w:p>
         </w:tc>
       </w:tr>
@@ -12253,36 +11659,8 @@
                 <w:color w:val="25364B"/>
                 <w:sz w:val="20"/>
               </w:rPr>
-              <w:t xml:space="preserve">PhpMyAdmin   /   </w:t>
-            </w:r>
-            <w:proofErr w:type="spellStart"/>
-            <w:r>
-              <w:rPr>
-                <w:rFonts w:ascii="Calibri" w:hAnsi="Calibri"/>
-                <w:color w:val="25364B"/>
-                <w:sz w:val="20"/>
-              </w:rPr>
-              <w:t>db_aeroport</w:t>
-            </w:r>
-            <w:proofErr w:type="spellEnd"/>
-            <w:r>
-              <w:rPr>
-                <w:rFonts w:ascii="Calibri" w:hAnsi="Calibri"/>
-                <w:color w:val="25364B"/>
-                <w:sz w:val="20"/>
-              </w:rPr>
-              <w:t xml:space="preserve">   /   </w:t>
-            </w:r>
-            <w:proofErr w:type="spellStart"/>
-            <w:r>
-              <w:rPr>
-                <w:rFonts w:ascii="Calibri" w:hAnsi="Calibri"/>
-                <w:color w:val="25364B"/>
-                <w:sz w:val="20"/>
-              </w:rPr>
-              <w:t>t_compagnie</w:t>
-            </w:r>
-            <w:proofErr w:type="spellEnd"/>
+              <w:t>PhpMyAdmin   /   db_aeroport   /   t_compagnie</w:t>
+            </w:r>
           </w:p>
         </w:tc>
       </w:tr>
@@ -12497,19 +11875,8 @@
                 <w:color w:val="FFFFFF"/>
                 <w:sz w:val="20"/>
               </w:rPr>
-              <w:t xml:space="preserve">SQL   /   </w:t>
-            </w:r>
-            <w:proofErr w:type="spellStart"/>
-            <w:r>
-              <w:rPr>
-                <w:rFonts w:ascii="Calibri" w:hAnsi="Calibri"/>
-                <w:b/>
-                <w:color w:val="FFFFFF"/>
-                <w:sz w:val="20"/>
-              </w:rPr>
-              <w:t>t_type_avion.tsv</w:t>
-            </w:r>
-            <w:proofErr w:type="spellEnd"/>
+              <w:t>SQL   /   t_type_avion.tsv</w:t>
+            </w:r>
           </w:p>
         </w:tc>
       </w:tr>
@@ -12628,60 +11995,24 @@
                 <w:color w:val="06734E"/>
                 <w:sz w:val="18"/>
               </w:rPr>
-              <w:t>'/var/lib/</w:t>
-            </w:r>
-            <w:proofErr w:type="spellStart"/>
+              <w:t>'/var/lib/mysql-files/t</w:t>
+            </w:r>
             <w:r>
               <w:rPr>
                 <w:rFonts w:ascii="DejaVu Sans Mono" w:hAnsi="DejaVu Sans Mono"/>
                 <w:color w:val="06734E"/>
                 <w:sz w:val="18"/>
-              </w:rPr>
-              <w:t>mysql</w:t>
-            </w:r>
-            <w:proofErr w:type="spellEnd"/>
+                <w:szCs w:val="18"/>
+              </w:rPr>
+              <w:t>_</w:t>
+            </w:r>
             <w:r>
               <w:rPr>
                 <w:rFonts w:ascii="DejaVu Sans Mono" w:hAnsi="DejaVu Sans Mono"/>
                 <w:color w:val="06734E"/>
                 <w:sz w:val="18"/>
               </w:rPr>
-              <w:t>-files/</w:t>
-            </w:r>
-            <w:proofErr w:type="spellStart"/>
-            <w:r>
-              <w:rPr>
-                <w:rFonts w:ascii="DejaVu Sans Mono" w:hAnsi="DejaVu Sans Mono"/>
-                <w:color w:val="06734E"/>
-                <w:sz w:val="18"/>
-              </w:rPr>
-              <w:t>t</w:t>
-            </w:r>
-            <w:r>
-              <w:rPr>
-                <w:rFonts w:ascii="DejaVu Sans Mono" w:hAnsi="DejaVu Sans Mono"/>
-                <w:color w:val="06734E"/>
-                <w:sz w:val="18"/>
-                <w:szCs w:val="18"/>
-              </w:rPr>
-              <w:t>_</w:t>
-            </w:r>
-            <w:r>
-              <w:rPr>
-                <w:rFonts w:ascii="DejaVu Sans Mono" w:hAnsi="DejaVu Sans Mono"/>
-                <w:color w:val="06734E"/>
-                <w:sz w:val="18"/>
-              </w:rPr>
-              <w:t>type_avion.tsv</w:t>
-            </w:r>
-            <w:proofErr w:type="spellEnd"/>
-            <w:r>
-              <w:rPr>
-                <w:rFonts w:ascii="DejaVu Sans Mono" w:hAnsi="DejaVu Sans Mono"/>
-                <w:color w:val="06734E"/>
-                <w:sz w:val="18"/>
-              </w:rPr>
-              <w:t>'</w:t>
+              <w:t>type_avion.tsv'</w:t>
             </w:r>
           </w:p>
         </w:tc>
@@ -12783,9 +12114,8 @@
                 <w:sz w:val="18"/>
                 <w:lang w:val="en-US"/>
               </w:rPr>
-              <w:t xml:space="preserve"> </w:t>
-            </w:r>
-            <w:proofErr w:type="spellStart"/>
+              <w:t xml:space="preserve"> t_type_a</w:t>
+            </w:r>
             <w:r>
               <w:rPr>
                 <w:rFonts w:ascii="DejaVu Sans Mono" w:hAnsi="DejaVu Sans Mono"/>
@@ -12793,18 +12123,8 @@
                 <w:sz w:val="18"/>
                 <w:lang w:val="en-US"/>
               </w:rPr>
-              <w:t>t_type_a</w:t>
-            </w:r>
-            <w:r>
-              <w:rPr>
-                <w:rFonts w:ascii="DejaVu Sans Mono" w:hAnsi="DejaVu Sans Mono"/>
-                <w:color w:val="25364B"/>
-                <w:sz w:val="18"/>
-                <w:lang w:val="en-US"/>
-              </w:rPr>
               <w:t>vion</w:t>
             </w:r>
-            <w:proofErr w:type="spellEnd"/>
           </w:p>
         </w:tc>
       </w:tr>
@@ -13388,36 +12708,8 @@
                 <w:color w:val="25364B"/>
                 <w:sz w:val="20"/>
               </w:rPr>
-              <w:t xml:space="preserve">PhpMyAdmin   /   </w:t>
-            </w:r>
-            <w:proofErr w:type="spellStart"/>
-            <w:r>
-              <w:rPr>
-                <w:rFonts w:ascii="Calibri" w:hAnsi="Calibri"/>
-                <w:color w:val="25364B"/>
-                <w:sz w:val="20"/>
-              </w:rPr>
-              <w:t>db_aeroport</w:t>
-            </w:r>
-            <w:proofErr w:type="spellEnd"/>
-            <w:r>
-              <w:rPr>
-                <w:rFonts w:ascii="Calibri" w:hAnsi="Calibri"/>
-                <w:color w:val="25364B"/>
-                <w:sz w:val="20"/>
-              </w:rPr>
-              <w:t xml:space="preserve">   /   </w:t>
-            </w:r>
-            <w:proofErr w:type="spellStart"/>
-            <w:r>
-              <w:rPr>
-                <w:rFonts w:ascii="Calibri" w:hAnsi="Calibri"/>
-                <w:color w:val="25364B"/>
-                <w:sz w:val="20"/>
-              </w:rPr>
-              <w:t>t_type_avion</w:t>
-            </w:r>
-            <w:proofErr w:type="spellEnd"/>
+              <w:t>PhpMyAdmin   /   db_aeroport   /   t_type_avion</w:t>
+            </w:r>
           </w:p>
         </w:tc>
       </w:tr>
@@ -13632,19 +12924,8 @@
                 <w:color w:val="FFFFFF"/>
                 <w:sz w:val="20"/>
               </w:rPr>
-              <w:t xml:space="preserve">SQL   /   </w:t>
-            </w:r>
-            <w:proofErr w:type="spellStart"/>
-            <w:r>
-              <w:rPr>
-                <w:rFonts w:ascii="Calibri" w:hAnsi="Calibri"/>
-                <w:b/>
-                <w:color w:val="FFFFFF"/>
-                <w:sz w:val="20"/>
-              </w:rPr>
-              <w:t>t_avion.tsv</w:t>
-            </w:r>
-            <w:proofErr w:type="spellEnd"/>
+              <w:t>SQL   /   t_avion.tsv</w:t>
+            </w:r>
           </w:p>
         </w:tc>
       </w:tr>
@@ -13763,43 +13044,7 @@
                 <w:color w:val="06734E"/>
                 <w:sz w:val="18"/>
               </w:rPr>
-              <w:t>'/var/lib/</w:t>
-            </w:r>
-            <w:proofErr w:type="spellStart"/>
-            <w:r>
-              <w:rPr>
-                <w:rFonts w:ascii="DejaVu Sans Mono" w:hAnsi="DejaVu Sans Mono"/>
-                <w:color w:val="06734E"/>
-                <w:sz w:val="18"/>
-              </w:rPr>
-              <w:t>mysql</w:t>
-            </w:r>
-            <w:proofErr w:type="spellEnd"/>
-            <w:r>
-              <w:rPr>
-                <w:rFonts w:ascii="DejaVu Sans Mono" w:hAnsi="DejaVu Sans Mono"/>
-                <w:color w:val="06734E"/>
-                <w:sz w:val="18"/>
-              </w:rPr>
-              <w:t>-files/</w:t>
-            </w:r>
-            <w:proofErr w:type="spellStart"/>
-            <w:r>
-              <w:rPr>
-                <w:rFonts w:ascii="DejaVu Sans Mono" w:hAnsi="DejaVu Sans Mono"/>
-                <w:color w:val="06734E"/>
-                <w:sz w:val="18"/>
-              </w:rPr>
-              <w:t>t_avion.tsv</w:t>
-            </w:r>
-            <w:proofErr w:type="spellEnd"/>
-            <w:r>
-              <w:rPr>
-                <w:rFonts w:ascii="DejaVu Sans Mono" w:hAnsi="DejaVu Sans Mono"/>
-                <w:color w:val="06734E"/>
-                <w:sz w:val="18"/>
-              </w:rPr>
-              <w:t>'</w:t>
+              <w:t>'/var/lib/mysql-files/t_avion.tsv'</w:t>
             </w:r>
           </w:p>
         </w:tc>
@@ -13901,9 +13146,8 @@
                 <w:sz w:val="18"/>
                 <w:lang w:val="en-US"/>
               </w:rPr>
-              <w:t xml:space="preserve"> </w:t>
-            </w:r>
-            <w:proofErr w:type="spellStart"/>
+              <w:t xml:space="preserve"> t_a</w:t>
+            </w:r>
             <w:r>
               <w:rPr>
                 <w:rFonts w:ascii="DejaVu Sans Mono" w:hAnsi="DejaVu Sans Mono"/>
@@ -13911,18 +13155,8 @@
                 <w:sz w:val="18"/>
                 <w:lang w:val="en-US"/>
               </w:rPr>
-              <w:t>t_a</w:t>
-            </w:r>
-            <w:r>
-              <w:rPr>
-                <w:rFonts w:ascii="DejaVu Sans Mono" w:hAnsi="DejaVu Sans Mono"/>
-                <w:color w:val="25364B"/>
-                <w:sz w:val="18"/>
-                <w:lang w:val="en-US"/>
-              </w:rPr>
               <w:t>vion</w:t>
             </w:r>
-            <w:proofErr w:type="spellEnd"/>
           </w:p>
         </w:tc>
       </w:tr>
@@ -14506,36 +13740,8 @@
                 <w:color w:val="25364B"/>
                 <w:sz w:val="20"/>
               </w:rPr>
-              <w:t xml:space="preserve">PhpMyAdmin   /   </w:t>
-            </w:r>
-            <w:proofErr w:type="spellStart"/>
-            <w:r>
-              <w:rPr>
-                <w:rFonts w:ascii="Calibri" w:hAnsi="Calibri"/>
-                <w:color w:val="25364B"/>
-                <w:sz w:val="20"/>
-              </w:rPr>
-              <w:t>db_aeroport</w:t>
-            </w:r>
-            <w:proofErr w:type="spellEnd"/>
-            <w:r>
-              <w:rPr>
-                <w:rFonts w:ascii="Calibri" w:hAnsi="Calibri"/>
-                <w:color w:val="25364B"/>
-                <w:sz w:val="20"/>
-              </w:rPr>
-              <w:t xml:space="preserve">   /   </w:t>
-            </w:r>
-            <w:proofErr w:type="spellStart"/>
-            <w:r>
-              <w:rPr>
-                <w:rFonts w:ascii="Calibri" w:hAnsi="Calibri"/>
-                <w:color w:val="25364B"/>
-                <w:sz w:val="20"/>
-              </w:rPr>
-              <w:t>t_avion</w:t>
-            </w:r>
-            <w:proofErr w:type="spellEnd"/>
+              <w:t>PhpMyAdmin   /   db_aeroport   /   t_avion</w:t>
+            </w:r>
           </w:p>
         </w:tc>
       </w:tr>
@@ -14750,19 +13956,8 @@
                 <w:color w:val="FFFFFF"/>
                 <w:sz w:val="20"/>
               </w:rPr>
-              <w:t xml:space="preserve">SQL   /   </w:t>
-            </w:r>
-            <w:proofErr w:type="spellStart"/>
-            <w:r>
-              <w:rPr>
-                <w:rFonts w:ascii="Calibri" w:hAnsi="Calibri"/>
-                <w:b/>
-                <w:color w:val="FFFFFF"/>
-                <w:sz w:val="20"/>
-              </w:rPr>
-              <w:t>t_passager.tsv</w:t>
-            </w:r>
-            <w:proofErr w:type="spellEnd"/>
+              <w:t>SQL   /   t_passager.tsv</w:t>
+            </w:r>
           </w:p>
         </w:tc>
       </w:tr>
@@ -14881,43 +14076,7 @@
                 <w:color w:val="06734E"/>
                 <w:sz w:val="18"/>
               </w:rPr>
-              <w:t>'/var/lib/</w:t>
-            </w:r>
-            <w:proofErr w:type="spellStart"/>
-            <w:r>
-              <w:rPr>
-                <w:rFonts w:ascii="DejaVu Sans Mono" w:hAnsi="DejaVu Sans Mono"/>
-                <w:color w:val="06734E"/>
-                <w:sz w:val="18"/>
-              </w:rPr>
-              <w:t>mysql</w:t>
-            </w:r>
-            <w:proofErr w:type="spellEnd"/>
-            <w:r>
-              <w:rPr>
-                <w:rFonts w:ascii="DejaVu Sans Mono" w:hAnsi="DejaVu Sans Mono"/>
-                <w:color w:val="06734E"/>
-                <w:sz w:val="18"/>
-              </w:rPr>
-              <w:t>-files/</w:t>
-            </w:r>
-            <w:proofErr w:type="spellStart"/>
-            <w:r>
-              <w:rPr>
-                <w:rFonts w:ascii="DejaVu Sans Mono" w:hAnsi="DejaVu Sans Mono"/>
-                <w:color w:val="06734E"/>
-                <w:sz w:val="18"/>
-              </w:rPr>
-              <w:t>t_passager.tsv</w:t>
-            </w:r>
-            <w:proofErr w:type="spellEnd"/>
-            <w:r>
-              <w:rPr>
-                <w:rFonts w:ascii="DejaVu Sans Mono" w:hAnsi="DejaVu Sans Mono"/>
-                <w:color w:val="06734E"/>
-                <w:sz w:val="18"/>
-              </w:rPr>
-              <w:t>'</w:t>
+              <w:t>'/var/lib/mysql-files/t_passager.tsv'</w:t>
             </w:r>
           </w:p>
         </w:tc>
@@ -15019,9 +14178,8 @@
                 <w:sz w:val="18"/>
                 <w:lang w:val="en-US"/>
               </w:rPr>
-              <w:t xml:space="preserve"> </w:t>
-            </w:r>
-            <w:proofErr w:type="spellStart"/>
+              <w:t xml:space="preserve"> t_</w:t>
+            </w:r>
             <w:r>
               <w:rPr>
                 <w:rFonts w:ascii="DejaVu Sans Mono" w:hAnsi="DejaVu Sans Mono"/>
@@ -15029,18 +14187,8 @@
                 <w:sz w:val="18"/>
                 <w:lang w:val="en-US"/>
               </w:rPr>
-              <w:t>t_</w:t>
-            </w:r>
-            <w:r>
-              <w:rPr>
-                <w:rFonts w:ascii="DejaVu Sans Mono" w:hAnsi="DejaVu Sans Mono"/>
-                <w:color w:val="25364B"/>
-                <w:sz w:val="18"/>
-                <w:lang w:val="en-US"/>
-              </w:rPr>
               <w:t>passager</w:t>
             </w:r>
-            <w:proofErr w:type="spellEnd"/>
           </w:p>
         </w:tc>
       </w:tr>
@@ -15624,36 +14772,8 @@
                 <w:color w:val="25364B"/>
                 <w:sz w:val="20"/>
               </w:rPr>
-              <w:t xml:space="preserve">PhpMyAdmin   /   </w:t>
-            </w:r>
-            <w:proofErr w:type="spellStart"/>
-            <w:r>
-              <w:rPr>
-                <w:rFonts w:ascii="Calibri" w:hAnsi="Calibri"/>
-                <w:color w:val="25364B"/>
-                <w:sz w:val="20"/>
-              </w:rPr>
-              <w:t>db_aeroport</w:t>
-            </w:r>
-            <w:proofErr w:type="spellEnd"/>
-            <w:r>
-              <w:rPr>
-                <w:rFonts w:ascii="Calibri" w:hAnsi="Calibri"/>
-                <w:color w:val="25364B"/>
-                <w:sz w:val="20"/>
-              </w:rPr>
-              <w:t xml:space="preserve">   /   </w:t>
-            </w:r>
-            <w:proofErr w:type="spellStart"/>
-            <w:r>
-              <w:rPr>
-                <w:rFonts w:ascii="Calibri" w:hAnsi="Calibri"/>
-                <w:color w:val="25364B"/>
-                <w:sz w:val="20"/>
-              </w:rPr>
-              <w:t>t_passager</w:t>
-            </w:r>
-            <w:proofErr w:type="spellEnd"/>
+              <w:t>PhpMyAdmin   /   db_aeroport   /   t_passager</w:t>
+            </w:r>
           </w:p>
         </w:tc>
       </w:tr>
@@ -15868,9 +14988,8 @@
                 <w:color w:val="FFFFFF"/>
                 <w:sz w:val="20"/>
               </w:rPr>
-              <w:t xml:space="preserve">SQL   /   </w:t>
-            </w:r>
-            <w:proofErr w:type="spellStart"/>
+              <w:t>SQL   /   t_p</w:t>
+            </w:r>
             <w:r>
               <w:rPr>
                 <w:rFonts w:ascii="Calibri" w:hAnsi="Calibri"/>
@@ -15878,7 +14997,7 @@
                 <w:color w:val="FFFFFF"/>
                 <w:sz w:val="20"/>
               </w:rPr>
-              <w:t>t_p</w:t>
+              <w:t>rogramme_vol</w:t>
             </w:r>
             <w:r>
               <w:rPr>
@@ -15887,18 +15006,8 @@
                 <w:color w:val="FFFFFF"/>
                 <w:sz w:val="20"/>
               </w:rPr>
-              <w:t>rogramme_vol</w:t>
-            </w:r>
-            <w:r>
-              <w:rPr>
-                <w:rFonts w:ascii="Calibri" w:hAnsi="Calibri"/>
-                <w:b/>
-                <w:color w:val="FFFFFF"/>
-                <w:sz w:val="20"/>
-              </w:rPr>
               <w:t>.tsv</w:t>
             </w:r>
-            <w:proofErr w:type="spellEnd"/>
           </w:p>
         </w:tc>
       </w:tr>
@@ -16017,59 +15126,23 @@
                 <w:color w:val="06734E"/>
                 <w:sz w:val="18"/>
               </w:rPr>
-              <w:t>'/var/lib/</w:t>
-            </w:r>
-            <w:proofErr w:type="spellStart"/>
+              <w:t>'/var/lib/mysql-files/t_p</w:t>
+            </w:r>
             <w:r>
               <w:rPr>
                 <w:rFonts w:ascii="DejaVu Sans Mono" w:hAnsi="DejaVu Sans Mono"/>
                 <w:color w:val="06734E"/>
                 <w:sz w:val="18"/>
               </w:rPr>
-              <w:t>mysql</w:t>
-            </w:r>
-            <w:proofErr w:type="spellEnd"/>
+              <w:t>rogramme_vol</w:t>
+            </w:r>
             <w:r>
               <w:rPr>
                 <w:rFonts w:ascii="DejaVu Sans Mono" w:hAnsi="DejaVu Sans Mono"/>
                 <w:color w:val="06734E"/>
                 <w:sz w:val="18"/>
               </w:rPr>
-              <w:t>-files/</w:t>
-            </w:r>
-            <w:proofErr w:type="spellStart"/>
-            <w:r>
-              <w:rPr>
-                <w:rFonts w:ascii="DejaVu Sans Mono" w:hAnsi="DejaVu Sans Mono"/>
-                <w:color w:val="06734E"/>
-                <w:sz w:val="18"/>
-              </w:rPr>
-              <w:t>t_p</w:t>
-            </w:r>
-            <w:r>
-              <w:rPr>
-                <w:rFonts w:ascii="DejaVu Sans Mono" w:hAnsi="DejaVu Sans Mono"/>
-                <w:color w:val="06734E"/>
-                <w:sz w:val="18"/>
-              </w:rPr>
-              <w:t>rogramme_vol</w:t>
-            </w:r>
-            <w:r>
-              <w:rPr>
-                <w:rFonts w:ascii="DejaVu Sans Mono" w:hAnsi="DejaVu Sans Mono"/>
-                <w:color w:val="06734E"/>
-                <w:sz w:val="18"/>
-              </w:rPr>
-              <w:t>.tsv</w:t>
-            </w:r>
-            <w:proofErr w:type="spellEnd"/>
-            <w:r>
-              <w:rPr>
-                <w:rFonts w:ascii="DejaVu Sans Mono" w:hAnsi="DejaVu Sans Mono"/>
-                <w:color w:val="06734E"/>
-                <w:sz w:val="18"/>
-              </w:rPr>
-              <w:t>'</w:t>
+              <w:t>.tsv'</w:t>
             </w:r>
           </w:p>
         </w:tc>
@@ -16171,9 +15244,8 @@
                 <w:sz w:val="18"/>
                 <w:lang w:val="en-US"/>
               </w:rPr>
-              <w:t xml:space="preserve"> </w:t>
-            </w:r>
-            <w:proofErr w:type="spellStart"/>
+              <w:t xml:space="preserve"> t_</w:t>
+            </w:r>
             <w:r>
               <w:rPr>
                 <w:rFonts w:ascii="DejaVu Sans Mono" w:hAnsi="DejaVu Sans Mono"/>
@@ -16181,7 +15253,7 @@
                 <w:sz w:val="18"/>
                 <w:lang w:val="en-US"/>
               </w:rPr>
-              <w:t>t_</w:t>
+              <w:t>p</w:t>
             </w:r>
             <w:r>
               <w:rPr>
@@ -16190,18 +15262,8 @@
                 <w:sz w:val="18"/>
                 <w:lang w:val="en-US"/>
               </w:rPr>
-              <w:t>p</w:t>
-            </w:r>
-            <w:r>
-              <w:rPr>
-                <w:rFonts w:ascii="DejaVu Sans Mono" w:hAnsi="DejaVu Sans Mono"/>
-                <w:color w:val="25364B"/>
-                <w:sz w:val="18"/>
-                <w:lang w:val="en-US"/>
-              </w:rPr>
               <w:t>rogramme_vol</w:t>
             </w:r>
-            <w:proofErr w:type="spellEnd"/>
           </w:p>
         </w:tc>
       </w:tr>
@@ -16794,44 +15856,16 @@
                 <w:color w:val="25364B"/>
                 <w:sz w:val="20"/>
               </w:rPr>
-              <w:t xml:space="preserve">PhpMyAdmin   /   </w:t>
-            </w:r>
-            <w:proofErr w:type="spellStart"/>
+              <w:t>PhpMyAdmin   /   db_aeroport   /   t_p</w:t>
+            </w:r>
             <w:r>
               <w:rPr>
                 <w:rFonts w:ascii="Calibri" w:hAnsi="Calibri"/>
                 <w:color w:val="25364B"/>
                 <w:sz w:val="20"/>
               </w:rPr>
-              <w:t>db_aeroport</w:t>
-            </w:r>
-            <w:proofErr w:type="spellEnd"/>
-            <w:r>
-              <w:rPr>
-                <w:rFonts w:ascii="Calibri" w:hAnsi="Calibri"/>
-                <w:color w:val="25364B"/>
-                <w:sz w:val="20"/>
-              </w:rPr>
-              <w:t xml:space="preserve">   /   </w:t>
-            </w:r>
-            <w:proofErr w:type="spellStart"/>
-            <w:r>
-              <w:rPr>
-                <w:rFonts w:ascii="Calibri" w:hAnsi="Calibri"/>
-                <w:color w:val="25364B"/>
-                <w:sz w:val="20"/>
-              </w:rPr>
-              <w:t>t_p</w:t>
-            </w:r>
-            <w:r>
-              <w:rPr>
-                <w:rFonts w:ascii="Calibri" w:hAnsi="Calibri"/>
-                <w:color w:val="25364B"/>
-                <w:sz w:val="20"/>
-              </w:rPr>
               <w:t>rogramme_vol</w:t>
             </w:r>
-            <w:proofErr w:type="spellEnd"/>
           </w:p>
         </w:tc>
       </w:tr>
@@ -17046,19 +16080,8 @@
                 <w:color w:val="FFFFFF"/>
                 <w:sz w:val="20"/>
               </w:rPr>
-              <w:t xml:space="preserve">SQL   /   </w:t>
-            </w:r>
-            <w:proofErr w:type="spellStart"/>
-            <w:r>
-              <w:rPr>
-                <w:rFonts w:ascii="Calibri" w:hAnsi="Calibri"/>
-                <w:b/>
-                <w:color w:val="FFFFFF"/>
-                <w:sz w:val="20"/>
-              </w:rPr>
-              <w:t>t_vol.tsv</w:t>
-            </w:r>
-            <w:proofErr w:type="spellEnd"/>
+              <w:t>SQL   /   t_vol.tsv</w:t>
+            </w:r>
           </w:p>
         </w:tc>
       </w:tr>
@@ -17177,43 +16200,7 @@
                 <w:color w:val="06734E"/>
                 <w:sz w:val="18"/>
               </w:rPr>
-              <w:t>'/var/lib/</w:t>
-            </w:r>
-            <w:proofErr w:type="spellStart"/>
-            <w:r>
-              <w:rPr>
-                <w:rFonts w:ascii="DejaVu Sans Mono" w:hAnsi="DejaVu Sans Mono"/>
-                <w:color w:val="06734E"/>
-                <w:sz w:val="18"/>
-              </w:rPr>
-              <w:t>mysql</w:t>
-            </w:r>
-            <w:proofErr w:type="spellEnd"/>
-            <w:r>
-              <w:rPr>
-                <w:rFonts w:ascii="DejaVu Sans Mono" w:hAnsi="DejaVu Sans Mono"/>
-                <w:color w:val="06734E"/>
-                <w:sz w:val="18"/>
-              </w:rPr>
-              <w:t>-files/</w:t>
-            </w:r>
-            <w:proofErr w:type="spellStart"/>
-            <w:r>
-              <w:rPr>
-                <w:rFonts w:ascii="DejaVu Sans Mono" w:hAnsi="DejaVu Sans Mono"/>
-                <w:color w:val="06734E"/>
-                <w:sz w:val="18"/>
-              </w:rPr>
-              <w:t>t_vol.tsv</w:t>
-            </w:r>
-            <w:proofErr w:type="spellEnd"/>
-            <w:r>
-              <w:rPr>
-                <w:rFonts w:ascii="DejaVu Sans Mono" w:hAnsi="DejaVu Sans Mono"/>
-                <w:color w:val="06734E"/>
-                <w:sz w:val="18"/>
-              </w:rPr>
-              <w:t>'</w:t>
+              <w:t>'/var/lib/mysql-files/t_vol.tsv'</w:t>
             </w:r>
           </w:p>
         </w:tc>
@@ -17909,25 +16896,7 @@
                 <w:color w:val="25364B"/>
                 <w:sz w:val="20"/>
               </w:rPr>
-              <w:t xml:space="preserve">PhpMyAdmin   /   </w:t>
-            </w:r>
-            <w:proofErr w:type="spellStart"/>
-            <w:r>
-              <w:rPr>
-                <w:rFonts w:ascii="Calibri" w:hAnsi="Calibri"/>
-                <w:color w:val="25364B"/>
-                <w:sz w:val="20"/>
-              </w:rPr>
-              <w:t>db_aeroport</w:t>
-            </w:r>
-            <w:proofErr w:type="spellEnd"/>
-            <w:r>
-              <w:rPr>
-                <w:rFonts w:ascii="Calibri" w:hAnsi="Calibri"/>
-                <w:color w:val="25364B"/>
-                <w:sz w:val="20"/>
-              </w:rPr>
-              <w:t xml:space="preserve">   /   t_vol</w:t>
+              <w:t>PhpMyAdmin   /   db_aeroport   /   t_vol</w:t>
             </w:r>
           </w:p>
         </w:tc>
@@ -18143,19 +17112,8 @@
                 <w:color w:val="FFFFFF"/>
                 <w:sz w:val="20"/>
               </w:rPr>
-              <w:t xml:space="preserve">SQL   /   </w:t>
-            </w:r>
-            <w:proofErr w:type="spellStart"/>
-            <w:r>
-              <w:rPr>
-                <w:rFonts w:ascii="Calibri" w:hAnsi="Calibri"/>
-                <w:b/>
-                <w:color w:val="FFFFFF"/>
-                <w:sz w:val="20"/>
-              </w:rPr>
-              <w:t>t_reservation.tsv</w:t>
-            </w:r>
-            <w:proofErr w:type="spellEnd"/>
+              <w:t>SQL   /   t_reservation.tsv</w:t>
+            </w:r>
           </w:p>
         </w:tc>
       </w:tr>
@@ -18274,43 +17232,7 @@
                 <w:color w:val="06734E"/>
                 <w:sz w:val="18"/>
               </w:rPr>
-              <w:t>'/var/lib/</w:t>
-            </w:r>
-            <w:proofErr w:type="spellStart"/>
-            <w:r>
-              <w:rPr>
-                <w:rFonts w:ascii="DejaVu Sans Mono" w:hAnsi="DejaVu Sans Mono"/>
-                <w:color w:val="06734E"/>
-                <w:sz w:val="18"/>
-              </w:rPr>
-              <w:t>mysql</w:t>
-            </w:r>
-            <w:proofErr w:type="spellEnd"/>
-            <w:r>
-              <w:rPr>
-                <w:rFonts w:ascii="DejaVu Sans Mono" w:hAnsi="DejaVu Sans Mono"/>
-                <w:color w:val="06734E"/>
-                <w:sz w:val="18"/>
-              </w:rPr>
-              <w:t>-files/</w:t>
-            </w:r>
-            <w:proofErr w:type="spellStart"/>
-            <w:r>
-              <w:rPr>
-                <w:rFonts w:ascii="DejaVu Sans Mono" w:hAnsi="DejaVu Sans Mono"/>
-                <w:color w:val="06734E"/>
-                <w:sz w:val="18"/>
-              </w:rPr>
-              <w:t>t_reservation.tsv</w:t>
-            </w:r>
-            <w:proofErr w:type="spellEnd"/>
-            <w:r>
-              <w:rPr>
-                <w:rFonts w:ascii="DejaVu Sans Mono" w:hAnsi="DejaVu Sans Mono"/>
-                <w:color w:val="06734E"/>
-                <w:sz w:val="18"/>
-              </w:rPr>
-              <w:t>'</w:t>
+              <w:t>'/var/lib/mysql-files/t_reservation.tsv'</w:t>
             </w:r>
           </w:p>
         </w:tc>
@@ -19006,25 +17928,7 @@
                 <w:color w:val="25364B"/>
                 <w:sz w:val="20"/>
               </w:rPr>
-              <w:t xml:space="preserve">PhpMyAdmin   /   </w:t>
-            </w:r>
-            <w:proofErr w:type="spellStart"/>
-            <w:r>
-              <w:rPr>
-                <w:rFonts w:ascii="Calibri" w:hAnsi="Calibri"/>
-                <w:color w:val="25364B"/>
-                <w:sz w:val="20"/>
-              </w:rPr>
-              <w:t>db_aeroport</w:t>
-            </w:r>
-            <w:proofErr w:type="spellEnd"/>
-            <w:r>
-              <w:rPr>
-                <w:rFonts w:ascii="Calibri" w:hAnsi="Calibri"/>
-                <w:color w:val="25364B"/>
-                <w:sz w:val="20"/>
-              </w:rPr>
-              <w:t xml:space="preserve">   /   t_reservation</w:t>
+              <w:t>PhpMyAdmin   /   db_aeroport   /   t_reservation</w:t>
             </w:r>
           </w:p>
         </w:tc>
@@ -19398,7 +18302,6 @@
               </w:rPr>
               <w:t xml:space="preserve"> </w:t>
             </w:r>
-            <w:proofErr w:type="spellStart"/>
             <w:r>
               <w:rPr>
                 <w:rFonts w:ascii="DejaVu Sans Mono" w:hAnsi="DejaVu Sans Mono"/>
@@ -19408,7 +18311,6 @@
               </w:rPr>
               <w:t>t_avion</w:t>
             </w:r>
-            <w:proofErr w:type="spellEnd"/>
           </w:p>
         </w:tc>
       </w:tr>
@@ -19482,7 +18384,6 @@
             <w:r>
               <w:t xml:space="preserve"> </w:t>
             </w:r>
-            <w:proofErr w:type="spellStart"/>
             <w:r>
               <w:rPr>
                 <w:rFonts w:ascii="DejaVu Sans Mono" w:hAnsi="DejaVu Sans Mono"/>
@@ -19490,17 +18391,7 @@
                 <w:sz w:val="18"/>
                 <w:lang w:val="en-US"/>
               </w:rPr>
-              <w:t>compagnie_fk</w:t>
-            </w:r>
-            <w:proofErr w:type="spellEnd"/>
-            <w:r>
-              <w:rPr>
-                <w:rFonts w:ascii="DejaVu Sans Mono" w:hAnsi="DejaVu Sans Mono"/>
-                <w:color w:val="25364B"/>
-                <w:sz w:val="18"/>
-                <w:lang w:val="en-US"/>
-              </w:rPr>
-              <w:t xml:space="preserve"> =</w:t>
+              <w:t>compagnie_fk =</w:t>
             </w:r>
             <w:r>
               <w:t xml:space="preserve"> </w:t>
@@ -19590,7 +18481,6 @@
               </w:rPr>
               <w:t xml:space="preserve"> </w:t>
             </w:r>
-            <w:proofErr w:type="spellStart"/>
             <w:r>
               <w:rPr>
                 <w:rFonts w:ascii="DejaVu Sans Mono" w:hAnsi="DejaVu Sans Mono"/>
@@ -19598,17 +18488,7 @@
                 <w:sz w:val="18"/>
                 <w:lang w:val="en-US"/>
               </w:rPr>
-              <w:t>capacite</w:t>
-            </w:r>
-            <w:proofErr w:type="spellEnd"/>
-            <w:r>
-              <w:rPr>
-                <w:rFonts w:ascii="DejaVu Sans Mono" w:hAnsi="DejaVu Sans Mono"/>
-                <w:color w:val="25364B"/>
-                <w:sz w:val="18"/>
-                <w:lang w:val="en-US"/>
-              </w:rPr>
-              <w:t xml:space="preserve"> </w:t>
+              <w:t xml:space="preserve">capacite </w:t>
             </w:r>
             <w:r>
               <w:rPr>
@@ -20085,7 +18965,6 @@
               </w:rPr>
               <w:t xml:space="preserve"> </w:t>
             </w:r>
-            <w:proofErr w:type="spellStart"/>
             <w:r>
               <w:rPr>
                 <w:rFonts w:ascii="DejaVu Sans Mono" w:hAnsi="DejaVu Sans Mono"/>
@@ -20095,7 +18974,6 @@
               </w:rPr>
               <w:t>heure_depart</w:t>
             </w:r>
-            <w:proofErr w:type="spellEnd"/>
             <w:r>
               <w:rPr>
                 <w:rFonts w:ascii="DejaVu Sans Mono" w:hAnsi="DejaVu Sans Mono"/>
@@ -20408,39 +19286,8 @@
                 <w:color w:val="315BC0"/>
                 <w:sz w:val="18"/>
               </w:rPr>
-              <w:t xml:space="preserve">SELECT </w:t>
-            </w:r>
-            <w:proofErr w:type="spellStart"/>
-            <w:r>
-              <w:rPr>
-                <w:rFonts w:ascii="DejaVu Sans Mono" w:hAnsi="DejaVu Sans Mono"/>
-                <w:b/>
-                <w:color w:val="315BC0"/>
-                <w:sz w:val="18"/>
-              </w:rPr>
-              <w:t>compagnie_fk</w:t>
-            </w:r>
-            <w:proofErr w:type="spellEnd"/>
-            <w:r>
-              <w:rPr>
-                <w:rFonts w:ascii="DejaVu Sans Mono" w:hAnsi="DejaVu Sans Mono"/>
-                <w:b/>
-                <w:color w:val="315BC0"/>
-                <w:sz w:val="18"/>
-              </w:rPr>
-              <w:t xml:space="preserve">, COUNT(*) AS </w:t>
-            </w:r>
-            <w:proofErr w:type="spellStart"/>
-            <w:r>
-              <w:rPr>
-                <w:rFonts w:ascii="DejaVu Sans Mono" w:hAnsi="DejaVu Sans Mono"/>
-                <w:b/>
-                <w:color w:val="315BC0"/>
-                <w:sz w:val="18"/>
-              </w:rPr>
-              <w:t>nombre_vols</w:t>
-            </w:r>
-            <w:proofErr w:type="spellEnd"/>
+              <w:t>SELECT compagnie_fk, COUNT(*) AS nombre_vols</w:t>
+            </w:r>
           </w:p>
         </w:tc>
       </w:tr>
@@ -20628,7 +19475,6 @@
               </w:rPr>
               <w:t xml:space="preserve"> </w:t>
             </w:r>
-            <w:proofErr w:type="spellStart"/>
             <w:r>
               <w:rPr>
                 <w:rFonts w:ascii="DejaVu Sans Mono" w:hAnsi="DejaVu Sans Mono"/>
@@ -20638,7 +19484,6 @@
               </w:rPr>
               <w:t>compagnie_fk</w:t>
             </w:r>
-            <w:proofErr w:type="spellEnd"/>
           </w:p>
         </w:tc>
       </w:tr>
@@ -20713,7 +19558,6 @@
               </w:rPr>
               <w:t xml:space="preserve">ORDER BY </w:t>
             </w:r>
-            <w:proofErr w:type="spellStart"/>
             <w:r>
               <w:rPr>
                 <w:rFonts w:ascii="DejaVu Sans Mono" w:hAnsi="DejaVu Sans Mono"/>
@@ -20723,7 +19567,6 @@
               </w:rPr>
               <w:t>nombre_vols</w:t>
             </w:r>
-            <w:proofErr w:type="spellEnd"/>
             <w:r>
               <w:rPr>
                 <w:rFonts w:ascii="DejaVu Sans Mono" w:hAnsi="DejaVu Sans Mono"/>
@@ -20974,82 +19817,8 @@
               <w:rPr>
                 <w:lang w:val="en-US"/>
               </w:rPr>
-              <w:t xml:space="preserve">SELECT </w:t>
-            </w:r>
-            <w:proofErr w:type="spellStart"/>
-            <w:r>
-              <w:rPr>
-                <w:lang w:val="en-US"/>
-              </w:rPr>
-              <w:t>P.nom</w:t>
-            </w:r>
-            <w:proofErr w:type="spellEnd"/>
-            <w:r>
-              <w:rPr>
-                <w:lang w:val="en-US"/>
-              </w:rPr>
-              <w:t xml:space="preserve">, </w:t>
-            </w:r>
-            <w:proofErr w:type="spellStart"/>
-            <w:proofErr w:type="gramStart"/>
-            <w:r>
-              <w:rPr>
-                <w:lang w:val="en-US"/>
-              </w:rPr>
-              <w:t>P.prenom</w:t>
-            </w:r>
-            <w:proofErr w:type="spellEnd"/>
-            <w:proofErr w:type="gramEnd"/>
-            <w:r>
-              <w:rPr>
-                <w:lang w:val="en-US"/>
-              </w:rPr>
-              <w:t xml:space="preserve">, </w:t>
-            </w:r>
-            <w:proofErr w:type="spellStart"/>
-            <w:proofErr w:type="gramStart"/>
-            <w:r>
-              <w:rPr>
-                <w:lang w:val="en-US"/>
-              </w:rPr>
-              <w:t>P.numero</w:t>
-            </w:r>
-            <w:proofErr w:type="gramEnd"/>
-            <w:r>
-              <w:rPr>
-                <w:lang w:val="en-US"/>
-              </w:rPr>
-              <w:t>_passeport</w:t>
-            </w:r>
-            <w:proofErr w:type="spellEnd"/>
-            <w:r>
-              <w:rPr>
-                <w:lang w:val="en-US"/>
-              </w:rPr>
-              <w:t xml:space="preserve">, </w:t>
-            </w:r>
-            <w:proofErr w:type="spellStart"/>
-            <w:r>
-              <w:rPr>
-                <w:lang w:val="en-US"/>
-              </w:rPr>
-              <w:t>A.nom</w:t>
-            </w:r>
-            <w:proofErr w:type="spellEnd"/>
-            <w:r>
-              <w:rPr>
-                <w:lang w:val="en-US"/>
-              </w:rPr>
-              <w:t xml:space="preserve"> AS </w:t>
-            </w:r>
-            <w:proofErr w:type="spellStart"/>
-            <w:r>
-              <w:rPr>
-                <w:lang w:val="en-US"/>
-              </w:rPr>
-              <w:t>aeroport_depart</w:t>
-            </w:r>
-            <w:proofErr w:type="spellEnd"/>
+              <w:t>SELECT P.nom, P.prenom, P.numero_passeport, A.nom AS aeroport_depart</w:t>
+            </w:r>
           </w:p>
         </w:tc>
       </w:tr>
@@ -21118,21 +19887,7 @@
               <w:rPr>
                 <w:lang w:val="en-US"/>
               </w:rPr>
-              <w:t xml:space="preserve">FROM </w:t>
-            </w:r>
-            <w:proofErr w:type="spellStart"/>
-            <w:r>
-              <w:rPr>
-                <w:lang w:val="en-US"/>
-              </w:rPr>
-              <w:t>t_passager</w:t>
-            </w:r>
-            <w:proofErr w:type="spellEnd"/>
-            <w:r>
-              <w:rPr>
-                <w:lang w:val="en-US"/>
-              </w:rPr>
-              <w:t xml:space="preserve"> AS P</w:t>
+              <w:t>FROM t_passager AS P</w:t>
             </w:r>
           </w:p>
         </w:tc>
@@ -21202,46 +19957,8 @@
               <w:rPr>
                 <w:lang w:val="en-US"/>
               </w:rPr>
-              <w:t xml:space="preserve">JOIN t_reservation AS R ON </w:t>
-            </w:r>
-            <w:proofErr w:type="spellStart"/>
-            <w:proofErr w:type="gramStart"/>
-            <w:r>
-              <w:rPr>
-                <w:lang w:val="en-US"/>
-              </w:rPr>
-              <w:t>R.passager</w:t>
-            </w:r>
-            <w:proofErr w:type="gramEnd"/>
-            <w:r>
-              <w:rPr>
-                <w:lang w:val="en-US"/>
-              </w:rPr>
-              <w:t>_fk</w:t>
-            </w:r>
-            <w:proofErr w:type="spellEnd"/>
-            <w:r>
-              <w:rPr>
-                <w:lang w:val="en-US"/>
-              </w:rPr>
-              <w:t xml:space="preserve"> = </w:t>
-            </w:r>
-            <w:proofErr w:type="spellStart"/>
-            <w:proofErr w:type="gramStart"/>
-            <w:r>
-              <w:rPr>
-                <w:lang w:val="en-US"/>
-              </w:rPr>
-              <w:t>P.passager</w:t>
-            </w:r>
-            <w:proofErr w:type="gramEnd"/>
-            <w:r>
-              <w:rPr>
-                <w:lang w:val="en-US"/>
-              </w:rPr>
-              <w:t>_id</w:t>
-            </w:r>
-            <w:proofErr w:type="spellEnd"/>
+              <w:t>JOIN t_reservation AS R ON R.passager_fk = P.passager_id</w:t>
+            </w:r>
           </w:p>
         </w:tc>
       </w:tr>
@@ -21310,30 +20027,8 @@
               <w:rPr>
                 <w:lang w:val="en-US"/>
               </w:rPr>
-              <w:t xml:space="preserve">JOIN t_vol AS V ON </w:t>
-            </w:r>
-            <w:proofErr w:type="spellStart"/>
-            <w:r>
-              <w:rPr>
-                <w:lang w:val="en-US"/>
-              </w:rPr>
-              <w:t>V.vol_id</w:t>
-            </w:r>
-            <w:proofErr w:type="spellEnd"/>
-            <w:r>
-              <w:rPr>
-                <w:lang w:val="en-US"/>
-              </w:rPr>
-              <w:t xml:space="preserve"> = </w:t>
-            </w:r>
-            <w:proofErr w:type="spellStart"/>
-            <w:r>
-              <w:rPr>
-                <w:lang w:val="en-US"/>
-              </w:rPr>
-              <w:t>R.vol_fk</w:t>
-            </w:r>
-            <w:proofErr w:type="spellEnd"/>
+              <w:t>JOIN t_vol AS V ON V.vol_id = R.vol_fk</w:t>
+            </w:r>
           </w:p>
         </w:tc>
       </w:tr>
@@ -21407,65 +20102,7 @@
               <w:rPr>
                 <w:lang w:val="en-US"/>
               </w:rPr>
-              <w:t xml:space="preserve">JOIN </w:t>
-            </w:r>
-            <w:proofErr w:type="spellStart"/>
-            <w:r>
-              <w:rPr>
-                <w:lang w:val="en-US"/>
-              </w:rPr>
-              <w:t>t_aeroport</w:t>
-            </w:r>
-            <w:proofErr w:type="spellEnd"/>
-            <w:r>
-              <w:rPr>
-                <w:lang w:val="en-US"/>
-              </w:rPr>
-              <w:t xml:space="preserve"> AS A ON </w:t>
-            </w:r>
-            <w:proofErr w:type="spellStart"/>
-            <w:proofErr w:type="gramStart"/>
-            <w:r>
-              <w:rPr>
-                <w:lang w:val="en-US"/>
-              </w:rPr>
-              <w:t>A.aeroport</w:t>
-            </w:r>
-            <w:proofErr w:type="gramEnd"/>
-            <w:r>
-              <w:rPr>
-                <w:lang w:val="en-US"/>
-              </w:rPr>
-              <w:t>_id</w:t>
-            </w:r>
-            <w:proofErr w:type="spellEnd"/>
-            <w:r>
-              <w:rPr>
-                <w:lang w:val="en-US"/>
-              </w:rPr>
-              <w:t xml:space="preserve"> = </w:t>
-            </w:r>
-            <w:proofErr w:type="spellStart"/>
-            <w:proofErr w:type="gramStart"/>
-            <w:r>
-              <w:rPr>
-                <w:lang w:val="en-US"/>
-              </w:rPr>
-              <w:t>V.aeroport</w:t>
-            </w:r>
-            <w:proofErr w:type="gramEnd"/>
-            <w:r>
-              <w:rPr>
-                <w:lang w:val="en-US"/>
-              </w:rPr>
-              <w:t>_depart_fk</w:t>
-            </w:r>
-            <w:proofErr w:type="spellEnd"/>
-            <w:r>
-              <w:rPr>
-                <w:lang w:val="en-US"/>
-              </w:rPr>
-              <w:t>;</w:t>
+              <w:t>JOIN t_aeroport AS A ON A.aeroport_id = V.aeroport_depart_fk;</w:t>
             </w:r>
           </w:p>
         </w:tc>
@@ -21806,21 +20443,8 @@
               <w:spacing w:after="0" w:line="240" w:lineRule="auto"/>
             </w:pPr>
             <w:r>
-              <w:t xml:space="preserve">SELECT </w:t>
-            </w:r>
-            <w:proofErr w:type="spellStart"/>
-            <w:r>
-              <w:t>vol_fk</w:t>
-            </w:r>
-            <w:proofErr w:type="spellEnd"/>
-            <w:r>
-              <w:t xml:space="preserve">, AVG(prix) AS </w:t>
-            </w:r>
-            <w:proofErr w:type="spellStart"/>
-            <w:r>
-              <w:t>prix_moyen</w:t>
-            </w:r>
-            <w:proofErr w:type="spellEnd"/>
+              <w:t>SELECT vol_fk, AVG(prix) AS prix_moyen</w:t>
+            </w:r>
           </w:p>
         </w:tc>
       </w:tr>
@@ -21885,19 +20509,11 @@
                 <w:lang w:val="en-US"/>
               </w:rPr>
             </w:pPr>
-            <w:proofErr w:type="gramStart"/>
             <w:r>
               <w:rPr>
                 <w:lang w:val="en-US"/>
               </w:rPr>
-              <w:t>FROM t</w:t>
-            </w:r>
-            <w:proofErr w:type="gramEnd"/>
-            <w:r>
-              <w:rPr>
-                <w:lang w:val="en-US"/>
-              </w:rPr>
-              <w:t>_reservation</w:t>
+              <w:t>FROM t_reservation</w:t>
             </w:r>
           </w:p>
         </w:tc>
@@ -21967,16 +20583,8 @@
               <w:rPr>
                 <w:lang w:val="en-US"/>
               </w:rPr>
-              <w:t xml:space="preserve">GROUP BY </w:t>
-            </w:r>
-            <w:proofErr w:type="spellStart"/>
-            <w:r>
-              <w:rPr>
-                <w:lang w:val="en-US"/>
-              </w:rPr>
-              <w:t>vol_fk</w:t>
-            </w:r>
-            <w:proofErr w:type="spellEnd"/>
+              <w:t>GROUP BY vol_fk</w:t>
+            </w:r>
           </w:p>
         </w:tc>
       </w:tr>
@@ -22045,21 +20653,7 @@
               <w:rPr>
                 <w:lang w:val="en-US"/>
               </w:rPr>
-              <w:t xml:space="preserve">ORDER BY </w:t>
-            </w:r>
-            <w:proofErr w:type="spellStart"/>
-            <w:r>
-              <w:rPr>
-                <w:lang w:val="en-US"/>
-              </w:rPr>
-              <w:t>prix_moyen</w:t>
-            </w:r>
-            <w:proofErr w:type="spellEnd"/>
-            <w:r>
-              <w:rPr>
-                <w:lang w:val="en-US"/>
-              </w:rPr>
-              <w:t xml:space="preserve"> ASC;</w:t>
+              <w:t>ORDER BY prix_moyen ASC;</w:t>
             </w:r>
           </w:p>
         </w:tc>

</xml_diff>

<commit_message>
doc(rapport): Amélioration du texte de chargement des données
</commit_message>
<xml_diff>
--- a/DOC/src/AugustoRomain-P_DB_GestionAeroport-Rapport.docx
+++ b/DOC/src/AugustoRomain-P_DB_GestionAeroport-Rapport.docx
@@ -1844,7 +1844,7 @@
           <w:r>
             <w:fldChar w:fldCharType="separate"/>
           </w:r>
-          <w:hyperlink w:anchor="_Toc244067175" w:history="1">
+          <w:hyperlink w:anchor="_Toc244067494" w:history="1">
             <w:r>
               <w:rPr>
                 <w:rStyle w:val="Lienhypertexte"/>
@@ -1868,7 +1868,7 @@
               <w:rPr>
                 <w:webHidden/>
               </w:rPr>
-              <w:instrText xml:space="preserve"> PAGEREF _Toc244067175 \h </w:instrText>
+              <w:instrText xml:space="preserve"> PAGEREF _Toc244067494 \h </w:instrText>
             </w:r>
             <w:r>
               <w:rPr>
@@ -1905,7 +1905,7 @@
               <w:lang w:eastAsia="fr-CH"/>
             </w:rPr>
           </w:pPr>
-          <w:hyperlink w:anchor="_Toc244067176" w:history="1">
+          <w:hyperlink w:anchor="_Toc244067495" w:history="1">
             <w:r>
               <w:rPr>
                 <w:rStyle w:val="Lienhypertexte"/>
@@ -1929,7 +1929,7 @@
               <w:rPr>
                 <w:webHidden/>
               </w:rPr>
-              <w:instrText xml:space="preserve"> PAGEREF _Toc244067176 \h </w:instrText>
+              <w:instrText xml:space="preserve"> PAGEREF _Toc244067495 \h </w:instrText>
             </w:r>
             <w:r>
               <w:rPr>
@@ -1966,7 +1966,7 @@
               <w:lang w:eastAsia="fr-CH"/>
             </w:rPr>
           </w:pPr>
-          <w:hyperlink w:anchor="_Toc244067177" w:history="1">
+          <w:hyperlink w:anchor="_Toc244067496" w:history="1">
             <w:r>
               <w:rPr>
                 <w:rStyle w:val="Lienhypertexte"/>
@@ -1990,7 +1990,7 @@
               <w:rPr>
                 <w:webHidden/>
               </w:rPr>
-              <w:instrText xml:space="preserve"> PAGEREF _Toc244067177 \h </w:instrText>
+              <w:instrText xml:space="preserve"> PAGEREF _Toc244067496 \h </w:instrText>
             </w:r>
             <w:r>
               <w:rPr>
@@ -2029,7 +2029,7 @@
               <w:lang w:eastAsia="fr-CH"/>
             </w:rPr>
           </w:pPr>
-          <w:hyperlink w:anchor="_Toc244067178" w:history="1">
+          <w:hyperlink w:anchor="_Toc244067497" w:history="1">
             <w:r>
               <w:rPr>
                 <w:rStyle w:val="Lienhypertexte"/>
@@ -2059,7 +2059,7 @@
                 <w:noProof/>
                 <w:webHidden/>
               </w:rPr>
-              <w:instrText xml:space="preserve"> PAGEREF _Toc244067178 \h </w:instrText>
+              <w:instrText xml:space="preserve"> PAGEREF _Toc244067497 \h </w:instrText>
             </w:r>
             <w:r>
               <w:rPr>
@@ -2102,7 +2102,7 @@
               <w:lang w:eastAsia="fr-CH"/>
             </w:rPr>
           </w:pPr>
-          <w:hyperlink w:anchor="_Toc244067179" w:history="1">
+          <w:hyperlink w:anchor="_Toc244067498" w:history="1">
             <w:r>
               <w:rPr>
                 <w:rStyle w:val="Lienhypertexte"/>
@@ -2132,7 +2132,7 @@
                 <w:noProof/>
                 <w:webHidden/>
               </w:rPr>
-              <w:instrText xml:space="preserve"> PAGEREF _Toc244067179 \h </w:instrText>
+              <w:instrText xml:space="preserve"> PAGEREF _Toc244067498 \h </w:instrText>
             </w:r>
             <w:r>
               <w:rPr>
@@ -2175,7 +2175,7 @@
               <w:lang w:eastAsia="fr-CH"/>
             </w:rPr>
           </w:pPr>
-          <w:hyperlink w:anchor="_Toc244067180" w:history="1">
+          <w:hyperlink w:anchor="_Toc244067499" w:history="1">
             <w:r>
               <w:rPr>
                 <w:rStyle w:val="Lienhypertexte"/>
@@ -2205,7 +2205,7 @@
                 <w:noProof/>
                 <w:webHidden/>
               </w:rPr>
-              <w:instrText xml:space="preserve"> PAGEREF _Toc244067180 \h </w:instrText>
+              <w:instrText xml:space="preserve"> PAGEREF _Toc244067499 \h </w:instrText>
             </w:r>
             <w:r>
               <w:rPr>
@@ -2248,7 +2248,7 @@
               <w:lang w:eastAsia="fr-CH"/>
             </w:rPr>
           </w:pPr>
-          <w:hyperlink w:anchor="_Toc244067181" w:history="1">
+          <w:hyperlink w:anchor="_Toc244067500" w:history="1">
             <w:r>
               <w:rPr>
                 <w:rStyle w:val="Lienhypertexte"/>
@@ -2278,7 +2278,7 @@
                 <w:noProof/>
                 <w:webHidden/>
               </w:rPr>
-              <w:instrText xml:space="preserve"> PAGEREF _Toc244067181 \h </w:instrText>
+              <w:instrText xml:space="preserve"> PAGEREF _Toc244067500 \h </w:instrText>
             </w:r>
             <w:r>
               <w:rPr>
@@ -2321,7 +2321,7 @@
               <w:lang w:eastAsia="fr-CH"/>
             </w:rPr>
           </w:pPr>
-          <w:hyperlink w:anchor="_Toc244067182" w:history="1">
+          <w:hyperlink w:anchor="_Toc244067501" w:history="1">
             <w:r>
               <w:rPr>
                 <w:rStyle w:val="Lienhypertexte"/>
@@ -2351,7 +2351,7 @@
                 <w:noProof/>
                 <w:webHidden/>
               </w:rPr>
-              <w:instrText xml:space="preserve"> PAGEREF _Toc244067182 \h </w:instrText>
+              <w:instrText xml:space="preserve"> PAGEREF _Toc244067501 \h </w:instrText>
             </w:r>
             <w:r>
               <w:rPr>
@@ -2394,7 +2394,7 @@
               <w:lang w:eastAsia="fr-CH"/>
             </w:rPr>
           </w:pPr>
-          <w:hyperlink w:anchor="_Toc244067183" w:history="1">
+          <w:hyperlink w:anchor="_Toc244067502" w:history="1">
             <w:r>
               <w:rPr>
                 <w:rStyle w:val="Lienhypertexte"/>
@@ -2424,7 +2424,7 @@
                 <w:noProof/>
                 <w:webHidden/>
               </w:rPr>
-              <w:instrText xml:space="preserve"> PAGEREF _Toc244067183 \h </w:instrText>
+              <w:instrText xml:space="preserve"> PAGEREF _Toc244067502 \h </w:instrText>
             </w:r>
             <w:r>
               <w:rPr>
@@ -2467,7 +2467,7 @@
               <w:lang w:eastAsia="fr-CH"/>
             </w:rPr>
           </w:pPr>
-          <w:hyperlink w:anchor="_Toc244067184" w:history="1">
+          <w:hyperlink w:anchor="_Toc244067503" w:history="1">
             <w:r>
               <w:rPr>
                 <w:rStyle w:val="Lienhypertexte"/>
@@ -2476,7 +2476,7 @@
                 <w:bCs/>
                 <w:noProof/>
               </w:rPr>
-              <w:t>3.1.6 Cardinalités</w:t>
+              <w:t>3.1.6 Cardinalité</w:t>
             </w:r>
             <w:r>
               <w:rPr>
@@ -2497,7 +2497,7 @@
                 <w:noProof/>
                 <w:webHidden/>
               </w:rPr>
-              <w:instrText xml:space="preserve"> PAGEREF _Toc244067184 \h </w:instrText>
+              <w:instrText xml:space="preserve"> PAGEREF _Toc244067503 \h </w:instrText>
             </w:r>
             <w:r>
               <w:rPr>
@@ -2518,6 +2518,152 @@
                 <w:webHidden/>
               </w:rPr>
               <w:t>8</w:t>
+            </w:r>
+            <w:r>
+              <w:rPr>
+                <w:noProof/>
+                <w:webHidden/>
+              </w:rPr>
+              <w:fldChar w:fldCharType="end"/>
+            </w:r>
+          </w:hyperlink>
+        </w:p>
+        <w:p>
+          <w:pPr>
+            <w:pStyle w:val="TM3"/>
+            <w:tabs>
+              <w:tab w:val="right" w:leader="underscore" w:pos="9062"/>
+            </w:tabs>
+            <w:rPr>
+              <w:rFonts w:eastAsiaTheme="minorEastAsia"/>
+              <w:noProof/>
+              <w:lang w:eastAsia="fr-CH"/>
+            </w:rPr>
+          </w:pPr>
+          <w:hyperlink w:anchor="_Toc244067504" w:history="1">
+            <w:r>
+              <w:rPr>
+                <w:rStyle w:val="Lienhypertexte"/>
+                <w:rFonts w:ascii="Calibri" w:hAnsi="Calibri" w:cs="Calibri"/>
+                <w:b/>
+                <w:bCs/>
+                <w:noProof/>
+              </w:rPr>
+              <w:t>3.1.7 MCD</w:t>
+            </w:r>
+            <w:r>
+              <w:rPr>
+                <w:noProof/>
+                <w:webHidden/>
+              </w:rPr>
+              <w:tab/>
+            </w:r>
+            <w:r>
+              <w:rPr>
+                <w:noProof/>
+                <w:webHidden/>
+              </w:rPr>
+              <w:fldChar w:fldCharType="begin"/>
+            </w:r>
+            <w:r>
+              <w:rPr>
+                <w:noProof/>
+                <w:webHidden/>
+              </w:rPr>
+              <w:instrText xml:space="preserve"> PAGEREF _Toc244067504 \h </w:instrText>
+            </w:r>
+            <w:r>
+              <w:rPr>
+                <w:noProof/>
+                <w:webHidden/>
+              </w:rPr>
+            </w:r>
+            <w:r>
+              <w:rPr>
+                <w:noProof/>
+                <w:webHidden/>
+              </w:rPr>
+              <w:fldChar w:fldCharType="separate"/>
+            </w:r>
+            <w:r>
+              <w:rPr>
+                <w:noProof/>
+                <w:webHidden/>
+              </w:rPr>
+              <w:t>9</w:t>
+            </w:r>
+            <w:r>
+              <w:rPr>
+                <w:noProof/>
+                <w:webHidden/>
+              </w:rPr>
+              <w:fldChar w:fldCharType="end"/>
+            </w:r>
+          </w:hyperlink>
+        </w:p>
+        <w:p>
+          <w:pPr>
+            <w:pStyle w:val="TM3"/>
+            <w:tabs>
+              <w:tab w:val="right" w:leader="underscore" w:pos="9062"/>
+            </w:tabs>
+            <w:rPr>
+              <w:rFonts w:eastAsiaTheme="minorEastAsia"/>
+              <w:noProof/>
+              <w:lang w:eastAsia="fr-CH"/>
+            </w:rPr>
+          </w:pPr>
+          <w:hyperlink w:anchor="_Toc244067505" w:history="1">
+            <w:r>
+              <w:rPr>
+                <w:rStyle w:val="Lienhypertexte"/>
+                <w:rFonts w:ascii="Calibri" w:hAnsi="Calibri" w:cs="Calibri"/>
+                <w:b/>
+                <w:bCs/>
+                <w:noProof/>
+              </w:rPr>
+              <w:t>3.1.8 MLD</w:t>
+            </w:r>
+            <w:r>
+              <w:rPr>
+                <w:noProof/>
+                <w:webHidden/>
+              </w:rPr>
+              <w:tab/>
+            </w:r>
+            <w:r>
+              <w:rPr>
+                <w:noProof/>
+                <w:webHidden/>
+              </w:rPr>
+              <w:fldChar w:fldCharType="begin"/>
+            </w:r>
+            <w:r>
+              <w:rPr>
+                <w:noProof/>
+                <w:webHidden/>
+              </w:rPr>
+              <w:instrText xml:space="preserve"> PAGEREF _Toc244067505 \h </w:instrText>
+            </w:r>
+            <w:r>
+              <w:rPr>
+                <w:noProof/>
+                <w:webHidden/>
+              </w:rPr>
+            </w:r>
+            <w:r>
+              <w:rPr>
+                <w:noProof/>
+                <w:webHidden/>
+              </w:rPr>
+              <w:fldChar w:fldCharType="separate"/>
+            </w:r>
+            <w:r>
+              <w:rPr>
+                <w:noProof/>
+                <w:webHidden/>
+              </w:rPr>
+              <w:t>9</w:t>
             </w:r>
             <w:r>
               <w:rPr>
@@ -2540,7 +2686,7 @@
               <w:lang w:eastAsia="fr-CH"/>
             </w:rPr>
           </w:pPr>
-          <w:hyperlink w:anchor="_Toc244067185" w:history="1">
+          <w:hyperlink w:anchor="_Toc244067506" w:history="1">
             <w:r>
               <w:rPr>
                 <w:rStyle w:val="Lienhypertexte"/>
@@ -2570,7 +2716,7 @@
                 <w:noProof/>
                 <w:webHidden/>
               </w:rPr>
-              <w:instrText xml:space="preserve"> PAGEREF _Toc244067185 \h </w:instrText>
+              <w:instrText xml:space="preserve"> PAGEREF _Toc244067506 \h </w:instrText>
             </w:r>
             <w:r>
               <w:rPr>
@@ -2613,7 +2759,7 @@
               <w:lang w:eastAsia="fr-CH"/>
             </w:rPr>
           </w:pPr>
-          <w:hyperlink w:anchor="_Toc244067186" w:history="1">
+          <w:hyperlink w:anchor="_Toc244067507" w:history="1">
             <w:r>
               <w:rPr>
                 <w:rStyle w:val="Lienhypertexte"/>
@@ -2643,7 +2789,7 @@
                 <w:noProof/>
                 <w:webHidden/>
               </w:rPr>
-              <w:instrText xml:space="preserve"> PAGEREF _Toc244067186 \h </w:instrText>
+              <w:instrText xml:space="preserve"> PAGEREF _Toc244067507 \h </w:instrText>
             </w:r>
             <w:r>
               <w:rPr>
@@ -2686,7 +2832,7 @@
               <w:lang w:eastAsia="fr-CH"/>
             </w:rPr>
           </w:pPr>
-          <w:hyperlink w:anchor="_Toc244067187" w:history="1">
+          <w:hyperlink w:anchor="_Toc244067508" w:history="1">
             <w:r>
               <w:rPr>
                 <w:rStyle w:val="Lienhypertexte"/>
@@ -2716,7 +2862,7 @@
                 <w:noProof/>
                 <w:webHidden/>
               </w:rPr>
-              <w:instrText xml:space="preserve"> PAGEREF _Toc244067187 \h </w:instrText>
+              <w:instrText xml:space="preserve"> PAGEREF _Toc244067508 \h </w:instrText>
             </w:r>
             <w:r>
               <w:rPr>
@@ -2759,7 +2905,7 @@
               <w:lang w:eastAsia="fr-CH"/>
             </w:rPr>
           </w:pPr>
-          <w:hyperlink w:anchor="_Toc244067188" w:history="1">
+          <w:hyperlink w:anchor="_Toc244067509" w:history="1">
             <w:r>
               <w:rPr>
                 <w:rStyle w:val="Lienhypertexte"/>
@@ -2789,7 +2935,7 @@
                 <w:noProof/>
                 <w:webHidden/>
               </w:rPr>
-              <w:instrText xml:space="preserve"> PAGEREF _Toc244067188 \h </w:instrText>
+              <w:instrText xml:space="preserve"> PAGEREF _Toc244067509 \h </w:instrText>
             </w:r>
             <w:r>
               <w:rPr>
@@ -2832,7 +2978,7 @@
               <w:lang w:eastAsia="fr-CH"/>
             </w:rPr>
           </w:pPr>
-          <w:hyperlink w:anchor="_Toc244067189" w:history="1">
+          <w:hyperlink w:anchor="_Toc244067510" w:history="1">
             <w:r>
               <w:rPr>
                 <w:rStyle w:val="Lienhypertexte"/>
@@ -2862,7 +3008,7 @@
                 <w:noProof/>
                 <w:webHidden/>
               </w:rPr>
-              <w:instrText xml:space="preserve"> PAGEREF _Toc244067189 \h </w:instrText>
+              <w:instrText xml:space="preserve"> PAGEREF _Toc244067510 \h </w:instrText>
             </w:r>
             <w:r>
               <w:rPr>
@@ -2905,7 +3051,7 @@
               <w:lang w:eastAsia="fr-CH"/>
             </w:rPr>
           </w:pPr>
-          <w:hyperlink w:anchor="_Toc244067190" w:history="1">
+          <w:hyperlink w:anchor="_Toc244067511" w:history="1">
             <w:r>
               <w:rPr>
                 <w:rStyle w:val="Lienhypertexte"/>
@@ -2935,7 +3081,7 @@
                 <w:noProof/>
                 <w:webHidden/>
               </w:rPr>
-              <w:instrText xml:space="preserve"> PAGEREF _Toc244067190 \h </w:instrText>
+              <w:instrText xml:space="preserve"> PAGEREF _Toc244067511 \h </w:instrText>
             </w:r>
             <w:r>
               <w:rPr>
@@ -2976,7 +3122,7 @@
               <w:lang w:eastAsia="fr-CH"/>
             </w:rPr>
           </w:pPr>
-          <w:hyperlink w:anchor="_Toc244067191" w:history="1">
+          <w:hyperlink w:anchor="_Toc244067512" w:history="1">
             <w:r>
               <w:rPr>
                 <w:rStyle w:val="Lienhypertexte"/>
@@ -3000,7 +3146,7 @@
               <w:rPr>
                 <w:webHidden/>
               </w:rPr>
-              <w:instrText xml:space="preserve"> PAGEREF _Toc244067191 \h </w:instrText>
+              <w:instrText xml:space="preserve"> PAGEREF _Toc244067512 \h </w:instrText>
             </w:r>
             <w:r>
               <w:rPr>
@@ -3037,7 +3183,7 @@
               <w:lang w:eastAsia="fr-CH"/>
             </w:rPr>
           </w:pPr>
-          <w:hyperlink w:anchor="_Toc244067192" w:history="1">
+          <w:hyperlink w:anchor="_Toc244067513" w:history="1">
             <w:r>
               <w:rPr>
                 <w:rStyle w:val="Lienhypertexte"/>
@@ -3061,7 +3207,7 @@
               <w:rPr>
                 <w:webHidden/>
               </w:rPr>
-              <w:instrText xml:space="preserve"> PAGEREF _Toc244067192 \h </w:instrText>
+              <w:instrText xml:space="preserve"> PAGEREF _Toc244067513 \h </w:instrText>
             </w:r>
             <w:r>
               <w:rPr>
@@ -3098,7 +3244,7 @@
               <w:lang w:eastAsia="fr-CH"/>
             </w:rPr>
           </w:pPr>
-          <w:hyperlink w:anchor="_Toc244067193" w:history="1">
+          <w:hyperlink w:anchor="_Toc244067514" w:history="1">
             <w:r>
               <w:rPr>
                 <w:rStyle w:val="Lienhypertexte"/>
@@ -3122,7 +3268,7 @@
               <w:rPr>
                 <w:webHidden/>
               </w:rPr>
-              <w:instrText xml:space="preserve"> PAGEREF _Toc244067193 \h </w:instrText>
+              <w:instrText xml:space="preserve"> PAGEREF _Toc244067514 \h </w:instrText>
             </w:r>
             <w:r>
               <w:rPr>
@@ -3159,7 +3305,7 @@
               <w:lang w:eastAsia="fr-CH"/>
             </w:rPr>
           </w:pPr>
-          <w:hyperlink w:anchor="_Toc244067194" w:history="1">
+          <w:hyperlink w:anchor="_Toc244067515" w:history="1">
             <w:r>
               <w:rPr>
                 <w:rStyle w:val="Lienhypertexte"/>
@@ -3183,7 +3329,7 @@
               <w:rPr>
                 <w:webHidden/>
               </w:rPr>
-              <w:instrText xml:space="preserve"> PAGEREF _Toc244067194 \h </w:instrText>
+              <w:instrText xml:space="preserve"> PAGEREF _Toc244067515 \h </w:instrText>
             </w:r>
             <w:r>
               <w:rPr>
@@ -3327,7 +3473,7 @@
           <w:bCs/>
         </w:rPr>
       </w:pPr>
-      <w:bookmarkStart w:id="0" w:name="_Toc244067175"/>
+      <w:bookmarkStart w:id="0" w:name="_Toc244067494"/>
       <w:r>
         <w:rPr>
           <w:rFonts w:ascii="Calibri" w:hAnsi="Calibri" w:cs="Calibri"/>
@@ -3394,7 +3540,7 @@
           <w:bCs/>
         </w:rPr>
       </w:pPr>
-      <w:bookmarkStart w:id="1" w:name="_Toc244067176"/>
+      <w:bookmarkStart w:id="1" w:name="_Toc244067495"/>
       <w:r>
         <w:rPr>
           <w:rFonts w:ascii="Calibri" w:hAnsi="Calibri" w:cs="Calibri"/>
@@ -3425,7 +3571,21 @@
         <w:rPr>
           <w:rFonts w:ascii="Calibri" w:hAnsi="Calibri" w:cs="Calibri"/>
         </w:rPr>
-        <w:t>L’aéroport international SkyConnect repose sur une infrastructure complexe qui permet d’assurer un suivi rigoureux des vols et des passagers. Pour garantir une gestion fluide des opérations, un système de gestion de bases de données a été conçu. Ce système repose sur</w:t>
+        <w:t xml:space="preserve">L’aéroport international </w:t>
+      </w:r>
+      <w:proofErr w:type="spellStart"/>
+      <w:r>
+        <w:rPr>
+          <w:rFonts w:ascii="Calibri" w:hAnsi="Calibri" w:cs="Calibri"/>
+        </w:rPr>
+        <w:t>SkyConnect</w:t>
+      </w:r>
+      <w:proofErr w:type="spellEnd"/>
+      <w:r>
+        <w:rPr>
+          <w:rFonts w:ascii="Calibri" w:hAnsi="Calibri" w:cs="Calibri"/>
+        </w:rPr>
+        <w:t xml:space="preserve"> repose sur une infrastructure complexe qui permet d’assurer un suivi rigoureux des vols et des passagers. Pour garantir une gestion fluide des opérations, un système de gestion de bases de données a été conçu. Ce système repose sur</w:t>
       </w:r>
       <w:r>
         <w:rPr>
@@ -4113,6 +4273,7 @@
         </w:rPr>
         <w:t xml:space="preserve">L’interconnexion entre ces différentes entités assure une gestion fluide et efficace du trafic aérien. En utilisant ce modèle, l’aéroport </w:t>
       </w:r>
+      <w:proofErr w:type="spellStart"/>
       <w:r>
         <w:rPr>
           <w:rFonts w:ascii="Calibri" w:hAnsi="Calibri" w:cs="Calibri"/>
@@ -4121,6 +4282,7 @@
         </w:rPr>
         <w:t>SkyConnect</w:t>
       </w:r>
+      <w:proofErr w:type="spellEnd"/>
       <w:r>
         <w:rPr>
           <w:rFonts w:ascii="Calibri" w:hAnsi="Calibri" w:cs="Calibri"/>
@@ -4161,7 +4323,7 @@
           <w:bCs/>
         </w:rPr>
       </w:pPr>
-      <w:bookmarkStart w:id="2" w:name="_Toc244067177"/>
+      <w:bookmarkStart w:id="2" w:name="_Toc244067496"/>
       <w:r>
         <w:rPr>
           <w:rFonts w:ascii="Calibri" w:hAnsi="Calibri" w:cs="Calibri"/>
@@ -4192,7 +4354,7 @@
           <w:szCs w:val="36"/>
         </w:rPr>
       </w:pPr>
-      <w:bookmarkStart w:id="3" w:name="_Toc244067178"/>
+      <w:bookmarkStart w:id="3" w:name="_Toc244067497"/>
       <w:r>
         <w:rPr>
           <w:rFonts w:ascii="Calibri" w:hAnsi="Calibri" w:cs="Calibri"/>
@@ -4217,7 +4379,7 @@
           <w:szCs w:val="32"/>
         </w:rPr>
       </w:pPr>
-      <w:bookmarkStart w:id="4" w:name="_Toc244067179"/>
+      <w:bookmarkStart w:id="4" w:name="_Toc244067498"/>
       <w:r>
         <w:rPr>
           <w:rFonts w:ascii="Calibri" w:hAnsi="Calibri" w:cs="Calibri"/>
@@ -4267,7 +4429,7 @@
           <w:szCs w:val="32"/>
         </w:rPr>
       </w:pPr>
-      <w:bookmarkStart w:id="5" w:name="_Toc244067180"/>
+      <w:bookmarkStart w:id="5" w:name="_Toc244067499"/>
       <w:r>
         <w:rPr>
           <w:rFonts w:ascii="Calibri" w:hAnsi="Calibri" w:cs="Calibri"/>
@@ -4285,7 +4447,15 @@
         <w:ind w:left="284"/>
       </w:pPr>
       <w:r>
-        <w:t xml:space="preserve">Pour comprendre ce que la méthode MERISE et quelles sont les étapes de construction d’un MCD, j’ai utilisé ChatGPT ce qui m’a permis de bien comprendre cette méthode et de l’utiliser. </w:t>
+        <w:t xml:space="preserve">Pour comprendre ce que la méthode MERISE et quelles sont les étapes de construction d’un MCD, j’ai utilisé </w:t>
+      </w:r>
+      <w:proofErr w:type="spellStart"/>
+      <w:r>
+        <w:t>ChatGPT</w:t>
+      </w:r>
+      <w:proofErr w:type="spellEnd"/>
+      <w:r>
+        <w:t xml:space="preserve"> ce qui m’a permis de bien comprendre cette méthode et de l’utiliser. </w:t>
       </w:r>
     </w:p>
     <w:p>
@@ -4313,7 +4483,15 @@
         <w:ind w:left="284"/>
       </w:pPr>
       <w:r>
-        <w:t xml:space="preserve">Prompt ChatGPT : </w:t>
+        <w:t xml:space="preserve">Prompt </w:t>
+      </w:r>
+      <w:proofErr w:type="spellStart"/>
+      <w:r>
+        <w:t>ChatGPT</w:t>
+      </w:r>
+      <w:proofErr w:type="spellEnd"/>
+      <w:r>
+        <w:t xml:space="preserve"> : </w:t>
       </w:r>
     </w:p>
     <w:p>
@@ -4498,7 +4676,7 @@
       <w:r>
         <w:br w:type="page"/>
       </w:r>
-      <w:bookmarkStart w:id="6" w:name="_Toc244067181"/>
+      <w:bookmarkStart w:id="6" w:name="_Toc244067500"/>
       <w:r>
         <w:rPr>
           <w:rFonts w:ascii="Calibri" w:hAnsi="Calibri" w:cs="Calibri"/>
@@ -4961,7 +5139,7 @@
           <w:szCs w:val="32"/>
         </w:rPr>
       </w:pPr>
-      <w:bookmarkStart w:id="7" w:name="_Toc244067182"/>
+      <w:bookmarkStart w:id="7" w:name="_Toc244067501"/>
       <w:r>
         <w:rPr>
           <w:rFonts w:ascii="Calibri" w:hAnsi="Calibri" w:cs="Calibri"/>
@@ -5070,12 +5248,22 @@
                 <w:rFonts w:ascii="Calibri" w:hAnsi="Calibri" w:cs="Calibri"/>
               </w:rPr>
             </w:pPr>
-            <w:r>
-              <w:rPr>
-                <w:rFonts w:ascii="Calibri" w:hAnsi="Calibri" w:cs="Calibri"/>
-              </w:rPr>
-              <w:t>aeroport_id</w:t>
-            </w:r>
+            <w:proofErr w:type="spellStart"/>
+            <w:proofErr w:type="gramStart"/>
+            <w:r>
+              <w:rPr>
+                <w:rFonts w:ascii="Calibri" w:hAnsi="Calibri" w:cs="Calibri"/>
+              </w:rPr>
+              <w:t>aeroport</w:t>
+            </w:r>
+            <w:proofErr w:type="gramEnd"/>
+            <w:r>
+              <w:rPr>
+                <w:rFonts w:ascii="Calibri" w:hAnsi="Calibri" w:cs="Calibri"/>
+              </w:rPr>
+              <w:t>_id</w:t>
+            </w:r>
+            <w:proofErr w:type="spellEnd"/>
           </w:p>
         </w:tc>
         <w:tc>
@@ -5129,12 +5317,22 @@
                 <w:rFonts w:ascii="Calibri" w:hAnsi="Calibri" w:cs="Calibri"/>
               </w:rPr>
             </w:pPr>
-            <w:r>
-              <w:rPr>
-                <w:rFonts w:ascii="Calibri" w:hAnsi="Calibri" w:cs="Calibri"/>
-              </w:rPr>
-              <w:t>aeroport_nom</w:t>
-            </w:r>
+            <w:proofErr w:type="spellStart"/>
+            <w:proofErr w:type="gramStart"/>
+            <w:r>
+              <w:rPr>
+                <w:rFonts w:ascii="Calibri" w:hAnsi="Calibri" w:cs="Calibri"/>
+              </w:rPr>
+              <w:t>aeroport</w:t>
+            </w:r>
+            <w:proofErr w:type="gramEnd"/>
+            <w:r>
+              <w:rPr>
+                <w:rFonts w:ascii="Calibri" w:hAnsi="Calibri" w:cs="Calibri"/>
+              </w:rPr>
+              <w:t>_nom</w:t>
+            </w:r>
+            <w:proofErr w:type="spellEnd"/>
           </w:p>
         </w:tc>
         <w:tc>
@@ -5188,12 +5386,22 @@
                 <w:rFonts w:ascii="Calibri" w:hAnsi="Calibri" w:cs="Calibri"/>
               </w:rPr>
             </w:pPr>
-            <w:r>
-              <w:rPr>
-                <w:rFonts w:ascii="Calibri" w:hAnsi="Calibri" w:cs="Calibri"/>
-              </w:rPr>
-              <w:t>aeroport_code_iata</w:t>
-            </w:r>
+            <w:proofErr w:type="spellStart"/>
+            <w:proofErr w:type="gramStart"/>
+            <w:r>
+              <w:rPr>
+                <w:rFonts w:ascii="Calibri" w:hAnsi="Calibri" w:cs="Calibri"/>
+              </w:rPr>
+              <w:t>aeroport</w:t>
+            </w:r>
+            <w:proofErr w:type="gramEnd"/>
+            <w:r>
+              <w:rPr>
+                <w:rFonts w:ascii="Calibri" w:hAnsi="Calibri" w:cs="Calibri"/>
+              </w:rPr>
+              <w:t>_code_iata</w:t>
+            </w:r>
+            <w:proofErr w:type="spellEnd"/>
           </w:p>
         </w:tc>
         <w:tc>
@@ -5247,12 +5455,22 @@
                 <w:rFonts w:ascii="Calibri" w:hAnsi="Calibri" w:cs="Calibri"/>
               </w:rPr>
             </w:pPr>
-            <w:r>
-              <w:rPr>
-                <w:rFonts w:ascii="Calibri" w:hAnsi="Calibri" w:cs="Calibri"/>
-              </w:rPr>
-              <w:t>aeroport_code_icao</w:t>
-            </w:r>
+            <w:proofErr w:type="spellStart"/>
+            <w:proofErr w:type="gramStart"/>
+            <w:r>
+              <w:rPr>
+                <w:rFonts w:ascii="Calibri" w:hAnsi="Calibri" w:cs="Calibri"/>
+              </w:rPr>
+              <w:t>aeroport</w:t>
+            </w:r>
+            <w:proofErr w:type="gramEnd"/>
+            <w:r>
+              <w:rPr>
+                <w:rFonts w:ascii="Calibri" w:hAnsi="Calibri" w:cs="Calibri"/>
+              </w:rPr>
+              <w:t>_code_icao</w:t>
+            </w:r>
+            <w:proofErr w:type="spellEnd"/>
           </w:p>
         </w:tc>
         <w:tc>
@@ -5383,12 +5601,22 @@
                 <w:rFonts w:ascii="Calibri" w:hAnsi="Calibri" w:cs="Calibri"/>
               </w:rPr>
             </w:pPr>
-            <w:r>
-              <w:rPr>
-                <w:rFonts w:ascii="Calibri" w:hAnsi="Calibri" w:cs="Calibri"/>
-              </w:rPr>
-              <w:t>compagnie_id</w:t>
-            </w:r>
+            <w:proofErr w:type="spellStart"/>
+            <w:proofErr w:type="gramStart"/>
+            <w:r>
+              <w:rPr>
+                <w:rFonts w:ascii="Calibri" w:hAnsi="Calibri" w:cs="Calibri"/>
+              </w:rPr>
+              <w:t>compagnie</w:t>
+            </w:r>
+            <w:proofErr w:type="gramEnd"/>
+            <w:r>
+              <w:rPr>
+                <w:rFonts w:ascii="Calibri" w:hAnsi="Calibri" w:cs="Calibri"/>
+              </w:rPr>
+              <w:t>_id</w:t>
+            </w:r>
+            <w:proofErr w:type="spellEnd"/>
           </w:p>
         </w:tc>
         <w:tc>
@@ -5442,12 +5670,22 @@
                 <w:rFonts w:ascii="Calibri" w:hAnsi="Calibri" w:cs="Calibri"/>
               </w:rPr>
             </w:pPr>
-            <w:r>
-              <w:rPr>
-                <w:rFonts w:ascii="Calibri" w:hAnsi="Calibri" w:cs="Calibri"/>
-              </w:rPr>
-              <w:t>compagnie_nom</w:t>
-            </w:r>
+            <w:proofErr w:type="spellStart"/>
+            <w:proofErr w:type="gramStart"/>
+            <w:r>
+              <w:rPr>
+                <w:rFonts w:ascii="Calibri" w:hAnsi="Calibri" w:cs="Calibri"/>
+              </w:rPr>
+              <w:t>compagnie</w:t>
+            </w:r>
+            <w:proofErr w:type="gramEnd"/>
+            <w:r>
+              <w:rPr>
+                <w:rFonts w:ascii="Calibri" w:hAnsi="Calibri" w:cs="Calibri"/>
+              </w:rPr>
+              <w:t>_nom</w:t>
+            </w:r>
+            <w:proofErr w:type="spellEnd"/>
           </w:p>
         </w:tc>
         <w:tc>
@@ -5501,12 +5739,22 @@
                 <w:rFonts w:ascii="Calibri" w:hAnsi="Calibri" w:cs="Calibri"/>
               </w:rPr>
             </w:pPr>
-            <w:r>
-              <w:rPr>
-                <w:rFonts w:ascii="Calibri" w:hAnsi="Calibri" w:cs="Calibri"/>
-              </w:rPr>
-              <w:t>compagnie_code_iata</w:t>
-            </w:r>
+            <w:proofErr w:type="spellStart"/>
+            <w:proofErr w:type="gramStart"/>
+            <w:r>
+              <w:rPr>
+                <w:rFonts w:ascii="Calibri" w:hAnsi="Calibri" w:cs="Calibri"/>
+              </w:rPr>
+              <w:t>compagnie</w:t>
+            </w:r>
+            <w:proofErr w:type="gramEnd"/>
+            <w:r>
+              <w:rPr>
+                <w:rFonts w:ascii="Calibri" w:hAnsi="Calibri" w:cs="Calibri"/>
+              </w:rPr>
+              <w:t>_code_iata</w:t>
+            </w:r>
+            <w:proofErr w:type="spellEnd"/>
           </w:p>
         </w:tc>
         <w:tc>
@@ -5637,12 +5885,22 @@
                 <w:rFonts w:ascii="Calibri" w:hAnsi="Calibri" w:cs="Calibri"/>
               </w:rPr>
             </w:pPr>
-            <w:r>
-              <w:rPr>
-                <w:rFonts w:ascii="Calibri" w:hAnsi="Calibri" w:cs="Calibri"/>
-              </w:rPr>
-              <w:t>avion_id</w:t>
-            </w:r>
+            <w:proofErr w:type="spellStart"/>
+            <w:proofErr w:type="gramStart"/>
+            <w:r>
+              <w:rPr>
+                <w:rFonts w:ascii="Calibri" w:hAnsi="Calibri" w:cs="Calibri"/>
+              </w:rPr>
+              <w:t>avion</w:t>
+            </w:r>
+            <w:proofErr w:type="gramEnd"/>
+            <w:r>
+              <w:rPr>
+                <w:rFonts w:ascii="Calibri" w:hAnsi="Calibri" w:cs="Calibri"/>
+              </w:rPr>
+              <w:t>_id</w:t>
+            </w:r>
+            <w:proofErr w:type="spellEnd"/>
           </w:p>
         </w:tc>
         <w:tc>
@@ -5696,12 +5954,22 @@
                 <w:rFonts w:ascii="Calibri" w:hAnsi="Calibri" w:cs="Calibri"/>
               </w:rPr>
             </w:pPr>
-            <w:r>
-              <w:rPr>
-                <w:rFonts w:ascii="Calibri" w:hAnsi="Calibri" w:cs="Calibri"/>
-              </w:rPr>
-              <w:t>avion_immatriculation</w:t>
-            </w:r>
+            <w:proofErr w:type="spellStart"/>
+            <w:proofErr w:type="gramStart"/>
+            <w:r>
+              <w:rPr>
+                <w:rFonts w:ascii="Calibri" w:hAnsi="Calibri" w:cs="Calibri"/>
+              </w:rPr>
+              <w:t>avion</w:t>
+            </w:r>
+            <w:proofErr w:type="gramEnd"/>
+            <w:r>
+              <w:rPr>
+                <w:rFonts w:ascii="Calibri" w:hAnsi="Calibri" w:cs="Calibri"/>
+              </w:rPr>
+              <w:t>_immatriculation</w:t>
+            </w:r>
+            <w:proofErr w:type="spellEnd"/>
           </w:p>
         </w:tc>
         <w:tc>
@@ -5755,12 +6023,22 @@
                 <w:rFonts w:ascii="Calibri" w:hAnsi="Calibri" w:cs="Calibri"/>
               </w:rPr>
             </w:pPr>
-            <w:r>
-              <w:rPr>
-                <w:rFonts w:ascii="Calibri" w:hAnsi="Calibri" w:cs="Calibri"/>
-              </w:rPr>
-              <w:t>avion_capacite</w:t>
-            </w:r>
+            <w:proofErr w:type="spellStart"/>
+            <w:proofErr w:type="gramStart"/>
+            <w:r>
+              <w:rPr>
+                <w:rFonts w:ascii="Calibri" w:hAnsi="Calibri" w:cs="Calibri"/>
+              </w:rPr>
+              <w:t>avion</w:t>
+            </w:r>
+            <w:proofErr w:type="gramEnd"/>
+            <w:r>
+              <w:rPr>
+                <w:rFonts w:ascii="Calibri" w:hAnsi="Calibri" w:cs="Calibri"/>
+              </w:rPr>
+              <w:t>_capacite</w:t>
+            </w:r>
+            <w:proofErr w:type="spellEnd"/>
           </w:p>
         </w:tc>
         <w:tc>
@@ -5891,12 +6169,22 @@
                 <w:rFonts w:ascii="Calibri" w:hAnsi="Calibri" w:cs="Calibri"/>
               </w:rPr>
             </w:pPr>
-            <w:r>
-              <w:rPr>
-                <w:rFonts w:ascii="Calibri" w:hAnsi="Calibri" w:cs="Calibri"/>
-              </w:rPr>
-              <w:t>type_avion_id</w:t>
-            </w:r>
+            <w:proofErr w:type="spellStart"/>
+            <w:proofErr w:type="gramStart"/>
+            <w:r>
+              <w:rPr>
+                <w:rFonts w:ascii="Calibri" w:hAnsi="Calibri" w:cs="Calibri"/>
+              </w:rPr>
+              <w:t>type</w:t>
+            </w:r>
+            <w:proofErr w:type="gramEnd"/>
+            <w:r>
+              <w:rPr>
+                <w:rFonts w:ascii="Calibri" w:hAnsi="Calibri" w:cs="Calibri"/>
+              </w:rPr>
+              <w:t>_avion_id</w:t>
+            </w:r>
+            <w:proofErr w:type="spellEnd"/>
           </w:p>
         </w:tc>
         <w:tc>
@@ -5950,12 +6238,22 @@
                 <w:rFonts w:ascii="Calibri" w:hAnsi="Calibri" w:cs="Calibri"/>
               </w:rPr>
             </w:pPr>
-            <w:r>
-              <w:rPr>
-                <w:rFonts w:ascii="Calibri" w:hAnsi="Calibri" w:cs="Calibri"/>
-              </w:rPr>
-              <w:t>type_avion_nom</w:t>
-            </w:r>
+            <w:proofErr w:type="spellStart"/>
+            <w:proofErr w:type="gramStart"/>
+            <w:r>
+              <w:rPr>
+                <w:rFonts w:ascii="Calibri" w:hAnsi="Calibri" w:cs="Calibri"/>
+              </w:rPr>
+              <w:t>type</w:t>
+            </w:r>
+            <w:proofErr w:type="gramEnd"/>
+            <w:r>
+              <w:rPr>
+                <w:rFonts w:ascii="Calibri" w:hAnsi="Calibri" w:cs="Calibri"/>
+              </w:rPr>
+              <w:t>_avion_nom</w:t>
+            </w:r>
+            <w:proofErr w:type="spellEnd"/>
           </w:p>
         </w:tc>
         <w:tc>
@@ -6009,12 +6307,22 @@
                 <w:rFonts w:ascii="Calibri" w:hAnsi="Calibri" w:cs="Calibri"/>
               </w:rPr>
             </w:pPr>
-            <w:r>
-              <w:rPr>
-                <w:rFonts w:ascii="Calibri" w:hAnsi="Calibri" w:cs="Calibri"/>
-              </w:rPr>
-              <w:t>type_avion_description</w:t>
-            </w:r>
+            <w:proofErr w:type="spellStart"/>
+            <w:proofErr w:type="gramStart"/>
+            <w:r>
+              <w:rPr>
+                <w:rFonts w:ascii="Calibri" w:hAnsi="Calibri" w:cs="Calibri"/>
+              </w:rPr>
+              <w:t>type</w:t>
+            </w:r>
+            <w:proofErr w:type="gramEnd"/>
+            <w:r>
+              <w:rPr>
+                <w:rFonts w:ascii="Calibri" w:hAnsi="Calibri" w:cs="Calibri"/>
+              </w:rPr>
+              <w:t>_avion_description</w:t>
+            </w:r>
+            <w:proofErr w:type="spellEnd"/>
           </w:p>
         </w:tc>
         <w:tc>
@@ -6145,12 +6453,22 @@
                 <w:rFonts w:ascii="Calibri" w:hAnsi="Calibri" w:cs="Calibri"/>
               </w:rPr>
             </w:pPr>
-            <w:r>
-              <w:rPr>
-                <w:rFonts w:ascii="Calibri" w:hAnsi="Calibri" w:cs="Calibri"/>
-              </w:rPr>
-              <w:t>programme_vol_id</w:t>
-            </w:r>
+            <w:proofErr w:type="spellStart"/>
+            <w:proofErr w:type="gramStart"/>
+            <w:r>
+              <w:rPr>
+                <w:rFonts w:ascii="Calibri" w:hAnsi="Calibri" w:cs="Calibri"/>
+              </w:rPr>
+              <w:t>programme</w:t>
+            </w:r>
+            <w:proofErr w:type="gramEnd"/>
+            <w:r>
+              <w:rPr>
+                <w:rFonts w:ascii="Calibri" w:hAnsi="Calibri" w:cs="Calibri"/>
+              </w:rPr>
+              <w:t>_vol_id</w:t>
+            </w:r>
+            <w:proofErr w:type="spellEnd"/>
           </w:p>
         </w:tc>
         <w:tc>
@@ -6204,12 +6522,22 @@
                 <w:rFonts w:ascii="Calibri" w:hAnsi="Calibri" w:cs="Calibri"/>
               </w:rPr>
             </w:pPr>
-            <w:r>
-              <w:rPr>
-                <w:rFonts w:ascii="Calibri" w:hAnsi="Calibri" w:cs="Calibri"/>
-              </w:rPr>
-              <w:t>vol_numero</w:t>
-            </w:r>
+            <w:proofErr w:type="spellStart"/>
+            <w:proofErr w:type="gramStart"/>
+            <w:r>
+              <w:rPr>
+                <w:rFonts w:ascii="Calibri" w:hAnsi="Calibri" w:cs="Calibri"/>
+              </w:rPr>
+              <w:t>vol</w:t>
+            </w:r>
+            <w:proofErr w:type="gramEnd"/>
+            <w:r>
+              <w:rPr>
+                <w:rFonts w:ascii="Calibri" w:hAnsi="Calibri" w:cs="Calibri"/>
+              </w:rPr>
+              <w:t>_numero</w:t>
+            </w:r>
+            <w:proofErr w:type="spellEnd"/>
           </w:p>
         </w:tc>
         <w:tc>
@@ -6263,12 +6591,22 @@
                 <w:rFonts w:ascii="Calibri" w:hAnsi="Calibri" w:cs="Calibri"/>
               </w:rPr>
             </w:pPr>
-            <w:r>
-              <w:rPr>
-                <w:rFonts w:ascii="Calibri" w:hAnsi="Calibri" w:cs="Calibri"/>
-              </w:rPr>
-              <w:t>programme_heure_depart</w:t>
-            </w:r>
+            <w:proofErr w:type="spellStart"/>
+            <w:proofErr w:type="gramStart"/>
+            <w:r>
+              <w:rPr>
+                <w:rFonts w:ascii="Calibri" w:hAnsi="Calibri" w:cs="Calibri"/>
+              </w:rPr>
+              <w:t>programme</w:t>
+            </w:r>
+            <w:proofErr w:type="gramEnd"/>
+            <w:r>
+              <w:rPr>
+                <w:rFonts w:ascii="Calibri" w:hAnsi="Calibri" w:cs="Calibri"/>
+              </w:rPr>
+              <w:t>_heure_depart</w:t>
+            </w:r>
+            <w:proofErr w:type="spellEnd"/>
           </w:p>
         </w:tc>
         <w:tc>
@@ -6322,12 +6660,22 @@
                 <w:rFonts w:ascii="Calibri" w:hAnsi="Calibri" w:cs="Calibri"/>
               </w:rPr>
             </w:pPr>
-            <w:r>
-              <w:rPr>
-                <w:rFonts w:ascii="Calibri" w:hAnsi="Calibri" w:cs="Calibri"/>
-              </w:rPr>
-              <w:t>programme_heure_arrivee</w:t>
-            </w:r>
+            <w:proofErr w:type="spellStart"/>
+            <w:proofErr w:type="gramStart"/>
+            <w:r>
+              <w:rPr>
+                <w:rFonts w:ascii="Calibri" w:hAnsi="Calibri" w:cs="Calibri"/>
+              </w:rPr>
+              <w:t>programme</w:t>
+            </w:r>
+            <w:proofErr w:type="gramEnd"/>
+            <w:r>
+              <w:rPr>
+                <w:rFonts w:ascii="Calibri" w:hAnsi="Calibri" w:cs="Calibri"/>
+              </w:rPr>
+              <w:t>_heure_arrivee</w:t>
+            </w:r>
+            <w:proofErr w:type="spellEnd"/>
           </w:p>
         </w:tc>
         <w:tc>
@@ -6458,12 +6806,22 @@
                 <w:rFonts w:ascii="Calibri" w:hAnsi="Calibri" w:cs="Calibri"/>
               </w:rPr>
             </w:pPr>
-            <w:r>
-              <w:rPr>
-                <w:rFonts w:ascii="Calibri" w:hAnsi="Calibri" w:cs="Calibri"/>
-              </w:rPr>
-              <w:t>jour_semaine_id</w:t>
-            </w:r>
+            <w:proofErr w:type="spellStart"/>
+            <w:proofErr w:type="gramStart"/>
+            <w:r>
+              <w:rPr>
+                <w:rFonts w:ascii="Calibri" w:hAnsi="Calibri" w:cs="Calibri"/>
+              </w:rPr>
+              <w:t>jour</w:t>
+            </w:r>
+            <w:proofErr w:type="gramEnd"/>
+            <w:r>
+              <w:rPr>
+                <w:rFonts w:ascii="Calibri" w:hAnsi="Calibri" w:cs="Calibri"/>
+              </w:rPr>
+              <w:t>_semaine_id</w:t>
+            </w:r>
+            <w:proofErr w:type="spellEnd"/>
           </w:p>
         </w:tc>
         <w:tc>
@@ -6517,12 +6875,22 @@
                 <w:rFonts w:ascii="Calibri" w:hAnsi="Calibri" w:cs="Calibri"/>
               </w:rPr>
             </w:pPr>
-            <w:r>
-              <w:rPr>
-                <w:rFonts w:ascii="Calibri" w:hAnsi="Calibri" w:cs="Calibri"/>
-              </w:rPr>
-              <w:t>jour_semaine_libelle</w:t>
-            </w:r>
+            <w:proofErr w:type="spellStart"/>
+            <w:proofErr w:type="gramStart"/>
+            <w:r>
+              <w:rPr>
+                <w:rFonts w:ascii="Calibri" w:hAnsi="Calibri" w:cs="Calibri"/>
+              </w:rPr>
+              <w:t>jour</w:t>
+            </w:r>
+            <w:proofErr w:type="gramEnd"/>
+            <w:r>
+              <w:rPr>
+                <w:rFonts w:ascii="Calibri" w:hAnsi="Calibri" w:cs="Calibri"/>
+              </w:rPr>
+              <w:t>_semaine_libelle</w:t>
+            </w:r>
+            <w:proofErr w:type="spellEnd"/>
           </w:p>
         </w:tc>
         <w:tc>
@@ -6653,12 +7021,22 @@
                 <w:rFonts w:ascii="Calibri" w:hAnsi="Calibri" w:cs="Calibri"/>
               </w:rPr>
             </w:pPr>
-            <w:r>
-              <w:rPr>
-                <w:rFonts w:ascii="Calibri" w:hAnsi="Calibri" w:cs="Calibri"/>
-              </w:rPr>
-              <w:t>vol_id</w:t>
-            </w:r>
+            <w:proofErr w:type="spellStart"/>
+            <w:proofErr w:type="gramStart"/>
+            <w:r>
+              <w:rPr>
+                <w:rFonts w:ascii="Calibri" w:hAnsi="Calibri" w:cs="Calibri"/>
+              </w:rPr>
+              <w:t>vol</w:t>
+            </w:r>
+            <w:proofErr w:type="gramEnd"/>
+            <w:r>
+              <w:rPr>
+                <w:rFonts w:ascii="Calibri" w:hAnsi="Calibri" w:cs="Calibri"/>
+              </w:rPr>
+              <w:t>_id</w:t>
+            </w:r>
+            <w:proofErr w:type="spellEnd"/>
           </w:p>
         </w:tc>
         <w:tc>
@@ -6712,12 +7090,22 @@
                 <w:rFonts w:ascii="Calibri" w:hAnsi="Calibri" w:cs="Calibri"/>
               </w:rPr>
             </w:pPr>
-            <w:r>
-              <w:rPr>
-                <w:rFonts w:ascii="Calibri" w:hAnsi="Calibri" w:cs="Calibri"/>
-              </w:rPr>
-              <w:t>vol_date</w:t>
-            </w:r>
+            <w:proofErr w:type="spellStart"/>
+            <w:proofErr w:type="gramStart"/>
+            <w:r>
+              <w:rPr>
+                <w:rFonts w:ascii="Calibri" w:hAnsi="Calibri" w:cs="Calibri"/>
+              </w:rPr>
+              <w:t>vol</w:t>
+            </w:r>
+            <w:proofErr w:type="gramEnd"/>
+            <w:r>
+              <w:rPr>
+                <w:rFonts w:ascii="Calibri" w:hAnsi="Calibri" w:cs="Calibri"/>
+              </w:rPr>
+              <w:t>_date</w:t>
+            </w:r>
+            <w:proofErr w:type="spellEnd"/>
           </w:p>
         </w:tc>
         <w:tc>
@@ -6771,12 +7159,22 @@
                 <w:rFonts w:ascii="Calibri" w:hAnsi="Calibri" w:cs="Calibri"/>
               </w:rPr>
             </w:pPr>
-            <w:r>
-              <w:rPr>
-                <w:rFonts w:ascii="Calibri" w:hAnsi="Calibri" w:cs="Calibri"/>
-              </w:rPr>
-              <w:t>vol_heure_depart</w:t>
-            </w:r>
+            <w:proofErr w:type="spellStart"/>
+            <w:proofErr w:type="gramStart"/>
+            <w:r>
+              <w:rPr>
+                <w:rFonts w:ascii="Calibri" w:hAnsi="Calibri" w:cs="Calibri"/>
+              </w:rPr>
+              <w:t>vol</w:t>
+            </w:r>
+            <w:proofErr w:type="gramEnd"/>
+            <w:r>
+              <w:rPr>
+                <w:rFonts w:ascii="Calibri" w:hAnsi="Calibri" w:cs="Calibri"/>
+              </w:rPr>
+              <w:t>_heure_depart</w:t>
+            </w:r>
+            <w:proofErr w:type="spellEnd"/>
           </w:p>
         </w:tc>
         <w:tc>
@@ -6830,12 +7228,22 @@
                 <w:rFonts w:ascii="Calibri" w:hAnsi="Calibri" w:cs="Calibri"/>
               </w:rPr>
             </w:pPr>
-            <w:r>
-              <w:rPr>
-                <w:rFonts w:ascii="Calibri" w:hAnsi="Calibri" w:cs="Calibri"/>
-              </w:rPr>
-              <w:t>vol_heure_arrivee</w:t>
-            </w:r>
+            <w:proofErr w:type="spellStart"/>
+            <w:proofErr w:type="gramStart"/>
+            <w:r>
+              <w:rPr>
+                <w:rFonts w:ascii="Calibri" w:hAnsi="Calibri" w:cs="Calibri"/>
+              </w:rPr>
+              <w:t>vol</w:t>
+            </w:r>
+            <w:proofErr w:type="gramEnd"/>
+            <w:r>
+              <w:rPr>
+                <w:rFonts w:ascii="Calibri" w:hAnsi="Calibri" w:cs="Calibri"/>
+              </w:rPr>
+              <w:t>_heure_arrivee</w:t>
+            </w:r>
+            <w:proofErr w:type="spellEnd"/>
           </w:p>
         </w:tc>
         <w:tc>
@@ -6966,12 +7374,22 @@
                 <w:rFonts w:ascii="Calibri" w:hAnsi="Calibri" w:cs="Calibri"/>
               </w:rPr>
             </w:pPr>
-            <w:r>
-              <w:rPr>
-                <w:rFonts w:ascii="Calibri" w:hAnsi="Calibri" w:cs="Calibri"/>
-              </w:rPr>
-              <w:t>passager_id</w:t>
-            </w:r>
+            <w:proofErr w:type="spellStart"/>
+            <w:proofErr w:type="gramStart"/>
+            <w:r>
+              <w:rPr>
+                <w:rFonts w:ascii="Calibri" w:hAnsi="Calibri" w:cs="Calibri"/>
+              </w:rPr>
+              <w:t>passager</w:t>
+            </w:r>
+            <w:proofErr w:type="gramEnd"/>
+            <w:r>
+              <w:rPr>
+                <w:rFonts w:ascii="Calibri" w:hAnsi="Calibri" w:cs="Calibri"/>
+              </w:rPr>
+              <w:t>_id</w:t>
+            </w:r>
+            <w:proofErr w:type="spellEnd"/>
           </w:p>
         </w:tc>
         <w:tc>
@@ -7025,12 +7443,22 @@
                 <w:rFonts w:ascii="Calibri" w:hAnsi="Calibri" w:cs="Calibri"/>
               </w:rPr>
             </w:pPr>
-            <w:r>
-              <w:rPr>
-                <w:rFonts w:ascii="Calibri" w:hAnsi="Calibri" w:cs="Calibri"/>
-              </w:rPr>
-              <w:t>passager_numero_passeport</w:t>
-            </w:r>
+            <w:proofErr w:type="spellStart"/>
+            <w:proofErr w:type="gramStart"/>
+            <w:r>
+              <w:rPr>
+                <w:rFonts w:ascii="Calibri" w:hAnsi="Calibri" w:cs="Calibri"/>
+              </w:rPr>
+              <w:t>passager</w:t>
+            </w:r>
+            <w:proofErr w:type="gramEnd"/>
+            <w:r>
+              <w:rPr>
+                <w:rFonts w:ascii="Calibri" w:hAnsi="Calibri" w:cs="Calibri"/>
+              </w:rPr>
+              <w:t>_numero_passeport</w:t>
+            </w:r>
+            <w:proofErr w:type="spellEnd"/>
           </w:p>
         </w:tc>
         <w:tc>
@@ -7084,12 +7512,22 @@
                 <w:rFonts w:ascii="Calibri" w:hAnsi="Calibri" w:cs="Calibri"/>
               </w:rPr>
             </w:pPr>
-            <w:r>
-              <w:rPr>
-                <w:rFonts w:ascii="Calibri" w:hAnsi="Calibri" w:cs="Calibri"/>
-              </w:rPr>
-              <w:t>passager_nom</w:t>
-            </w:r>
+            <w:proofErr w:type="spellStart"/>
+            <w:proofErr w:type="gramStart"/>
+            <w:r>
+              <w:rPr>
+                <w:rFonts w:ascii="Calibri" w:hAnsi="Calibri" w:cs="Calibri"/>
+              </w:rPr>
+              <w:t>passager</w:t>
+            </w:r>
+            <w:proofErr w:type="gramEnd"/>
+            <w:r>
+              <w:rPr>
+                <w:rFonts w:ascii="Calibri" w:hAnsi="Calibri" w:cs="Calibri"/>
+              </w:rPr>
+              <w:t>_nom</w:t>
+            </w:r>
+            <w:proofErr w:type="spellEnd"/>
           </w:p>
         </w:tc>
         <w:tc>
@@ -7143,12 +7581,22 @@
                 <w:rFonts w:ascii="Calibri" w:hAnsi="Calibri" w:cs="Calibri"/>
               </w:rPr>
             </w:pPr>
-            <w:r>
-              <w:rPr>
-                <w:rFonts w:ascii="Calibri" w:hAnsi="Calibri" w:cs="Calibri"/>
-              </w:rPr>
-              <w:t>passager_prenom</w:t>
-            </w:r>
+            <w:proofErr w:type="spellStart"/>
+            <w:proofErr w:type="gramStart"/>
+            <w:r>
+              <w:rPr>
+                <w:rFonts w:ascii="Calibri" w:hAnsi="Calibri" w:cs="Calibri"/>
+              </w:rPr>
+              <w:t>passager</w:t>
+            </w:r>
+            <w:proofErr w:type="gramEnd"/>
+            <w:r>
+              <w:rPr>
+                <w:rFonts w:ascii="Calibri" w:hAnsi="Calibri" w:cs="Calibri"/>
+              </w:rPr>
+              <w:t>_prenom</w:t>
+            </w:r>
+            <w:proofErr w:type="spellEnd"/>
           </w:p>
         </w:tc>
         <w:tc>
@@ -7279,12 +7727,22 @@
                 <w:rFonts w:ascii="Calibri" w:hAnsi="Calibri" w:cs="Calibri"/>
               </w:rPr>
             </w:pPr>
-            <w:r>
-              <w:rPr>
-                <w:rFonts w:ascii="Calibri" w:hAnsi="Calibri" w:cs="Calibri"/>
-              </w:rPr>
-              <w:t>reservation_id</w:t>
-            </w:r>
+            <w:proofErr w:type="spellStart"/>
+            <w:proofErr w:type="gramStart"/>
+            <w:r>
+              <w:rPr>
+                <w:rFonts w:ascii="Calibri" w:hAnsi="Calibri" w:cs="Calibri"/>
+              </w:rPr>
+              <w:t>reservation</w:t>
+            </w:r>
+            <w:proofErr w:type="gramEnd"/>
+            <w:r>
+              <w:rPr>
+                <w:rFonts w:ascii="Calibri" w:hAnsi="Calibri" w:cs="Calibri"/>
+              </w:rPr>
+              <w:t>_id</w:t>
+            </w:r>
+            <w:proofErr w:type="spellEnd"/>
           </w:p>
         </w:tc>
         <w:tc>
@@ -7338,12 +7796,22 @@
                 <w:rFonts w:ascii="Calibri" w:hAnsi="Calibri" w:cs="Calibri"/>
               </w:rPr>
             </w:pPr>
-            <w:r>
-              <w:rPr>
-                <w:rFonts w:ascii="Calibri" w:hAnsi="Calibri" w:cs="Calibri"/>
-              </w:rPr>
-              <w:t>reservation_siege</w:t>
-            </w:r>
+            <w:proofErr w:type="spellStart"/>
+            <w:proofErr w:type="gramStart"/>
+            <w:r>
+              <w:rPr>
+                <w:rFonts w:ascii="Calibri" w:hAnsi="Calibri" w:cs="Calibri"/>
+              </w:rPr>
+              <w:t>reservation</w:t>
+            </w:r>
+            <w:proofErr w:type="gramEnd"/>
+            <w:r>
+              <w:rPr>
+                <w:rFonts w:ascii="Calibri" w:hAnsi="Calibri" w:cs="Calibri"/>
+              </w:rPr>
+              <w:t>_siege</w:t>
+            </w:r>
+            <w:proofErr w:type="spellEnd"/>
           </w:p>
         </w:tc>
         <w:tc>
@@ -7397,12 +7865,22 @@
                 <w:rFonts w:ascii="Calibri" w:hAnsi="Calibri" w:cs="Calibri"/>
               </w:rPr>
             </w:pPr>
-            <w:r>
-              <w:rPr>
-                <w:rFonts w:ascii="Calibri" w:hAnsi="Calibri" w:cs="Calibri"/>
-              </w:rPr>
-              <w:t>reservation_prix</w:t>
-            </w:r>
+            <w:proofErr w:type="spellStart"/>
+            <w:proofErr w:type="gramStart"/>
+            <w:r>
+              <w:rPr>
+                <w:rFonts w:ascii="Calibri" w:hAnsi="Calibri" w:cs="Calibri"/>
+              </w:rPr>
+              <w:t>reservation</w:t>
+            </w:r>
+            <w:proofErr w:type="gramEnd"/>
+            <w:r>
+              <w:rPr>
+                <w:rFonts w:ascii="Calibri" w:hAnsi="Calibri" w:cs="Calibri"/>
+              </w:rPr>
+              <w:t>_prix</w:t>
+            </w:r>
+            <w:proofErr w:type="spellEnd"/>
           </w:p>
         </w:tc>
         <w:tc>
@@ -7458,7 +7936,7 @@
           <w:szCs w:val="32"/>
         </w:rPr>
       </w:pPr>
-      <w:bookmarkStart w:id="8" w:name="_Toc244067183"/>
+      <w:bookmarkStart w:id="8" w:name="_Toc244067502"/>
       <w:r>
         <w:rPr>
           <w:rFonts w:ascii="Calibri" w:hAnsi="Calibri" w:cs="Calibri"/>
@@ -7990,7 +8468,7 @@
           <w:szCs w:val="32"/>
         </w:rPr>
       </w:pPr>
-      <w:bookmarkStart w:id="9" w:name="_Toc244067184"/>
+      <w:bookmarkStart w:id="9" w:name="_Toc244067503"/>
       <w:r>
         <w:rPr>
           <w:rFonts w:ascii="Calibri" w:hAnsi="Calibri" w:cs="Calibri"/>
@@ -9083,6 +9561,7 @@
           <w:szCs w:val="32"/>
         </w:rPr>
       </w:pPr>
+      <w:bookmarkStart w:id="10" w:name="_Toc244067504"/>
       <w:r>
         <w:rPr>
           <w:rFonts w:ascii="Calibri" w:hAnsi="Calibri" w:cs="Calibri"/>
@@ -9094,6 +9573,7 @@
         <w:lastRenderedPageBreak/>
         <w:t>3.1.7 MCD</w:t>
       </w:r>
+      <w:bookmarkEnd w:id="10"/>
     </w:p>
     <w:p>
       <w:pPr>
@@ -9129,6 +9609,7 @@
           <w:szCs w:val="32"/>
         </w:rPr>
       </w:pPr>
+      <w:bookmarkStart w:id="11" w:name="_Toc244067505"/>
       <w:r>
         <w:rPr>
           <w:rFonts w:ascii="Calibri" w:hAnsi="Calibri" w:cs="Calibri"/>
@@ -9139,6 +9620,7 @@
         </w:rPr>
         <w:t>3.1.8 MLD</w:t>
       </w:r>
+      <w:bookmarkEnd w:id="11"/>
     </w:p>
     <w:p>
       <w:r>
@@ -9157,7 +9639,7 @@
           <w:szCs w:val="36"/>
         </w:rPr>
       </w:pPr>
-      <w:bookmarkStart w:id="10" w:name="_Toc244067185"/>
+      <w:bookmarkStart w:id="12" w:name="_Toc244067506"/>
       <w:r>
         <w:rPr>
           <w:rFonts w:ascii="Calibri" w:hAnsi="Calibri" w:cs="Calibri"/>
@@ -9168,7 +9650,7 @@
         </w:rPr>
         <w:t>3.2 Création des tables de la base de données</w:t>
       </w:r>
-      <w:bookmarkEnd w:id="10"/>
+      <w:bookmarkEnd w:id="12"/>
     </w:p>
     <w:p>
       <w:pPr>
@@ -9194,7 +9676,21 @@
         <w:rPr>
           <w:rFonts w:ascii="Calibri" w:hAnsi="Calibri" w:cs="Calibri"/>
         </w:rPr>
-        <w:t xml:space="preserve"> une base de données se nommant « db_aeroport », puis j’y est inséré le code </w:t>
+        <w:t xml:space="preserve"> une base de données se nommant « </w:t>
+      </w:r>
+      <w:proofErr w:type="spellStart"/>
+      <w:r>
+        <w:rPr>
+          <w:rFonts w:ascii="Calibri" w:hAnsi="Calibri" w:cs="Calibri"/>
+        </w:rPr>
+        <w:t>db_aeroport</w:t>
+      </w:r>
+      <w:proofErr w:type="spellEnd"/>
+      <w:r>
+        <w:rPr>
+          <w:rFonts w:ascii="Calibri" w:hAnsi="Calibri" w:cs="Calibri"/>
+        </w:rPr>
+        <w:t xml:space="preserve"> », puis j’y est inséré le code </w:t>
       </w:r>
       <w:r>
         <w:rPr>
@@ -9260,27 +9756,6 @@
     </w:p>
     <w:p>
       <w:pPr>
-        <w:pStyle w:val="Lgende"/>
-        <w:ind w:firstLine="142"/>
-        <w:jc w:val="both"/>
-        <w:rPr>
-          <w:rFonts w:ascii="Calibri" w:hAnsi="Calibri" w:cs="Calibri"/>
-        </w:rPr>
-      </w:pPr>
-      <w:r>
-        <w:t xml:space="preserve">Création de la bdd db_aeroport </w:t>
-      </w:r>
-      <w:fldSimple w:instr=" SEQ Création_de_la_bdd_db_aeroport \* ARABIC ">
-        <w:r>
-          <w:rPr>
-            <w:noProof/>
-          </w:rPr>
-          <w:t>1</w:t>
-        </w:r>
-      </w:fldSimple>
-    </w:p>
-    <w:p>
-      <w:pPr>
         <w:ind w:left="142"/>
         <w:jc w:val="both"/>
         <w:rPr>
@@ -9291,7 +9766,31 @@
         <w:rPr>
           <w:rFonts w:ascii="Calibri" w:hAnsi="Calibri" w:cs="Calibri"/>
         </w:rPr>
-        <w:t>Sur la capture d’écran on peu voir que la base de données à été créer avec succès sans erreur.</w:t>
+        <w:t xml:space="preserve">Sur la capture d’écran on </w:t>
+      </w:r>
+      <w:r>
+        <w:rPr>
+          <w:rFonts w:ascii="Calibri" w:hAnsi="Calibri" w:cs="Calibri"/>
+        </w:rPr>
+        <w:t>peut</w:t>
+      </w:r>
+      <w:r>
+        <w:rPr>
+          <w:rFonts w:ascii="Calibri" w:hAnsi="Calibri" w:cs="Calibri"/>
+        </w:rPr>
+        <w:t xml:space="preserve"> voir que la base de données </w:t>
+      </w:r>
+      <w:r>
+        <w:rPr>
+          <w:rFonts w:ascii="Calibri" w:hAnsi="Calibri" w:cs="Calibri"/>
+        </w:rPr>
+        <w:t>a</w:t>
+      </w:r>
+      <w:r>
+        <w:rPr>
+          <w:rFonts w:ascii="Calibri" w:hAnsi="Calibri" w:cs="Calibri"/>
+        </w:rPr>
+        <w:t xml:space="preserve"> été créer avec succès sans erreur.</w:t>
       </w:r>
     </w:p>
     <w:p>
@@ -9351,27 +9850,6 @@
     </w:p>
     <w:p>
       <w:pPr>
-        <w:pStyle w:val="Lgende"/>
-        <w:ind w:firstLine="142"/>
-        <w:jc w:val="both"/>
-        <w:rPr>
-          <w:rFonts w:ascii="Calibri" w:hAnsi="Calibri" w:cs="Calibri"/>
-        </w:rPr>
-      </w:pPr>
-      <w:r>
-        <w:t xml:space="preserve">Contenu de la bdd db_aeroport </w:t>
-      </w:r>
-      <w:fldSimple w:instr=" SEQ Contenu_de_la_bdd_db_aeroport \* ARABIC ">
-        <w:r>
-          <w:rPr>
-            <w:noProof/>
-          </w:rPr>
-          <w:t>1</w:t>
-        </w:r>
-      </w:fldSimple>
-    </w:p>
-    <w:p>
-      <w:pPr>
         <w:ind w:left="142"/>
         <w:jc w:val="both"/>
         <w:rPr>
@@ -9422,7 +9900,7 @@
           <w:szCs w:val="36"/>
         </w:rPr>
       </w:pPr>
-      <w:bookmarkStart w:id="11" w:name="_Toc244067186"/>
+      <w:bookmarkStart w:id="13" w:name="_Toc244067507"/>
       <w:r>
         <w:rPr>
           <w:rFonts w:ascii="Calibri" w:hAnsi="Calibri" w:cs="Calibri"/>
@@ -9434,7 +9912,7 @@
         <w:lastRenderedPageBreak/>
         <w:t>3.3 Chargement des données</w:t>
       </w:r>
-      <w:bookmarkEnd w:id="11"/>
+      <w:bookmarkEnd w:id="13"/>
     </w:p>
     <w:p>
       <w:pPr>
@@ -9449,7 +9927,159 @@
         <w:rPr>
           <w:rFonts w:ascii="Calibri" w:hAnsi="Calibri" w:cs="Calibri"/>
         </w:rPr>
-        <w:t>Les fichiers TSV sont chargés dans les tables avec les commandes SQL ci-dessous. Un espace est prévu après chaque commande pour ajouter la capture d’écran de son exécution. Les fichiers TSV sont placés dans le dossier « mysql-files », car s’ils ne sont pas dans ce dossier, leur chargement déclenche une erreur liée à « secure_file_priv ». La commande « SHOW VARIABLES LIKE 'secure_file_priv'; » permet de vérifier le dossier autorisé. Dans notre cas, elle renvoie « /var/lib/mysql-files/ ».</w:t>
+        <w:t>Les fichiers TSV sont chargés dans les tables avec l</w:t>
+      </w:r>
+      <w:r>
+        <w:rPr>
+          <w:rFonts w:ascii="Calibri" w:hAnsi="Calibri" w:cs="Calibri"/>
+        </w:rPr>
+        <w:t>e code</w:t>
+      </w:r>
+      <w:r>
+        <w:rPr>
+          <w:rFonts w:ascii="Calibri" w:hAnsi="Calibri" w:cs="Calibri"/>
+        </w:rPr>
+        <w:t xml:space="preserve"> SQL </w:t>
+      </w:r>
+      <w:r>
+        <w:rPr>
+          <w:rFonts w:ascii="Calibri" w:hAnsi="Calibri" w:cs="Calibri"/>
+        </w:rPr>
+        <w:t xml:space="preserve">dans les tableaux </w:t>
+      </w:r>
+      <w:r>
+        <w:rPr>
+          <w:rFonts w:ascii="Calibri" w:hAnsi="Calibri" w:cs="Calibri"/>
+        </w:rPr>
+        <w:t xml:space="preserve">ci-dessous. </w:t>
+      </w:r>
+      <w:r>
+        <w:rPr>
+          <w:rFonts w:ascii="Calibri" w:hAnsi="Calibri" w:cs="Calibri"/>
+        </w:rPr>
+        <w:t xml:space="preserve">En dessous de chaque tableau il y a une </w:t>
+      </w:r>
+      <w:r>
+        <w:rPr>
+          <w:rFonts w:ascii="Calibri" w:hAnsi="Calibri" w:cs="Calibri"/>
+        </w:rPr>
+        <w:t xml:space="preserve">capture d’écran de </w:t>
+      </w:r>
+      <w:r>
+        <w:rPr>
+          <w:rFonts w:ascii="Calibri" w:hAnsi="Calibri" w:cs="Calibri"/>
+        </w:rPr>
+        <w:t>l’exécution du code</w:t>
+      </w:r>
+      <w:r>
+        <w:rPr>
+          <w:rFonts w:ascii="Calibri" w:hAnsi="Calibri" w:cs="Calibri"/>
+        </w:rPr>
+        <w:t xml:space="preserve">. Les fichiers TSV sont placés dans le dossier « </w:t>
+      </w:r>
+      <w:proofErr w:type="spellStart"/>
+      <w:r>
+        <w:rPr>
+          <w:rFonts w:ascii="Calibri" w:hAnsi="Calibri" w:cs="Calibri"/>
+        </w:rPr>
+        <w:t>mysql</w:t>
+      </w:r>
+      <w:proofErr w:type="spellEnd"/>
+      <w:r>
+        <w:rPr>
+          <w:rFonts w:ascii="Calibri" w:hAnsi="Calibri" w:cs="Calibri"/>
+        </w:rPr>
+        <w:t xml:space="preserve">-files », car s’ils ne sont pas dans ce dossier, </w:t>
+      </w:r>
+      <w:r>
+        <w:rPr>
+          <w:rFonts w:ascii="Calibri" w:hAnsi="Calibri" w:cs="Calibri"/>
+        </w:rPr>
+        <w:t>au chargement des fichiers</w:t>
+      </w:r>
+      <w:r>
+        <w:rPr>
+          <w:rFonts w:ascii="Calibri" w:hAnsi="Calibri" w:cs="Calibri"/>
+        </w:rPr>
+        <w:t xml:space="preserve"> </w:t>
+      </w:r>
+      <w:r>
+        <w:rPr>
+          <w:rFonts w:ascii="Calibri" w:hAnsi="Calibri" w:cs="Calibri"/>
+        </w:rPr>
+        <w:t>ça créer</w:t>
+      </w:r>
+      <w:r>
+        <w:rPr>
+          <w:rFonts w:ascii="Calibri" w:hAnsi="Calibri" w:cs="Calibri"/>
+        </w:rPr>
+        <w:t xml:space="preserve"> une erreur liée à « </w:t>
+      </w:r>
+      <w:proofErr w:type="spellStart"/>
+      <w:r>
+        <w:rPr>
+          <w:rFonts w:ascii="Calibri" w:hAnsi="Calibri" w:cs="Calibri"/>
+        </w:rPr>
+        <w:t>secure_file_priv</w:t>
+      </w:r>
+      <w:proofErr w:type="spellEnd"/>
+      <w:r>
+        <w:rPr>
+          <w:rFonts w:ascii="Calibri" w:hAnsi="Calibri" w:cs="Calibri"/>
+        </w:rPr>
+        <w:t xml:space="preserve"> ». La commande « SHOW VARIABLES LIKE '</w:t>
+      </w:r>
+      <w:proofErr w:type="spellStart"/>
+      <w:r>
+        <w:rPr>
+          <w:rFonts w:ascii="Calibri" w:hAnsi="Calibri" w:cs="Calibri"/>
+        </w:rPr>
+        <w:t>secure_file_priv</w:t>
+      </w:r>
+      <w:proofErr w:type="spellEnd"/>
+      <w:r>
+        <w:rPr>
+          <w:rFonts w:ascii="Calibri" w:hAnsi="Calibri" w:cs="Calibri"/>
+        </w:rPr>
+        <w:t xml:space="preserve">'; » permet de vérifier le dossier autorisé. Dans </w:t>
+      </w:r>
+      <w:r>
+        <w:rPr>
+          <w:rFonts w:ascii="Calibri" w:hAnsi="Calibri" w:cs="Calibri"/>
+        </w:rPr>
+        <w:t>mon</w:t>
+      </w:r>
+      <w:r>
+        <w:rPr>
+          <w:rFonts w:ascii="Calibri" w:hAnsi="Calibri" w:cs="Calibri"/>
+        </w:rPr>
+        <w:t xml:space="preserve"> cas, elle renvoie </w:t>
+      </w:r>
+      <w:r>
+        <w:rPr>
+          <w:rFonts w:ascii="Calibri" w:hAnsi="Calibri" w:cs="Calibri"/>
+        </w:rPr>
+        <w:t xml:space="preserve">ce chemin d’accès </w:t>
+      </w:r>
+      <w:r>
+        <w:rPr>
+          <w:rFonts w:ascii="Calibri" w:hAnsi="Calibri" w:cs="Calibri"/>
+        </w:rPr>
+        <w:t>« /var/lib/</w:t>
+      </w:r>
+      <w:proofErr w:type="spellStart"/>
+      <w:r>
+        <w:rPr>
+          <w:rFonts w:ascii="Calibri" w:hAnsi="Calibri" w:cs="Calibri"/>
+        </w:rPr>
+        <w:t>mysql</w:t>
+      </w:r>
+      <w:proofErr w:type="spellEnd"/>
+      <w:r>
+        <w:rPr>
+          <w:rFonts w:ascii="Calibri" w:hAnsi="Calibri" w:cs="Calibri"/>
+        </w:rPr>
+        <w:t>-files/ ».</w:t>
       </w:r>
     </w:p>
     <w:p>
@@ -9524,8 +10154,19 @@
                 <w:color w:val="FFFFFF"/>
                 <w:sz w:val="20"/>
               </w:rPr>
-              <w:t>SQL   /   t_aeroport.tsv</w:t>
-            </w:r>
+              <w:t xml:space="preserve">SQL   /   </w:t>
+            </w:r>
+            <w:proofErr w:type="spellStart"/>
+            <w:r>
+              <w:rPr>
+                <w:rFonts w:ascii="Calibri" w:hAnsi="Calibri"/>
+                <w:b/>
+                <w:color w:val="FFFFFF"/>
+                <w:sz w:val="20"/>
+              </w:rPr>
+              <w:t>t_aeroport.tsv</w:t>
+            </w:r>
+            <w:proofErr w:type="spellEnd"/>
           </w:p>
         </w:tc>
       </w:tr>
@@ -9644,13 +10285,40 @@
                 <w:color w:val="06734E"/>
                 <w:sz w:val="18"/>
               </w:rPr>
-              <w:t>'/var/lib/mysql-files/t</w:t>
-            </w:r>
+              <w:t>'/var/lib/</w:t>
+            </w:r>
+            <w:proofErr w:type="spellStart"/>
             <w:r>
               <w:rPr>
                 <w:rFonts w:ascii="DejaVu Sans Mono" w:hAnsi="DejaVu Sans Mono"/>
                 <w:color w:val="06734E"/>
                 <w:sz w:val="18"/>
+              </w:rPr>
+              <w:t>mysql</w:t>
+            </w:r>
+            <w:proofErr w:type="spellEnd"/>
+            <w:r>
+              <w:rPr>
+                <w:rFonts w:ascii="DejaVu Sans Mono" w:hAnsi="DejaVu Sans Mono"/>
+                <w:color w:val="06734E"/>
+                <w:sz w:val="18"/>
+              </w:rPr>
+              <w:t>-files/</w:t>
+            </w:r>
+            <w:proofErr w:type="spellStart"/>
+            <w:r>
+              <w:rPr>
+                <w:rFonts w:ascii="DejaVu Sans Mono" w:hAnsi="DejaVu Sans Mono"/>
+                <w:color w:val="06734E"/>
+                <w:sz w:val="18"/>
+              </w:rPr>
+              <w:t>t</w:t>
+            </w:r>
+            <w:r>
+              <w:rPr>
+                <w:rFonts w:ascii="DejaVu Sans Mono" w:hAnsi="DejaVu Sans Mono"/>
+                <w:color w:val="06734E"/>
+                <w:sz w:val="18"/>
                 <w:szCs w:val="18"/>
               </w:rPr>
               <w:t>_</w:t>
@@ -9661,7 +10329,16 @@
                 <w:color w:val="06734E"/>
                 <w:sz w:val="18"/>
               </w:rPr>
-              <w:t>aeroport.tsv'</w:t>
+              <w:t>aeroport.tsv</w:t>
+            </w:r>
+            <w:proofErr w:type="spellEnd"/>
+            <w:r>
+              <w:rPr>
+                <w:rFonts w:ascii="DejaVu Sans Mono" w:hAnsi="DejaVu Sans Mono"/>
+                <w:color w:val="06734E"/>
+                <w:sz w:val="18"/>
+              </w:rPr>
+              <w:t>'</w:t>
             </w:r>
           </w:p>
         </w:tc>
@@ -9756,8 +10433,18 @@
                 <w:color w:val="25364B"/>
                 <w:sz w:val="18"/>
               </w:rPr>
-              <w:t xml:space="preserve"> t_aeroport</w:t>
-            </w:r>
+              <w:t xml:space="preserve"> </w:t>
+            </w:r>
+            <w:proofErr w:type="spellStart"/>
+            <w:r>
+              <w:rPr>
+                <w:rFonts w:ascii="DejaVu Sans Mono" w:hAnsi="DejaVu Sans Mono"/>
+                <w:color w:val="25364B"/>
+                <w:sz w:val="18"/>
+              </w:rPr>
+              <w:t>t_aeroport</w:t>
+            </w:r>
+            <w:proofErr w:type="spellEnd"/>
           </w:p>
         </w:tc>
       </w:tr>
@@ -10267,7 +10954,35 @@
                 <w:color w:val="25364B"/>
                 <w:sz w:val="18"/>
               </w:rPr>
-              <w:t xml:space="preserve">(aeroport_id, </w:t>
+              <w:t>(</w:t>
+            </w:r>
+            <w:proofErr w:type="spellStart"/>
+            <w:proofErr w:type="gramStart"/>
+            <w:r>
+              <w:rPr>
+                <w:rFonts w:ascii="DejaVu Sans Mono" w:hAnsi="DejaVu Sans Mono"/>
+                <w:color w:val="25364B"/>
+                <w:sz w:val="18"/>
+              </w:rPr>
+              <w:t>aeroport</w:t>
+            </w:r>
+            <w:proofErr w:type="gramEnd"/>
+            <w:r>
+              <w:rPr>
+                <w:rFonts w:ascii="DejaVu Sans Mono" w:hAnsi="DejaVu Sans Mono"/>
+                <w:color w:val="25364B"/>
+                <w:sz w:val="18"/>
+              </w:rPr>
+              <w:t>_id</w:t>
+            </w:r>
+            <w:proofErr w:type="spellEnd"/>
+            <w:r>
+              <w:rPr>
+                <w:rFonts w:ascii="DejaVu Sans Mono" w:hAnsi="DejaVu Sans Mono"/>
+                <w:color w:val="25364B"/>
+                <w:sz w:val="18"/>
+              </w:rPr>
+              <w:t xml:space="preserve">, </w:t>
             </w:r>
             <w:r>
               <w:rPr>
@@ -10438,7 +11153,35 @@
                 <w:color w:val="25364B"/>
                 <w:sz w:val="18"/>
               </w:rPr>
-              <w:t xml:space="preserve">    code_iata = </w:t>
+              <w:t xml:space="preserve">    </w:t>
+            </w:r>
+            <w:proofErr w:type="spellStart"/>
+            <w:proofErr w:type="gramStart"/>
+            <w:r>
+              <w:rPr>
+                <w:rFonts w:ascii="DejaVu Sans Mono" w:hAnsi="DejaVu Sans Mono"/>
+                <w:color w:val="25364B"/>
+                <w:sz w:val="18"/>
+              </w:rPr>
+              <w:t>code</w:t>
+            </w:r>
+            <w:proofErr w:type="gramEnd"/>
+            <w:r>
+              <w:rPr>
+                <w:rFonts w:ascii="DejaVu Sans Mono" w:hAnsi="DejaVu Sans Mono"/>
+                <w:color w:val="25364B"/>
+                <w:sz w:val="18"/>
+              </w:rPr>
+              <w:t>_iata</w:t>
+            </w:r>
+            <w:proofErr w:type="spellEnd"/>
+            <w:r>
+              <w:rPr>
+                <w:rFonts w:ascii="DejaVu Sans Mono" w:hAnsi="DejaVu Sans Mono"/>
+                <w:color w:val="25364B"/>
+                <w:sz w:val="18"/>
+              </w:rPr>
+              <w:t xml:space="preserve"> = </w:t>
             </w:r>
             <w:r>
               <w:rPr>
@@ -10556,7 +11299,35 @@
                 <w:color w:val="25364B"/>
                 <w:sz w:val="18"/>
               </w:rPr>
-              <w:t xml:space="preserve">    code_icao = </w:t>
+              <w:t xml:space="preserve">    </w:t>
+            </w:r>
+            <w:proofErr w:type="spellStart"/>
+            <w:proofErr w:type="gramStart"/>
+            <w:r>
+              <w:rPr>
+                <w:rFonts w:ascii="DejaVu Sans Mono" w:hAnsi="DejaVu Sans Mono"/>
+                <w:color w:val="25364B"/>
+                <w:sz w:val="18"/>
+              </w:rPr>
+              <w:t>code</w:t>
+            </w:r>
+            <w:proofErr w:type="gramEnd"/>
+            <w:r>
+              <w:rPr>
+                <w:rFonts w:ascii="DejaVu Sans Mono" w:hAnsi="DejaVu Sans Mono"/>
+                <w:color w:val="25364B"/>
+                <w:sz w:val="18"/>
+              </w:rPr>
+              <w:t>_icao</w:t>
+            </w:r>
+            <w:proofErr w:type="spellEnd"/>
+            <w:r>
+              <w:rPr>
+                <w:rFonts w:ascii="DejaVu Sans Mono" w:hAnsi="DejaVu Sans Mono"/>
+                <w:color w:val="25364B"/>
+                <w:sz w:val="18"/>
+              </w:rPr>
+              <w:t xml:space="preserve"> = </w:t>
             </w:r>
             <w:r>
               <w:rPr>
@@ -10677,8 +11448,36 @@
                 <w:color w:val="25364B"/>
                 <w:sz w:val="20"/>
               </w:rPr>
-              <w:t>PhpMyAdmin   /   db_aeroport   /   t_aeroport</w:t>
-            </w:r>
+              <w:t xml:space="preserve">PhpMyAdmin   /   </w:t>
+            </w:r>
+            <w:proofErr w:type="spellStart"/>
+            <w:r>
+              <w:rPr>
+                <w:rFonts w:ascii="Calibri" w:hAnsi="Calibri"/>
+                <w:color w:val="25364B"/>
+                <w:sz w:val="20"/>
+              </w:rPr>
+              <w:t>db_aeroport</w:t>
+            </w:r>
+            <w:proofErr w:type="spellEnd"/>
+            <w:r>
+              <w:rPr>
+                <w:rFonts w:ascii="Calibri" w:hAnsi="Calibri"/>
+                <w:color w:val="25364B"/>
+                <w:sz w:val="20"/>
+              </w:rPr>
+              <w:t xml:space="preserve">   /   </w:t>
+            </w:r>
+            <w:proofErr w:type="spellStart"/>
+            <w:r>
+              <w:rPr>
+                <w:rFonts w:ascii="Calibri" w:hAnsi="Calibri"/>
+                <w:color w:val="25364B"/>
+                <w:sz w:val="20"/>
+              </w:rPr>
+              <w:t>t_aeroport</w:t>
+            </w:r>
+            <w:proofErr w:type="spellEnd"/>
           </w:p>
         </w:tc>
       </w:tr>
@@ -10842,8 +11641,19 @@
                 <w:color w:val="FFFFFF"/>
                 <w:sz w:val="20"/>
               </w:rPr>
-              <w:t>SQL   /   t_compagnie.tsv</w:t>
-            </w:r>
+              <w:t xml:space="preserve">SQL   /   </w:t>
+            </w:r>
+            <w:proofErr w:type="spellStart"/>
+            <w:r>
+              <w:rPr>
+                <w:rFonts w:ascii="Calibri" w:hAnsi="Calibri"/>
+                <w:b/>
+                <w:color w:val="FFFFFF"/>
+                <w:sz w:val="20"/>
+              </w:rPr>
+              <w:t>t_compagnie.tsv</w:t>
+            </w:r>
+            <w:proofErr w:type="spellEnd"/>
           </w:p>
         </w:tc>
       </w:tr>
@@ -10962,13 +11772,40 @@
                 <w:color w:val="06734E"/>
                 <w:sz w:val="18"/>
               </w:rPr>
-              <w:t>'/var/lib/mysql-files/t</w:t>
-            </w:r>
+              <w:t>'/var/lib/</w:t>
+            </w:r>
+            <w:proofErr w:type="spellStart"/>
             <w:r>
               <w:rPr>
                 <w:rFonts w:ascii="DejaVu Sans Mono" w:hAnsi="DejaVu Sans Mono"/>
                 <w:color w:val="06734E"/>
                 <w:sz w:val="18"/>
+              </w:rPr>
+              <w:t>mysql</w:t>
+            </w:r>
+            <w:proofErr w:type="spellEnd"/>
+            <w:r>
+              <w:rPr>
+                <w:rFonts w:ascii="DejaVu Sans Mono" w:hAnsi="DejaVu Sans Mono"/>
+                <w:color w:val="06734E"/>
+                <w:sz w:val="18"/>
+              </w:rPr>
+              <w:t>-files/</w:t>
+            </w:r>
+            <w:proofErr w:type="spellStart"/>
+            <w:r>
+              <w:rPr>
+                <w:rFonts w:ascii="DejaVu Sans Mono" w:hAnsi="DejaVu Sans Mono"/>
+                <w:color w:val="06734E"/>
+                <w:sz w:val="18"/>
+              </w:rPr>
+              <w:t>t</w:t>
+            </w:r>
+            <w:r>
+              <w:rPr>
+                <w:rFonts w:ascii="DejaVu Sans Mono" w:hAnsi="DejaVu Sans Mono"/>
+                <w:color w:val="06734E"/>
+                <w:sz w:val="18"/>
                 <w:szCs w:val="18"/>
               </w:rPr>
               <w:t>_</w:t>
@@ -10979,7 +11816,16 @@
                 <w:color w:val="06734E"/>
                 <w:sz w:val="18"/>
               </w:rPr>
-              <w:t>compagnie.tsv'</w:t>
+              <w:t>compagnie.tsv</w:t>
+            </w:r>
+            <w:proofErr w:type="spellEnd"/>
+            <w:r>
+              <w:rPr>
+                <w:rFonts w:ascii="DejaVu Sans Mono" w:hAnsi="DejaVu Sans Mono"/>
+                <w:color w:val="06734E"/>
+                <w:sz w:val="18"/>
+              </w:rPr>
+              <w:t>'</w:t>
             </w:r>
           </w:p>
         </w:tc>
@@ -11074,8 +11920,18 @@
                 <w:color w:val="25364B"/>
                 <w:sz w:val="18"/>
               </w:rPr>
-              <w:t xml:space="preserve"> t_compagnie</w:t>
-            </w:r>
+              <w:t xml:space="preserve"> </w:t>
+            </w:r>
+            <w:proofErr w:type="spellStart"/>
+            <w:r>
+              <w:rPr>
+                <w:rFonts w:ascii="DejaVu Sans Mono" w:hAnsi="DejaVu Sans Mono"/>
+                <w:color w:val="25364B"/>
+                <w:sz w:val="18"/>
+              </w:rPr>
+              <w:t>t_compagnie</w:t>
+            </w:r>
+            <w:proofErr w:type="spellEnd"/>
           </w:p>
         </w:tc>
       </w:tr>
@@ -11659,8 +12515,36 @@
                 <w:color w:val="25364B"/>
                 <w:sz w:val="20"/>
               </w:rPr>
-              <w:t>PhpMyAdmin   /   db_aeroport   /   t_compagnie</w:t>
-            </w:r>
+              <w:t xml:space="preserve">PhpMyAdmin   /   </w:t>
+            </w:r>
+            <w:proofErr w:type="spellStart"/>
+            <w:r>
+              <w:rPr>
+                <w:rFonts w:ascii="Calibri" w:hAnsi="Calibri"/>
+                <w:color w:val="25364B"/>
+                <w:sz w:val="20"/>
+              </w:rPr>
+              <w:t>db_aeroport</w:t>
+            </w:r>
+            <w:proofErr w:type="spellEnd"/>
+            <w:r>
+              <w:rPr>
+                <w:rFonts w:ascii="Calibri" w:hAnsi="Calibri"/>
+                <w:color w:val="25364B"/>
+                <w:sz w:val="20"/>
+              </w:rPr>
+              <w:t xml:space="preserve">   /   </w:t>
+            </w:r>
+            <w:proofErr w:type="spellStart"/>
+            <w:r>
+              <w:rPr>
+                <w:rFonts w:ascii="Calibri" w:hAnsi="Calibri"/>
+                <w:color w:val="25364B"/>
+                <w:sz w:val="20"/>
+              </w:rPr>
+              <w:t>t_compagnie</w:t>
+            </w:r>
+            <w:proofErr w:type="spellEnd"/>
           </w:p>
         </w:tc>
       </w:tr>
@@ -11875,8 +12759,19 @@
                 <w:color w:val="FFFFFF"/>
                 <w:sz w:val="20"/>
               </w:rPr>
-              <w:t>SQL   /   t_type_avion.tsv</w:t>
-            </w:r>
+              <w:t xml:space="preserve">SQL   /   </w:t>
+            </w:r>
+            <w:proofErr w:type="spellStart"/>
+            <w:r>
+              <w:rPr>
+                <w:rFonts w:ascii="Calibri" w:hAnsi="Calibri"/>
+                <w:b/>
+                <w:color w:val="FFFFFF"/>
+                <w:sz w:val="20"/>
+              </w:rPr>
+              <w:t>t_type_avion.tsv</w:t>
+            </w:r>
+            <w:proofErr w:type="spellEnd"/>
           </w:p>
         </w:tc>
       </w:tr>
@@ -11995,13 +12890,40 @@
                 <w:color w:val="06734E"/>
                 <w:sz w:val="18"/>
               </w:rPr>
-              <w:t>'/var/lib/mysql-files/t</w:t>
-            </w:r>
+              <w:t>'/var/lib/</w:t>
+            </w:r>
+            <w:proofErr w:type="spellStart"/>
             <w:r>
               <w:rPr>
                 <w:rFonts w:ascii="DejaVu Sans Mono" w:hAnsi="DejaVu Sans Mono"/>
                 <w:color w:val="06734E"/>
                 <w:sz w:val="18"/>
+              </w:rPr>
+              <w:t>mysql</w:t>
+            </w:r>
+            <w:proofErr w:type="spellEnd"/>
+            <w:r>
+              <w:rPr>
+                <w:rFonts w:ascii="DejaVu Sans Mono" w:hAnsi="DejaVu Sans Mono"/>
+                <w:color w:val="06734E"/>
+                <w:sz w:val="18"/>
+              </w:rPr>
+              <w:t>-files/</w:t>
+            </w:r>
+            <w:proofErr w:type="spellStart"/>
+            <w:r>
+              <w:rPr>
+                <w:rFonts w:ascii="DejaVu Sans Mono" w:hAnsi="DejaVu Sans Mono"/>
+                <w:color w:val="06734E"/>
+                <w:sz w:val="18"/>
+              </w:rPr>
+              <w:t>t</w:t>
+            </w:r>
+            <w:r>
+              <w:rPr>
+                <w:rFonts w:ascii="DejaVu Sans Mono" w:hAnsi="DejaVu Sans Mono"/>
+                <w:color w:val="06734E"/>
+                <w:sz w:val="18"/>
                 <w:szCs w:val="18"/>
               </w:rPr>
               <w:t>_</w:t>
@@ -12012,7 +12934,16 @@
                 <w:color w:val="06734E"/>
                 <w:sz w:val="18"/>
               </w:rPr>
-              <w:t>type_avion.tsv'</w:t>
+              <w:t>type_avion.tsv</w:t>
+            </w:r>
+            <w:proofErr w:type="spellEnd"/>
+            <w:r>
+              <w:rPr>
+                <w:rFonts w:ascii="DejaVu Sans Mono" w:hAnsi="DejaVu Sans Mono"/>
+                <w:color w:val="06734E"/>
+                <w:sz w:val="18"/>
+              </w:rPr>
+              <w:t>'</w:t>
             </w:r>
           </w:p>
         </w:tc>
@@ -12114,8 +13045,9 @@
                 <w:sz w:val="18"/>
                 <w:lang w:val="en-US"/>
               </w:rPr>
-              <w:t xml:space="preserve"> t_type_a</w:t>
-            </w:r>
+              <w:t xml:space="preserve"> </w:t>
+            </w:r>
+            <w:proofErr w:type="spellStart"/>
             <w:r>
               <w:rPr>
                 <w:rFonts w:ascii="DejaVu Sans Mono" w:hAnsi="DejaVu Sans Mono"/>
@@ -12123,8 +13055,18 @@
                 <w:sz w:val="18"/>
                 <w:lang w:val="en-US"/>
               </w:rPr>
+              <w:t>t_type_a</w:t>
+            </w:r>
+            <w:r>
+              <w:rPr>
+                <w:rFonts w:ascii="DejaVu Sans Mono" w:hAnsi="DejaVu Sans Mono"/>
+                <w:color w:val="25364B"/>
+                <w:sz w:val="18"/>
+                <w:lang w:val="en-US"/>
+              </w:rPr>
               <w:t>vion</w:t>
             </w:r>
+            <w:proofErr w:type="spellEnd"/>
           </w:p>
         </w:tc>
       </w:tr>
@@ -12708,8 +13650,36 @@
                 <w:color w:val="25364B"/>
                 <w:sz w:val="20"/>
               </w:rPr>
-              <w:t>PhpMyAdmin   /   db_aeroport   /   t_type_avion</w:t>
-            </w:r>
+              <w:t xml:space="preserve">PhpMyAdmin   /   </w:t>
+            </w:r>
+            <w:proofErr w:type="spellStart"/>
+            <w:r>
+              <w:rPr>
+                <w:rFonts w:ascii="Calibri" w:hAnsi="Calibri"/>
+                <w:color w:val="25364B"/>
+                <w:sz w:val="20"/>
+              </w:rPr>
+              <w:t>db_aeroport</w:t>
+            </w:r>
+            <w:proofErr w:type="spellEnd"/>
+            <w:r>
+              <w:rPr>
+                <w:rFonts w:ascii="Calibri" w:hAnsi="Calibri"/>
+                <w:color w:val="25364B"/>
+                <w:sz w:val="20"/>
+              </w:rPr>
+              <w:t xml:space="preserve">   /   </w:t>
+            </w:r>
+            <w:proofErr w:type="spellStart"/>
+            <w:r>
+              <w:rPr>
+                <w:rFonts w:ascii="Calibri" w:hAnsi="Calibri"/>
+                <w:color w:val="25364B"/>
+                <w:sz w:val="20"/>
+              </w:rPr>
+              <w:t>t_type_avion</w:t>
+            </w:r>
+            <w:proofErr w:type="spellEnd"/>
           </w:p>
         </w:tc>
       </w:tr>
@@ -12924,8 +13894,19 @@
                 <w:color w:val="FFFFFF"/>
                 <w:sz w:val="20"/>
               </w:rPr>
-              <w:t>SQL   /   t_avion.tsv</w:t>
-            </w:r>
+              <w:t xml:space="preserve">SQL   /   </w:t>
+            </w:r>
+            <w:proofErr w:type="spellStart"/>
+            <w:r>
+              <w:rPr>
+                <w:rFonts w:ascii="Calibri" w:hAnsi="Calibri"/>
+                <w:b/>
+                <w:color w:val="FFFFFF"/>
+                <w:sz w:val="20"/>
+              </w:rPr>
+              <w:t>t_avion.tsv</w:t>
+            </w:r>
+            <w:proofErr w:type="spellEnd"/>
           </w:p>
         </w:tc>
       </w:tr>
@@ -13044,7 +14025,43 @@
                 <w:color w:val="06734E"/>
                 <w:sz w:val="18"/>
               </w:rPr>
-              <w:t>'/var/lib/mysql-files/t_avion.tsv'</w:t>
+              <w:t>'/var/lib/</w:t>
+            </w:r>
+            <w:proofErr w:type="spellStart"/>
+            <w:r>
+              <w:rPr>
+                <w:rFonts w:ascii="DejaVu Sans Mono" w:hAnsi="DejaVu Sans Mono"/>
+                <w:color w:val="06734E"/>
+                <w:sz w:val="18"/>
+              </w:rPr>
+              <w:t>mysql</w:t>
+            </w:r>
+            <w:proofErr w:type="spellEnd"/>
+            <w:r>
+              <w:rPr>
+                <w:rFonts w:ascii="DejaVu Sans Mono" w:hAnsi="DejaVu Sans Mono"/>
+                <w:color w:val="06734E"/>
+                <w:sz w:val="18"/>
+              </w:rPr>
+              <w:t>-files/</w:t>
+            </w:r>
+            <w:proofErr w:type="spellStart"/>
+            <w:r>
+              <w:rPr>
+                <w:rFonts w:ascii="DejaVu Sans Mono" w:hAnsi="DejaVu Sans Mono"/>
+                <w:color w:val="06734E"/>
+                <w:sz w:val="18"/>
+              </w:rPr>
+              <w:t>t_avion.tsv</w:t>
+            </w:r>
+            <w:proofErr w:type="spellEnd"/>
+            <w:r>
+              <w:rPr>
+                <w:rFonts w:ascii="DejaVu Sans Mono" w:hAnsi="DejaVu Sans Mono"/>
+                <w:color w:val="06734E"/>
+                <w:sz w:val="18"/>
+              </w:rPr>
+              <w:t>'</w:t>
             </w:r>
           </w:p>
         </w:tc>
@@ -13146,8 +14163,9 @@
                 <w:sz w:val="18"/>
                 <w:lang w:val="en-US"/>
               </w:rPr>
-              <w:t xml:space="preserve"> t_a</w:t>
-            </w:r>
+              <w:t xml:space="preserve"> </w:t>
+            </w:r>
+            <w:proofErr w:type="spellStart"/>
             <w:r>
               <w:rPr>
                 <w:rFonts w:ascii="DejaVu Sans Mono" w:hAnsi="DejaVu Sans Mono"/>
@@ -13155,8 +14173,18 @@
                 <w:sz w:val="18"/>
                 <w:lang w:val="en-US"/>
               </w:rPr>
+              <w:t>t_a</w:t>
+            </w:r>
+            <w:r>
+              <w:rPr>
+                <w:rFonts w:ascii="DejaVu Sans Mono" w:hAnsi="DejaVu Sans Mono"/>
+                <w:color w:val="25364B"/>
+                <w:sz w:val="18"/>
+                <w:lang w:val="en-US"/>
+              </w:rPr>
               <w:t>vion</w:t>
             </w:r>
+            <w:proofErr w:type="spellEnd"/>
           </w:p>
         </w:tc>
       </w:tr>
@@ -13740,8 +14768,36 @@
                 <w:color w:val="25364B"/>
                 <w:sz w:val="20"/>
               </w:rPr>
-              <w:t>PhpMyAdmin   /   db_aeroport   /   t_avion</w:t>
-            </w:r>
+              <w:t xml:space="preserve">PhpMyAdmin   /   </w:t>
+            </w:r>
+            <w:proofErr w:type="spellStart"/>
+            <w:r>
+              <w:rPr>
+                <w:rFonts w:ascii="Calibri" w:hAnsi="Calibri"/>
+                <w:color w:val="25364B"/>
+                <w:sz w:val="20"/>
+              </w:rPr>
+              <w:t>db_aeroport</w:t>
+            </w:r>
+            <w:proofErr w:type="spellEnd"/>
+            <w:r>
+              <w:rPr>
+                <w:rFonts w:ascii="Calibri" w:hAnsi="Calibri"/>
+                <w:color w:val="25364B"/>
+                <w:sz w:val="20"/>
+              </w:rPr>
+              <w:t xml:space="preserve">   /   </w:t>
+            </w:r>
+            <w:proofErr w:type="spellStart"/>
+            <w:r>
+              <w:rPr>
+                <w:rFonts w:ascii="Calibri" w:hAnsi="Calibri"/>
+                <w:color w:val="25364B"/>
+                <w:sz w:val="20"/>
+              </w:rPr>
+              <w:t>t_avion</w:t>
+            </w:r>
+            <w:proofErr w:type="spellEnd"/>
           </w:p>
         </w:tc>
       </w:tr>
@@ -13956,8 +15012,19 @@
                 <w:color w:val="FFFFFF"/>
                 <w:sz w:val="20"/>
               </w:rPr>
-              <w:t>SQL   /   t_passager.tsv</w:t>
-            </w:r>
+              <w:t xml:space="preserve">SQL   /   </w:t>
+            </w:r>
+            <w:proofErr w:type="spellStart"/>
+            <w:r>
+              <w:rPr>
+                <w:rFonts w:ascii="Calibri" w:hAnsi="Calibri"/>
+                <w:b/>
+                <w:color w:val="FFFFFF"/>
+                <w:sz w:val="20"/>
+              </w:rPr>
+              <w:t>t_passager.tsv</w:t>
+            </w:r>
+            <w:proofErr w:type="spellEnd"/>
           </w:p>
         </w:tc>
       </w:tr>
@@ -14076,7 +15143,43 @@
                 <w:color w:val="06734E"/>
                 <w:sz w:val="18"/>
               </w:rPr>
-              <w:t>'/var/lib/mysql-files/t_passager.tsv'</w:t>
+              <w:t>'/var/lib/</w:t>
+            </w:r>
+            <w:proofErr w:type="spellStart"/>
+            <w:r>
+              <w:rPr>
+                <w:rFonts w:ascii="DejaVu Sans Mono" w:hAnsi="DejaVu Sans Mono"/>
+                <w:color w:val="06734E"/>
+                <w:sz w:val="18"/>
+              </w:rPr>
+              <w:t>mysql</w:t>
+            </w:r>
+            <w:proofErr w:type="spellEnd"/>
+            <w:r>
+              <w:rPr>
+                <w:rFonts w:ascii="DejaVu Sans Mono" w:hAnsi="DejaVu Sans Mono"/>
+                <w:color w:val="06734E"/>
+                <w:sz w:val="18"/>
+              </w:rPr>
+              <w:t>-files/</w:t>
+            </w:r>
+            <w:proofErr w:type="spellStart"/>
+            <w:r>
+              <w:rPr>
+                <w:rFonts w:ascii="DejaVu Sans Mono" w:hAnsi="DejaVu Sans Mono"/>
+                <w:color w:val="06734E"/>
+                <w:sz w:val="18"/>
+              </w:rPr>
+              <w:t>t_passager.tsv</w:t>
+            </w:r>
+            <w:proofErr w:type="spellEnd"/>
+            <w:r>
+              <w:rPr>
+                <w:rFonts w:ascii="DejaVu Sans Mono" w:hAnsi="DejaVu Sans Mono"/>
+                <w:color w:val="06734E"/>
+                <w:sz w:val="18"/>
+              </w:rPr>
+              <w:t>'</w:t>
             </w:r>
           </w:p>
         </w:tc>
@@ -14178,8 +15281,9 @@
                 <w:sz w:val="18"/>
                 <w:lang w:val="en-US"/>
               </w:rPr>
-              <w:t xml:space="preserve"> t_</w:t>
-            </w:r>
+              <w:t xml:space="preserve"> </w:t>
+            </w:r>
+            <w:proofErr w:type="spellStart"/>
             <w:r>
               <w:rPr>
                 <w:rFonts w:ascii="DejaVu Sans Mono" w:hAnsi="DejaVu Sans Mono"/>
@@ -14187,8 +15291,18 @@
                 <w:sz w:val="18"/>
                 <w:lang w:val="en-US"/>
               </w:rPr>
+              <w:t>t_</w:t>
+            </w:r>
+            <w:r>
+              <w:rPr>
+                <w:rFonts w:ascii="DejaVu Sans Mono" w:hAnsi="DejaVu Sans Mono"/>
+                <w:color w:val="25364B"/>
+                <w:sz w:val="18"/>
+                <w:lang w:val="en-US"/>
+              </w:rPr>
               <w:t>passager</w:t>
             </w:r>
+            <w:proofErr w:type="spellEnd"/>
           </w:p>
         </w:tc>
       </w:tr>
@@ -14772,8 +15886,36 @@
                 <w:color w:val="25364B"/>
                 <w:sz w:val="20"/>
               </w:rPr>
-              <w:t>PhpMyAdmin   /   db_aeroport   /   t_passager</w:t>
-            </w:r>
+              <w:t xml:space="preserve">PhpMyAdmin   /   </w:t>
+            </w:r>
+            <w:proofErr w:type="spellStart"/>
+            <w:r>
+              <w:rPr>
+                <w:rFonts w:ascii="Calibri" w:hAnsi="Calibri"/>
+                <w:color w:val="25364B"/>
+                <w:sz w:val="20"/>
+              </w:rPr>
+              <w:t>db_aeroport</w:t>
+            </w:r>
+            <w:proofErr w:type="spellEnd"/>
+            <w:r>
+              <w:rPr>
+                <w:rFonts w:ascii="Calibri" w:hAnsi="Calibri"/>
+                <w:color w:val="25364B"/>
+                <w:sz w:val="20"/>
+              </w:rPr>
+              <w:t xml:space="preserve">   /   </w:t>
+            </w:r>
+            <w:proofErr w:type="spellStart"/>
+            <w:r>
+              <w:rPr>
+                <w:rFonts w:ascii="Calibri" w:hAnsi="Calibri"/>
+                <w:color w:val="25364B"/>
+                <w:sz w:val="20"/>
+              </w:rPr>
+              <w:t>t_passager</w:t>
+            </w:r>
+            <w:proofErr w:type="spellEnd"/>
           </w:p>
         </w:tc>
       </w:tr>
@@ -14988,8 +16130,9 @@
                 <w:color w:val="FFFFFF"/>
                 <w:sz w:val="20"/>
               </w:rPr>
-              <w:t>SQL   /   t_p</w:t>
-            </w:r>
+              <w:t xml:space="preserve">SQL   /   </w:t>
+            </w:r>
+            <w:proofErr w:type="spellStart"/>
             <w:r>
               <w:rPr>
                 <w:rFonts w:ascii="Calibri" w:hAnsi="Calibri"/>
@@ -14997,7 +16140,7 @@
                 <w:color w:val="FFFFFF"/>
                 <w:sz w:val="20"/>
               </w:rPr>
-              <w:t>rogramme_vol</w:t>
+              <w:t>t_p</w:t>
             </w:r>
             <w:r>
               <w:rPr>
@@ -15006,8 +16149,18 @@
                 <w:color w:val="FFFFFF"/>
                 <w:sz w:val="20"/>
               </w:rPr>
+              <w:t>rogramme_vol</w:t>
+            </w:r>
+            <w:r>
+              <w:rPr>
+                <w:rFonts w:ascii="Calibri" w:hAnsi="Calibri"/>
+                <w:b/>
+                <w:color w:val="FFFFFF"/>
+                <w:sz w:val="20"/>
+              </w:rPr>
               <w:t>.tsv</w:t>
             </w:r>
+            <w:proofErr w:type="spellEnd"/>
           </w:p>
         </w:tc>
       </w:tr>
@@ -15126,14 +16279,41 @@
                 <w:color w:val="06734E"/>
                 <w:sz w:val="18"/>
               </w:rPr>
-              <w:t>'/var/lib/mysql-files/t_p</w:t>
-            </w:r>
+              <w:t>'/var/lib/</w:t>
+            </w:r>
+            <w:proofErr w:type="spellStart"/>
             <w:r>
               <w:rPr>
                 <w:rFonts w:ascii="DejaVu Sans Mono" w:hAnsi="DejaVu Sans Mono"/>
                 <w:color w:val="06734E"/>
                 <w:sz w:val="18"/>
               </w:rPr>
+              <w:t>mysql</w:t>
+            </w:r>
+            <w:proofErr w:type="spellEnd"/>
+            <w:r>
+              <w:rPr>
+                <w:rFonts w:ascii="DejaVu Sans Mono" w:hAnsi="DejaVu Sans Mono"/>
+                <w:color w:val="06734E"/>
+                <w:sz w:val="18"/>
+              </w:rPr>
+              <w:t>-files/</w:t>
+            </w:r>
+            <w:proofErr w:type="spellStart"/>
+            <w:r>
+              <w:rPr>
+                <w:rFonts w:ascii="DejaVu Sans Mono" w:hAnsi="DejaVu Sans Mono"/>
+                <w:color w:val="06734E"/>
+                <w:sz w:val="18"/>
+              </w:rPr>
+              <w:t>t_p</w:t>
+            </w:r>
+            <w:r>
+              <w:rPr>
+                <w:rFonts w:ascii="DejaVu Sans Mono" w:hAnsi="DejaVu Sans Mono"/>
+                <w:color w:val="06734E"/>
+                <w:sz w:val="18"/>
+              </w:rPr>
               <w:t>rogramme_vol</w:t>
             </w:r>
             <w:r>
@@ -15142,7 +16322,16 @@
                 <w:color w:val="06734E"/>
                 <w:sz w:val="18"/>
               </w:rPr>
-              <w:t>.tsv'</w:t>
+              <w:t>.tsv</w:t>
+            </w:r>
+            <w:proofErr w:type="spellEnd"/>
+            <w:r>
+              <w:rPr>
+                <w:rFonts w:ascii="DejaVu Sans Mono" w:hAnsi="DejaVu Sans Mono"/>
+                <w:color w:val="06734E"/>
+                <w:sz w:val="18"/>
+              </w:rPr>
+              <w:t>'</w:t>
             </w:r>
           </w:p>
         </w:tc>
@@ -15244,8 +16433,9 @@
                 <w:sz w:val="18"/>
                 <w:lang w:val="en-US"/>
               </w:rPr>
-              <w:t xml:space="preserve"> t_</w:t>
-            </w:r>
+              <w:t xml:space="preserve"> </w:t>
+            </w:r>
+            <w:proofErr w:type="spellStart"/>
             <w:r>
               <w:rPr>
                 <w:rFonts w:ascii="DejaVu Sans Mono" w:hAnsi="DejaVu Sans Mono"/>
@@ -15253,6 +16443,15 @@
                 <w:sz w:val="18"/>
                 <w:lang w:val="en-US"/>
               </w:rPr>
+              <w:t>t_</w:t>
+            </w:r>
+            <w:r>
+              <w:rPr>
+                <w:rFonts w:ascii="DejaVu Sans Mono" w:hAnsi="DejaVu Sans Mono"/>
+                <w:color w:val="25364B"/>
+                <w:sz w:val="18"/>
+                <w:lang w:val="en-US"/>
+              </w:rPr>
               <w:t>p</w:t>
             </w:r>
             <w:r>
@@ -15264,6 +16463,7 @@
               </w:rPr>
               <w:t>rogramme_vol</w:t>
             </w:r>
+            <w:proofErr w:type="spellEnd"/>
           </w:p>
         </w:tc>
       </w:tr>
@@ -15856,16 +17056,44 @@
                 <w:color w:val="25364B"/>
                 <w:sz w:val="20"/>
               </w:rPr>
-              <w:t>PhpMyAdmin   /   db_aeroport   /   t_p</w:t>
-            </w:r>
+              <w:t xml:space="preserve">PhpMyAdmin   /   </w:t>
+            </w:r>
+            <w:proofErr w:type="spellStart"/>
             <w:r>
               <w:rPr>
                 <w:rFonts w:ascii="Calibri" w:hAnsi="Calibri"/>
                 <w:color w:val="25364B"/>
                 <w:sz w:val="20"/>
               </w:rPr>
+              <w:t>db_aeroport</w:t>
+            </w:r>
+            <w:proofErr w:type="spellEnd"/>
+            <w:r>
+              <w:rPr>
+                <w:rFonts w:ascii="Calibri" w:hAnsi="Calibri"/>
+                <w:color w:val="25364B"/>
+                <w:sz w:val="20"/>
+              </w:rPr>
+              <w:t xml:space="preserve">   /   </w:t>
+            </w:r>
+            <w:proofErr w:type="spellStart"/>
+            <w:r>
+              <w:rPr>
+                <w:rFonts w:ascii="Calibri" w:hAnsi="Calibri"/>
+                <w:color w:val="25364B"/>
+                <w:sz w:val="20"/>
+              </w:rPr>
+              <w:t>t_p</w:t>
+            </w:r>
+            <w:r>
+              <w:rPr>
+                <w:rFonts w:ascii="Calibri" w:hAnsi="Calibri"/>
+                <w:color w:val="25364B"/>
+                <w:sz w:val="20"/>
+              </w:rPr>
               <w:t>rogramme_vol</w:t>
             </w:r>
+            <w:proofErr w:type="spellEnd"/>
           </w:p>
         </w:tc>
       </w:tr>
@@ -16080,8 +17308,19 @@
                 <w:color w:val="FFFFFF"/>
                 <w:sz w:val="20"/>
               </w:rPr>
-              <w:t>SQL   /   t_vol.tsv</w:t>
-            </w:r>
+              <w:t xml:space="preserve">SQL   /   </w:t>
+            </w:r>
+            <w:proofErr w:type="spellStart"/>
+            <w:r>
+              <w:rPr>
+                <w:rFonts w:ascii="Calibri" w:hAnsi="Calibri"/>
+                <w:b/>
+                <w:color w:val="FFFFFF"/>
+                <w:sz w:val="20"/>
+              </w:rPr>
+              <w:t>t_vol.tsv</w:t>
+            </w:r>
+            <w:proofErr w:type="spellEnd"/>
           </w:p>
         </w:tc>
       </w:tr>
@@ -16200,7 +17439,43 @@
                 <w:color w:val="06734E"/>
                 <w:sz w:val="18"/>
               </w:rPr>
-              <w:t>'/var/lib/mysql-files/t_vol.tsv'</w:t>
+              <w:t>'/var/lib/</w:t>
+            </w:r>
+            <w:proofErr w:type="spellStart"/>
+            <w:r>
+              <w:rPr>
+                <w:rFonts w:ascii="DejaVu Sans Mono" w:hAnsi="DejaVu Sans Mono"/>
+                <w:color w:val="06734E"/>
+                <w:sz w:val="18"/>
+              </w:rPr>
+              <w:t>mysql</w:t>
+            </w:r>
+            <w:proofErr w:type="spellEnd"/>
+            <w:r>
+              <w:rPr>
+                <w:rFonts w:ascii="DejaVu Sans Mono" w:hAnsi="DejaVu Sans Mono"/>
+                <w:color w:val="06734E"/>
+                <w:sz w:val="18"/>
+              </w:rPr>
+              <w:t>-files/</w:t>
+            </w:r>
+            <w:proofErr w:type="spellStart"/>
+            <w:r>
+              <w:rPr>
+                <w:rFonts w:ascii="DejaVu Sans Mono" w:hAnsi="DejaVu Sans Mono"/>
+                <w:color w:val="06734E"/>
+                <w:sz w:val="18"/>
+              </w:rPr>
+              <w:t>t_vol.tsv</w:t>
+            </w:r>
+            <w:proofErr w:type="spellEnd"/>
+            <w:r>
+              <w:rPr>
+                <w:rFonts w:ascii="DejaVu Sans Mono" w:hAnsi="DejaVu Sans Mono"/>
+                <w:color w:val="06734E"/>
+                <w:sz w:val="18"/>
+              </w:rPr>
+              <w:t>'</w:t>
             </w:r>
           </w:p>
         </w:tc>
@@ -16896,7 +18171,25 @@
                 <w:color w:val="25364B"/>
                 <w:sz w:val="20"/>
               </w:rPr>
-              <w:t>PhpMyAdmin   /   db_aeroport   /   t_vol</w:t>
+              <w:t xml:space="preserve">PhpMyAdmin   /   </w:t>
+            </w:r>
+            <w:proofErr w:type="spellStart"/>
+            <w:r>
+              <w:rPr>
+                <w:rFonts w:ascii="Calibri" w:hAnsi="Calibri"/>
+                <w:color w:val="25364B"/>
+                <w:sz w:val="20"/>
+              </w:rPr>
+              <w:t>db_aeroport</w:t>
+            </w:r>
+            <w:proofErr w:type="spellEnd"/>
+            <w:r>
+              <w:rPr>
+                <w:rFonts w:ascii="Calibri" w:hAnsi="Calibri"/>
+                <w:color w:val="25364B"/>
+                <w:sz w:val="20"/>
+              </w:rPr>
+              <w:t xml:space="preserve">   /   t_vol</w:t>
             </w:r>
           </w:p>
         </w:tc>
@@ -17112,8 +18405,19 @@
                 <w:color w:val="FFFFFF"/>
                 <w:sz w:val="20"/>
               </w:rPr>
-              <w:t>SQL   /   t_reservation.tsv</w:t>
-            </w:r>
+              <w:t xml:space="preserve">SQL   /   </w:t>
+            </w:r>
+            <w:proofErr w:type="spellStart"/>
+            <w:r>
+              <w:rPr>
+                <w:rFonts w:ascii="Calibri" w:hAnsi="Calibri"/>
+                <w:b/>
+                <w:color w:val="FFFFFF"/>
+                <w:sz w:val="20"/>
+              </w:rPr>
+              <w:t>t_reservation.tsv</w:t>
+            </w:r>
+            <w:proofErr w:type="spellEnd"/>
           </w:p>
         </w:tc>
       </w:tr>
@@ -17232,7 +18536,43 @@
                 <w:color w:val="06734E"/>
                 <w:sz w:val="18"/>
               </w:rPr>
-              <w:t>'/var/lib/mysql-files/t_reservation.tsv'</w:t>
+              <w:t>'/var/lib/</w:t>
+            </w:r>
+            <w:proofErr w:type="spellStart"/>
+            <w:r>
+              <w:rPr>
+                <w:rFonts w:ascii="DejaVu Sans Mono" w:hAnsi="DejaVu Sans Mono"/>
+                <w:color w:val="06734E"/>
+                <w:sz w:val="18"/>
+              </w:rPr>
+              <w:t>mysql</w:t>
+            </w:r>
+            <w:proofErr w:type="spellEnd"/>
+            <w:r>
+              <w:rPr>
+                <w:rFonts w:ascii="DejaVu Sans Mono" w:hAnsi="DejaVu Sans Mono"/>
+                <w:color w:val="06734E"/>
+                <w:sz w:val="18"/>
+              </w:rPr>
+              <w:t>-files/</w:t>
+            </w:r>
+            <w:proofErr w:type="spellStart"/>
+            <w:r>
+              <w:rPr>
+                <w:rFonts w:ascii="DejaVu Sans Mono" w:hAnsi="DejaVu Sans Mono"/>
+                <w:color w:val="06734E"/>
+                <w:sz w:val="18"/>
+              </w:rPr>
+              <w:t>t_reservation.tsv</w:t>
+            </w:r>
+            <w:proofErr w:type="spellEnd"/>
+            <w:r>
+              <w:rPr>
+                <w:rFonts w:ascii="DejaVu Sans Mono" w:hAnsi="DejaVu Sans Mono"/>
+                <w:color w:val="06734E"/>
+                <w:sz w:val="18"/>
+              </w:rPr>
+              <w:t>'</w:t>
             </w:r>
           </w:p>
         </w:tc>
@@ -17928,7 +19268,25 @@
                 <w:color w:val="25364B"/>
                 <w:sz w:val="20"/>
               </w:rPr>
-              <w:t>PhpMyAdmin   /   db_aeroport   /   t_reservation</w:t>
+              <w:t xml:space="preserve">PhpMyAdmin   /   </w:t>
+            </w:r>
+            <w:proofErr w:type="spellStart"/>
+            <w:r>
+              <w:rPr>
+                <w:rFonts w:ascii="Calibri" w:hAnsi="Calibri"/>
+                <w:color w:val="25364B"/>
+                <w:sz w:val="20"/>
+              </w:rPr>
+              <w:t>db_aeroport</w:t>
+            </w:r>
+            <w:proofErr w:type="spellEnd"/>
+            <w:r>
+              <w:rPr>
+                <w:rFonts w:ascii="Calibri" w:hAnsi="Calibri"/>
+                <w:color w:val="25364B"/>
+                <w:sz w:val="20"/>
+              </w:rPr>
+              <w:t xml:space="preserve">   /   t_reservation</w:t>
             </w:r>
           </w:p>
         </w:tc>
@@ -18056,7 +19414,7 @@
           <w:szCs w:val="36"/>
         </w:rPr>
       </w:pPr>
-      <w:bookmarkStart w:id="12" w:name="_Toc244067187"/>
+      <w:bookmarkStart w:id="14" w:name="_Toc244067508"/>
       <w:r>
         <w:rPr>
           <w:rFonts w:ascii="Calibri" w:hAnsi="Calibri" w:cs="Calibri"/>
@@ -18068,7 +19426,7 @@
         <w:lastRenderedPageBreak/>
         <w:t>3.4 Requêtes SQL</w:t>
       </w:r>
-      <w:bookmarkEnd w:id="12"/>
+      <w:bookmarkEnd w:id="14"/>
     </w:p>
     <w:p>
       <w:pPr>
@@ -18302,6 +19660,7 @@
               </w:rPr>
               <w:t xml:space="preserve"> </w:t>
             </w:r>
+            <w:proofErr w:type="spellStart"/>
             <w:r>
               <w:rPr>
                 <w:rFonts w:ascii="DejaVu Sans Mono" w:hAnsi="DejaVu Sans Mono"/>
@@ -18311,6 +19670,7 @@
               </w:rPr>
               <w:t>t_avion</w:t>
             </w:r>
+            <w:proofErr w:type="spellEnd"/>
           </w:p>
         </w:tc>
       </w:tr>
@@ -18384,6 +19744,7 @@
             <w:r>
               <w:t xml:space="preserve"> </w:t>
             </w:r>
+            <w:proofErr w:type="spellStart"/>
             <w:r>
               <w:rPr>
                 <w:rFonts w:ascii="DejaVu Sans Mono" w:hAnsi="DejaVu Sans Mono"/>
@@ -18391,7 +19752,17 @@
                 <w:sz w:val="18"/>
                 <w:lang w:val="en-US"/>
               </w:rPr>
-              <w:t>compagnie_fk =</w:t>
+              <w:t>compagnie_fk</w:t>
+            </w:r>
+            <w:proofErr w:type="spellEnd"/>
+            <w:r>
+              <w:rPr>
+                <w:rFonts w:ascii="DejaVu Sans Mono" w:hAnsi="DejaVu Sans Mono"/>
+                <w:color w:val="25364B"/>
+                <w:sz w:val="18"/>
+                <w:lang w:val="en-US"/>
+              </w:rPr>
+              <w:t xml:space="preserve"> =</w:t>
             </w:r>
             <w:r>
               <w:t xml:space="preserve"> </w:t>
@@ -18481,6 +19852,7 @@
               </w:rPr>
               <w:t xml:space="preserve"> </w:t>
             </w:r>
+            <w:proofErr w:type="spellStart"/>
             <w:r>
               <w:rPr>
                 <w:rFonts w:ascii="DejaVu Sans Mono" w:hAnsi="DejaVu Sans Mono"/>
@@ -18488,7 +19860,17 @@
                 <w:sz w:val="18"/>
                 <w:lang w:val="en-US"/>
               </w:rPr>
-              <w:t xml:space="preserve">capacite </w:t>
+              <w:t>capacite</w:t>
+            </w:r>
+            <w:proofErr w:type="spellEnd"/>
+            <w:r>
+              <w:rPr>
+                <w:rFonts w:ascii="DejaVu Sans Mono" w:hAnsi="DejaVu Sans Mono"/>
+                <w:color w:val="25364B"/>
+                <w:sz w:val="18"/>
+                <w:lang w:val="en-US"/>
+              </w:rPr>
+              <w:t xml:space="preserve"> </w:t>
             </w:r>
             <w:r>
               <w:rPr>
@@ -18965,6 +20347,7 @@
               </w:rPr>
               <w:t xml:space="preserve"> </w:t>
             </w:r>
+            <w:proofErr w:type="spellStart"/>
             <w:r>
               <w:rPr>
                 <w:rFonts w:ascii="DejaVu Sans Mono" w:hAnsi="DejaVu Sans Mono"/>
@@ -18974,6 +20357,7 @@
               </w:rPr>
               <w:t>heure_depart</w:t>
             </w:r>
+            <w:proofErr w:type="spellEnd"/>
             <w:r>
               <w:rPr>
                 <w:rFonts w:ascii="DejaVu Sans Mono" w:hAnsi="DejaVu Sans Mono"/>
@@ -19286,8 +20670,39 @@
                 <w:color w:val="315BC0"/>
                 <w:sz w:val="18"/>
               </w:rPr>
-              <w:t>SELECT compagnie_fk, COUNT(*) AS nombre_vols</w:t>
-            </w:r>
+              <w:t xml:space="preserve">SELECT </w:t>
+            </w:r>
+            <w:proofErr w:type="spellStart"/>
+            <w:r>
+              <w:rPr>
+                <w:rFonts w:ascii="DejaVu Sans Mono" w:hAnsi="DejaVu Sans Mono"/>
+                <w:b/>
+                <w:color w:val="315BC0"/>
+                <w:sz w:val="18"/>
+              </w:rPr>
+              <w:t>compagnie_fk</w:t>
+            </w:r>
+            <w:proofErr w:type="spellEnd"/>
+            <w:r>
+              <w:rPr>
+                <w:rFonts w:ascii="DejaVu Sans Mono" w:hAnsi="DejaVu Sans Mono"/>
+                <w:b/>
+                <w:color w:val="315BC0"/>
+                <w:sz w:val="18"/>
+              </w:rPr>
+              <w:t xml:space="preserve">, COUNT(*) AS </w:t>
+            </w:r>
+            <w:proofErr w:type="spellStart"/>
+            <w:r>
+              <w:rPr>
+                <w:rFonts w:ascii="DejaVu Sans Mono" w:hAnsi="DejaVu Sans Mono"/>
+                <w:b/>
+                <w:color w:val="315BC0"/>
+                <w:sz w:val="18"/>
+              </w:rPr>
+              <w:t>nombre_vols</w:t>
+            </w:r>
+            <w:proofErr w:type="spellEnd"/>
           </w:p>
         </w:tc>
       </w:tr>
@@ -19475,6 +20890,7 @@
               </w:rPr>
               <w:t xml:space="preserve"> </w:t>
             </w:r>
+            <w:proofErr w:type="spellStart"/>
             <w:r>
               <w:rPr>
                 <w:rFonts w:ascii="DejaVu Sans Mono" w:hAnsi="DejaVu Sans Mono"/>
@@ -19484,6 +20900,7 @@
               </w:rPr>
               <w:t>compagnie_fk</w:t>
             </w:r>
+            <w:proofErr w:type="spellEnd"/>
           </w:p>
         </w:tc>
       </w:tr>
@@ -19558,6 +20975,7 @@
               </w:rPr>
               <w:t xml:space="preserve">ORDER BY </w:t>
             </w:r>
+            <w:proofErr w:type="spellStart"/>
             <w:r>
               <w:rPr>
                 <w:rFonts w:ascii="DejaVu Sans Mono" w:hAnsi="DejaVu Sans Mono"/>
@@ -19567,6 +20985,7 @@
               </w:rPr>
               <w:t>nombre_vols</w:t>
             </w:r>
+            <w:proofErr w:type="spellEnd"/>
             <w:r>
               <w:rPr>
                 <w:rFonts w:ascii="DejaVu Sans Mono" w:hAnsi="DejaVu Sans Mono"/>
@@ -19817,8 +21236,82 @@
               <w:rPr>
                 <w:lang w:val="en-US"/>
               </w:rPr>
-              <w:t>SELECT P.nom, P.prenom, P.numero_passeport, A.nom AS aeroport_depart</w:t>
-            </w:r>
+              <w:t xml:space="preserve">SELECT </w:t>
+            </w:r>
+            <w:proofErr w:type="spellStart"/>
+            <w:r>
+              <w:rPr>
+                <w:lang w:val="en-US"/>
+              </w:rPr>
+              <w:t>P.nom</w:t>
+            </w:r>
+            <w:proofErr w:type="spellEnd"/>
+            <w:r>
+              <w:rPr>
+                <w:lang w:val="en-US"/>
+              </w:rPr>
+              <w:t xml:space="preserve">, </w:t>
+            </w:r>
+            <w:proofErr w:type="spellStart"/>
+            <w:proofErr w:type="gramStart"/>
+            <w:r>
+              <w:rPr>
+                <w:lang w:val="en-US"/>
+              </w:rPr>
+              <w:t>P.prenom</w:t>
+            </w:r>
+            <w:proofErr w:type="spellEnd"/>
+            <w:proofErr w:type="gramEnd"/>
+            <w:r>
+              <w:rPr>
+                <w:lang w:val="en-US"/>
+              </w:rPr>
+              <w:t xml:space="preserve">, </w:t>
+            </w:r>
+            <w:proofErr w:type="spellStart"/>
+            <w:proofErr w:type="gramStart"/>
+            <w:r>
+              <w:rPr>
+                <w:lang w:val="en-US"/>
+              </w:rPr>
+              <w:t>P.numero</w:t>
+            </w:r>
+            <w:proofErr w:type="gramEnd"/>
+            <w:r>
+              <w:rPr>
+                <w:lang w:val="en-US"/>
+              </w:rPr>
+              <w:t>_passeport</w:t>
+            </w:r>
+            <w:proofErr w:type="spellEnd"/>
+            <w:r>
+              <w:rPr>
+                <w:lang w:val="en-US"/>
+              </w:rPr>
+              <w:t xml:space="preserve">, </w:t>
+            </w:r>
+            <w:proofErr w:type="spellStart"/>
+            <w:r>
+              <w:rPr>
+                <w:lang w:val="en-US"/>
+              </w:rPr>
+              <w:t>A.nom</w:t>
+            </w:r>
+            <w:proofErr w:type="spellEnd"/>
+            <w:r>
+              <w:rPr>
+                <w:lang w:val="en-US"/>
+              </w:rPr>
+              <w:t xml:space="preserve"> AS </w:t>
+            </w:r>
+            <w:proofErr w:type="spellStart"/>
+            <w:r>
+              <w:rPr>
+                <w:lang w:val="en-US"/>
+              </w:rPr>
+              <w:t>aeroport_depart</w:t>
+            </w:r>
+            <w:proofErr w:type="spellEnd"/>
           </w:p>
         </w:tc>
       </w:tr>
@@ -19887,7 +21380,21 @@
               <w:rPr>
                 <w:lang w:val="en-US"/>
               </w:rPr>
-              <w:t>FROM t_passager AS P</w:t>
+              <w:t xml:space="preserve">FROM </w:t>
+            </w:r>
+            <w:proofErr w:type="spellStart"/>
+            <w:r>
+              <w:rPr>
+                <w:lang w:val="en-US"/>
+              </w:rPr>
+              <w:t>t_passager</w:t>
+            </w:r>
+            <w:proofErr w:type="spellEnd"/>
+            <w:r>
+              <w:rPr>
+                <w:lang w:val="en-US"/>
+              </w:rPr>
+              <w:t xml:space="preserve"> AS P</w:t>
             </w:r>
           </w:p>
         </w:tc>
@@ -19957,8 +21464,46 @@
               <w:rPr>
                 <w:lang w:val="en-US"/>
               </w:rPr>
-              <w:t>JOIN t_reservation AS R ON R.passager_fk = P.passager_id</w:t>
-            </w:r>
+              <w:t xml:space="preserve">JOIN t_reservation AS R ON </w:t>
+            </w:r>
+            <w:proofErr w:type="spellStart"/>
+            <w:proofErr w:type="gramStart"/>
+            <w:r>
+              <w:rPr>
+                <w:lang w:val="en-US"/>
+              </w:rPr>
+              <w:t>R.passager</w:t>
+            </w:r>
+            <w:proofErr w:type="gramEnd"/>
+            <w:r>
+              <w:rPr>
+                <w:lang w:val="en-US"/>
+              </w:rPr>
+              <w:t>_fk</w:t>
+            </w:r>
+            <w:proofErr w:type="spellEnd"/>
+            <w:r>
+              <w:rPr>
+                <w:lang w:val="en-US"/>
+              </w:rPr>
+              <w:t xml:space="preserve"> = </w:t>
+            </w:r>
+            <w:proofErr w:type="spellStart"/>
+            <w:proofErr w:type="gramStart"/>
+            <w:r>
+              <w:rPr>
+                <w:lang w:val="en-US"/>
+              </w:rPr>
+              <w:t>P.passager</w:t>
+            </w:r>
+            <w:proofErr w:type="gramEnd"/>
+            <w:r>
+              <w:rPr>
+                <w:lang w:val="en-US"/>
+              </w:rPr>
+              <w:t>_id</w:t>
+            </w:r>
+            <w:proofErr w:type="spellEnd"/>
           </w:p>
         </w:tc>
       </w:tr>
@@ -20027,8 +21572,30 @@
               <w:rPr>
                 <w:lang w:val="en-US"/>
               </w:rPr>
-              <w:t>JOIN t_vol AS V ON V.vol_id = R.vol_fk</w:t>
-            </w:r>
+              <w:t xml:space="preserve">JOIN t_vol AS V ON </w:t>
+            </w:r>
+            <w:proofErr w:type="spellStart"/>
+            <w:r>
+              <w:rPr>
+                <w:lang w:val="en-US"/>
+              </w:rPr>
+              <w:t>V.vol_id</w:t>
+            </w:r>
+            <w:proofErr w:type="spellEnd"/>
+            <w:r>
+              <w:rPr>
+                <w:lang w:val="en-US"/>
+              </w:rPr>
+              <w:t xml:space="preserve"> = </w:t>
+            </w:r>
+            <w:proofErr w:type="spellStart"/>
+            <w:r>
+              <w:rPr>
+                <w:lang w:val="en-US"/>
+              </w:rPr>
+              <w:t>R.vol_fk</w:t>
+            </w:r>
+            <w:proofErr w:type="spellEnd"/>
           </w:p>
         </w:tc>
       </w:tr>
@@ -20102,7 +21669,65 @@
               <w:rPr>
                 <w:lang w:val="en-US"/>
               </w:rPr>
-              <w:t>JOIN t_aeroport AS A ON A.aeroport_id = V.aeroport_depart_fk;</w:t>
+              <w:t xml:space="preserve">JOIN </w:t>
+            </w:r>
+            <w:proofErr w:type="spellStart"/>
+            <w:r>
+              <w:rPr>
+                <w:lang w:val="en-US"/>
+              </w:rPr>
+              <w:t>t_aeroport</w:t>
+            </w:r>
+            <w:proofErr w:type="spellEnd"/>
+            <w:r>
+              <w:rPr>
+                <w:lang w:val="en-US"/>
+              </w:rPr>
+              <w:t xml:space="preserve"> AS A ON </w:t>
+            </w:r>
+            <w:proofErr w:type="spellStart"/>
+            <w:proofErr w:type="gramStart"/>
+            <w:r>
+              <w:rPr>
+                <w:lang w:val="en-US"/>
+              </w:rPr>
+              <w:t>A.aeroport</w:t>
+            </w:r>
+            <w:proofErr w:type="gramEnd"/>
+            <w:r>
+              <w:rPr>
+                <w:lang w:val="en-US"/>
+              </w:rPr>
+              <w:t>_id</w:t>
+            </w:r>
+            <w:proofErr w:type="spellEnd"/>
+            <w:r>
+              <w:rPr>
+                <w:lang w:val="en-US"/>
+              </w:rPr>
+              <w:t xml:space="preserve"> = </w:t>
+            </w:r>
+            <w:proofErr w:type="spellStart"/>
+            <w:proofErr w:type="gramStart"/>
+            <w:r>
+              <w:rPr>
+                <w:lang w:val="en-US"/>
+              </w:rPr>
+              <w:t>V.aeroport</w:t>
+            </w:r>
+            <w:proofErr w:type="gramEnd"/>
+            <w:r>
+              <w:rPr>
+                <w:lang w:val="en-US"/>
+              </w:rPr>
+              <w:t>_depart_fk</w:t>
+            </w:r>
+            <w:proofErr w:type="spellEnd"/>
+            <w:r>
+              <w:rPr>
+                <w:lang w:val="en-US"/>
+              </w:rPr>
+              <w:t>;</w:t>
             </w:r>
           </w:p>
         </w:tc>
@@ -20443,8 +22068,21 @@
               <w:spacing w:after="0" w:line="240" w:lineRule="auto"/>
             </w:pPr>
             <w:r>
-              <w:t>SELECT vol_fk, AVG(prix) AS prix_moyen</w:t>
-            </w:r>
+              <w:t xml:space="preserve">SELECT </w:t>
+            </w:r>
+            <w:proofErr w:type="spellStart"/>
+            <w:r>
+              <w:t>vol_fk</w:t>
+            </w:r>
+            <w:proofErr w:type="spellEnd"/>
+            <w:r>
+              <w:t xml:space="preserve">, AVG(prix) AS </w:t>
+            </w:r>
+            <w:proofErr w:type="spellStart"/>
+            <w:r>
+              <w:t>prix_moyen</w:t>
+            </w:r>
+            <w:proofErr w:type="spellEnd"/>
           </w:p>
         </w:tc>
       </w:tr>
@@ -20509,11 +22147,19 @@
                 <w:lang w:val="en-US"/>
               </w:rPr>
             </w:pPr>
+            <w:proofErr w:type="gramStart"/>
             <w:r>
               <w:rPr>
                 <w:lang w:val="en-US"/>
               </w:rPr>
-              <w:t>FROM t_reservation</w:t>
+              <w:t>FROM t</w:t>
+            </w:r>
+            <w:proofErr w:type="gramEnd"/>
+            <w:r>
+              <w:rPr>
+                <w:lang w:val="en-US"/>
+              </w:rPr>
+              <w:t>_reservation</w:t>
             </w:r>
           </w:p>
         </w:tc>
@@ -20583,8 +22229,16 @@
               <w:rPr>
                 <w:lang w:val="en-US"/>
               </w:rPr>
-              <w:t>GROUP BY vol_fk</w:t>
-            </w:r>
+              <w:t xml:space="preserve">GROUP BY </w:t>
+            </w:r>
+            <w:proofErr w:type="spellStart"/>
+            <w:r>
+              <w:rPr>
+                <w:lang w:val="en-US"/>
+              </w:rPr>
+              <w:t>vol_fk</w:t>
+            </w:r>
+            <w:proofErr w:type="spellEnd"/>
           </w:p>
         </w:tc>
       </w:tr>
@@ -20653,7 +22307,21 @@
               <w:rPr>
                 <w:lang w:val="en-US"/>
               </w:rPr>
-              <w:t>ORDER BY prix_moyen ASC;</w:t>
+              <w:t xml:space="preserve">ORDER BY </w:t>
+            </w:r>
+            <w:proofErr w:type="spellStart"/>
+            <w:r>
+              <w:rPr>
+                <w:lang w:val="en-US"/>
+              </w:rPr>
+              <w:t>prix_moyen</w:t>
+            </w:r>
+            <w:proofErr w:type="spellEnd"/>
+            <w:r>
+              <w:rPr>
+                <w:lang w:val="en-US"/>
+              </w:rPr>
+              <w:t xml:space="preserve"> ASC;</w:t>
             </w:r>
           </w:p>
         </w:tc>
@@ -21081,7 +22749,7 @@
           <w:szCs w:val="36"/>
         </w:rPr>
       </w:pPr>
-      <w:bookmarkStart w:id="13" w:name="_Toc244067188"/>
+      <w:bookmarkStart w:id="15" w:name="_Toc244067509"/>
       <w:r>
         <w:rPr>
           <w:rFonts w:ascii="Calibri" w:hAnsi="Calibri" w:cs="Calibri"/>
@@ -21092,7 +22760,7 @@
         </w:rPr>
         <w:t>3.5 Index</w:t>
       </w:r>
-      <w:bookmarkEnd w:id="13"/>
+      <w:bookmarkEnd w:id="15"/>
     </w:p>
     <w:p>
       <w:pPr>
@@ -21106,7 +22774,7 @@
           <w:szCs w:val="36"/>
         </w:rPr>
       </w:pPr>
-      <w:bookmarkStart w:id="14" w:name="_Toc244067189"/>
+      <w:bookmarkStart w:id="16" w:name="_Toc244067510"/>
       <w:r>
         <w:rPr>
           <w:rFonts w:ascii="Calibri" w:hAnsi="Calibri" w:cs="Calibri"/>
@@ -21117,7 +22785,7 @@
         </w:rPr>
         <w:t>3.6 Utilisateurs et rôles</w:t>
       </w:r>
-      <w:bookmarkEnd w:id="14"/>
+      <w:bookmarkEnd w:id="16"/>
     </w:p>
     <w:p>
       <w:pPr>
@@ -21131,7 +22799,7 @@
           <w:szCs w:val="36"/>
         </w:rPr>
       </w:pPr>
-      <w:bookmarkStart w:id="15" w:name="_Toc244067190"/>
+      <w:bookmarkStart w:id="17" w:name="_Toc244067511"/>
       <w:r>
         <w:rPr>
           <w:rFonts w:ascii="Calibri" w:hAnsi="Calibri" w:cs="Calibri"/>
@@ -21142,7 +22810,7 @@
         </w:rPr>
         <w:t>3.7 Transaction</w:t>
       </w:r>
-      <w:bookmarkEnd w:id="15"/>
+      <w:bookmarkEnd w:id="17"/>
     </w:p>
     <w:p>
       <w:pPr>
@@ -21154,7 +22822,7 @@
           <w:bCs/>
         </w:rPr>
       </w:pPr>
-      <w:bookmarkStart w:id="16" w:name="_Toc244067191"/>
+      <w:bookmarkStart w:id="18" w:name="_Toc244067512"/>
       <w:r>
         <w:rPr>
           <w:rFonts w:ascii="Calibri" w:hAnsi="Calibri" w:cs="Calibri"/>
@@ -21171,7 +22839,7 @@
         </w:rPr>
         <w:t>Utilisation de l’IA</w:t>
       </w:r>
-      <w:bookmarkEnd w:id="16"/>
+      <w:bookmarkEnd w:id="18"/>
     </w:p>
     <w:p>
       <w:pPr>
@@ -21182,7 +22850,7 @@
           <w:bCs/>
         </w:rPr>
       </w:pPr>
-      <w:bookmarkStart w:id="17" w:name="_Toc244067192"/>
+      <w:bookmarkStart w:id="19" w:name="_Toc244067513"/>
       <w:r>
         <w:rPr>
           <w:rFonts w:ascii="Calibri" w:hAnsi="Calibri" w:cs="Calibri"/>
@@ -21191,7 +22859,7 @@
         </w:rPr>
         <w:t>5. Conclusion</w:t>
       </w:r>
-      <w:bookmarkEnd w:id="17"/>
+      <w:bookmarkEnd w:id="19"/>
     </w:p>
     <w:p>
       <w:pPr>
@@ -21202,7 +22870,7 @@
           <w:bCs/>
         </w:rPr>
       </w:pPr>
-      <w:bookmarkStart w:id="18" w:name="_Toc244067193"/>
+      <w:bookmarkStart w:id="20" w:name="_Toc244067514"/>
       <w:r>
         <w:rPr>
           <w:rFonts w:ascii="Calibri" w:hAnsi="Calibri" w:cs="Calibri"/>
@@ -21211,7 +22879,7 @@
         </w:rPr>
         <w:t>6. Sources</w:t>
       </w:r>
-      <w:bookmarkEnd w:id="18"/>
+      <w:bookmarkEnd w:id="20"/>
     </w:p>
     <w:p>
       <w:pPr>
@@ -21222,7 +22890,7 @@
           <w:bCs/>
         </w:rPr>
       </w:pPr>
-      <w:bookmarkStart w:id="19" w:name="_Toc244067194"/>
+      <w:bookmarkStart w:id="21" w:name="_Toc244067515"/>
       <w:r>
         <w:rPr>
           <w:rFonts w:ascii="Calibri" w:hAnsi="Calibri" w:cs="Calibri"/>
@@ -21231,7 +22899,7 @@
         </w:rPr>
         <w:t>7. Annexes</w:t>
       </w:r>
-      <w:bookmarkEnd w:id="19"/>
+      <w:bookmarkEnd w:id="21"/>
     </w:p>
     <w:sectPr>
       <w:footerReference w:type="first" r:id="rId29"/>

</xml_diff>

<commit_message>
doc(rapport): Ajout du MCD et MLD
</commit_message>
<xml_diff>
--- a/DOC/src/AugustoRomain-P_DB_GestionAeroport-Rapport.docx
+++ b/DOC/src/AugustoRomain-P_DB_GestionAeroport-Rapport.docx
@@ -1844,7 +1844,7 @@
           <w:r>
             <w:fldChar w:fldCharType="separate"/>
           </w:r>
-          <w:hyperlink w:anchor="_Toc244067494" w:history="1">
+          <w:hyperlink w:anchor="_Toc244069772" w:history="1">
             <w:r>
               <w:rPr>
                 <w:rStyle w:val="Lienhypertexte"/>
@@ -1868,7 +1868,7 @@
               <w:rPr>
                 <w:webHidden/>
               </w:rPr>
-              <w:instrText xml:space="preserve"> PAGEREF _Toc244067494 \h </w:instrText>
+              <w:instrText xml:space="preserve"> PAGEREF _Toc244069772 \h </w:instrText>
             </w:r>
             <w:r>
               <w:rPr>
@@ -1905,7 +1905,7 @@
               <w:lang w:eastAsia="fr-CH"/>
             </w:rPr>
           </w:pPr>
-          <w:hyperlink w:anchor="_Toc244067495" w:history="1">
+          <w:hyperlink w:anchor="_Toc244069773" w:history="1">
             <w:r>
               <w:rPr>
                 <w:rStyle w:val="Lienhypertexte"/>
@@ -1929,7 +1929,7 @@
               <w:rPr>
                 <w:webHidden/>
               </w:rPr>
-              <w:instrText xml:space="preserve"> PAGEREF _Toc244067495 \h </w:instrText>
+              <w:instrText xml:space="preserve"> PAGEREF _Toc244069773 \h </w:instrText>
             </w:r>
             <w:r>
               <w:rPr>
@@ -1966,7 +1966,7 @@
               <w:lang w:eastAsia="fr-CH"/>
             </w:rPr>
           </w:pPr>
-          <w:hyperlink w:anchor="_Toc244067496" w:history="1">
+          <w:hyperlink w:anchor="_Toc244069774" w:history="1">
             <w:r>
               <w:rPr>
                 <w:rStyle w:val="Lienhypertexte"/>
@@ -1990,7 +1990,7 @@
               <w:rPr>
                 <w:webHidden/>
               </w:rPr>
-              <w:instrText xml:space="preserve"> PAGEREF _Toc244067496 \h </w:instrText>
+              <w:instrText xml:space="preserve"> PAGEREF _Toc244069774 \h </w:instrText>
             </w:r>
             <w:r>
               <w:rPr>
@@ -2029,7 +2029,7 @@
               <w:lang w:eastAsia="fr-CH"/>
             </w:rPr>
           </w:pPr>
-          <w:hyperlink w:anchor="_Toc244067497" w:history="1">
+          <w:hyperlink w:anchor="_Toc244069775" w:history="1">
             <w:r>
               <w:rPr>
                 <w:rStyle w:val="Lienhypertexte"/>
@@ -2059,7 +2059,7 @@
                 <w:noProof/>
                 <w:webHidden/>
               </w:rPr>
-              <w:instrText xml:space="preserve"> PAGEREF _Toc244067497 \h </w:instrText>
+              <w:instrText xml:space="preserve"> PAGEREF _Toc244069775 \h </w:instrText>
             </w:r>
             <w:r>
               <w:rPr>
@@ -2102,7 +2102,7 @@
               <w:lang w:eastAsia="fr-CH"/>
             </w:rPr>
           </w:pPr>
-          <w:hyperlink w:anchor="_Toc244067498" w:history="1">
+          <w:hyperlink w:anchor="_Toc244069776" w:history="1">
             <w:r>
               <w:rPr>
                 <w:rStyle w:val="Lienhypertexte"/>
@@ -2132,7 +2132,7 @@
                 <w:noProof/>
                 <w:webHidden/>
               </w:rPr>
-              <w:instrText xml:space="preserve"> PAGEREF _Toc244067498 \h </w:instrText>
+              <w:instrText xml:space="preserve"> PAGEREF _Toc244069776 \h </w:instrText>
             </w:r>
             <w:r>
               <w:rPr>
@@ -2175,7 +2175,7 @@
               <w:lang w:eastAsia="fr-CH"/>
             </w:rPr>
           </w:pPr>
-          <w:hyperlink w:anchor="_Toc244067499" w:history="1">
+          <w:hyperlink w:anchor="_Toc244069777" w:history="1">
             <w:r>
               <w:rPr>
                 <w:rStyle w:val="Lienhypertexte"/>
@@ -2205,7 +2205,7 @@
                 <w:noProof/>
                 <w:webHidden/>
               </w:rPr>
-              <w:instrText xml:space="preserve"> PAGEREF _Toc244067499 \h </w:instrText>
+              <w:instrText xml:space="preserve"> PAGEREF _Toc244069777 \h </w:instrText>
             </w:r>
             <w:r>
               <w:rPr>
@@ -2248,7 +2248,7 @@
               <w:lang w:eastAsia="fr-CH"/>
             </w:rPr>
           </w:pPr>
-          <w:hyperlink w:anchor="_Toc244067500" w:history="1">
+          <w:hyperlink w:anchor="_Toc244069778" w:history="1">
             <w:r>
               <w:rPr>
                 <w:rStyle w:val="Lienhypertexte"/>
@@ -2278,7 +2278,7 @@
                 <w:noProof/>
                 <w:webHidden/>
               </w:rPr>
-              <w:instrText xml:space="preserve"> PAGEREF _Toc244067500 \h </w:instrText>
+              <w:instrText xml:space="preserve"> PAGEREF _Toc244069778 \h </w:instrText>
             </w:r>
             <w:r>
               <w:rPr>
@@ -2321,7 +2321,7 @@
               <w:lang w:eastAsia="fr-CH"/>
             </w:rPr>
           </w:pPr>
-          <w:hyperlink w:anchor="_Toc244067501" w:history="1">
+          <w:hyperlink w:anchor="_Toc244069779" w:history="1">
             <w:r>
               <w:rPr>
                 <w:rStyle w:val="Lienhypertexte"/>
@@ -2351,7 +2351,7 @@
                 <w:noProof/>
                 <w:webHidden/>
               </w:rPr>
-              <w:instrText xml:space="preserve"> PAGEREF _Toc244067501 \h </w:instrText>
+              <w:instrText xml:space="preserve"> PAGEREF _Toc244069779 \h </w:instrText>
             </w:r>
             <w:r>
               <w:rPr>
@@ -2394,7 +2394,7 @@
               <w:lang w:eastAsia="fr-CH"/>
             </w:rPr>
           </w:pPr>
-          <w:hyperlink w:anchor="_Toc244067502" w:history="1">
+          <w:hyperlink w:anchor="_Toc244069780" w:history="1">
             <w:r>
               <w:rPr>
                 <w:rStyle w:val="Lienhypertexte"/>
@@ -2424,7 +2424,7 @@
                 <w:noProof/>
                 <w:webHidden/>
               </w:rPr>
-              <w:instrText xml:space="preserve"> PAGEREF _Toc244067502 \h </w:instrText>
+              <w:instrText xml:space="preserve"> PAGEREF _Toc244069780 \h </w:instrText>
             </w:r>
             <w:r>
               <w:rPr>
@@ -2467,7 +2467,7 @@
               <w:lang w:eastAsia="fr-CH"/>
             </w:rPr>
           </w:pPr>
-          <w:hyperlink w:anchor="_Toc244067503" w:history="1">
+          <w:hyperlink w:anchor="_Toc244069781" w:history="1">
             <w:r>
               <w:rPr>
                 <w:rStyle w:val="Lienhypertexte"/>
@@ -2497,7 +2497,7 @@
                 <w:noProof/>
                 <w:webHidden/>
               </w:rPr>
-              <w:instrText xml:space="preserve"> PAGEREF _Toc244067503 \h </w:instrText>
+              <w:instrText xml:space="preserve"> PAGEREF _Toc244069781 \h </w:instrText>
             </w:r>
             <w:r>
               <w:rPr>
@@ -2540,7 +2540,7 @@
               <w:lang w:eastAsia="fr-CH"/>
             </w:rPr>
           </w:pPr>
-          <w:hyperlink w:anchor="_Toc244067504" w:history="1">
+          <w:hyperlink w:anchor="_Toc244069782" w:history="1">
             <w:r>
               <w:rPr>
                 <w:rStyle w:val="Lienhypertexte"/>
@@ -2570,7 +2570,7 @@
                 <w:noProof/>
                 <w:webHidden/>
               </w:rPr>
-              <w:instrText xml:space="preserve"> PAGEREF _Toc244067504 \h </w:instrText>
+              <w:instrText xml:space="preserve"> PAGEREF _Toc244069782 \h </w:instrText>
             </w:r>
             <w:r>
               <w:rPr>
@@ -2613,7 +2613,7 @@
               <w:lang w:eastAsia="fr-CH"/>
             </w:rPr>
           </w:pPr>
-          <w:hyperlink w:anchor="_Toc244067505" w:history="1">
+          <w:hyperlink w:anchor="_Toc244069783" w:history="1">
             <w:r>
               <w:rPr>
                 <w:rStyle w:val="Lienhypertexte"/>
@@ -2643,7 +2643,7 @@
                 <w:noProof/>
                 <w:webHidden/>
               </w:rPr>
-              <w:instrText xml:space="preserve"> PAGEREF _Toc244067505 \h </w:instrText>
+              <w:instrText xml:space="preserve"> PAGEREF _Toc244069783 \h </w:instrText>
             </w:r>
             <w:r>
               <w:rPr>
@@ -2663,7 +2663,7 @@
                 <w:noProof/>
                 <w:webHidden/>
               </w:rPr>
-              <w:t>9</w:t>
+              <w:t>10</w:t>
             </w:r>
             <w:r>
               <w:rPr>
@@ -2686,7 +2686,7 @@
               <w:lang w:eastAsia="fr-CH"/>
             </w:rPr>
           </w:pPr>
-          <w:hyperlink w:anchor="_Toc244067506" w:history="1">
+          <w:hyperlink w:anchor="_Toc244069784" w:history="1">
             <w:r>
               <w:rPr>
                 <w:rStyle w:val="Lienhypertexte"/>
@@ -2716,7 +2716,7 @@
                 <w:noProof/>
                 <w:webHidden/>
               </w:rPr>
-              <w:instrText xml:space="preserve"> PAGEREF _Toc244067506 \h </w:instrText>
+              <w:instrText xml:space="preserve"> PAGEREF _Toc244069784 \h </w:instrText>
             </w:r>
             <w:r>
               <w:rPr>
@@ -2736,7 +2736,7 @@
                 <w:noProof/>
                 <w:webHidden/>
               </w:rPr>
-              <w:t>9</w:t>
+              <w:t>11</w:t>
             </w:r>
             <w:r>
               <w:rPr>
@@ -2759,7 +2759,7 @@
               <w:lang w:eastAsia="fr-CH"/>
             </w:rPr>
           </w:pPr>
-          <w:hyperlink w:anchor="_Toc244067507" w:history="1">
+          <w:hyperlink w:anchor="_Toc244069785" w:history="1">
             <w:r>
               <w:rPr>
                 <w:rStyle w:val="Lienhypertexte"/>
@@ -2789,7 +2789,7 @@
                 <w:noProof/>
                 <w:webHidden/>
               </w:rPr>
-              <w:instrText xml:space="preserve"> PAGEREF _Toc244067507 \h </w:instrText>
+              <w:instrText xml:space="preserve"> PAGEREF _Toc244069785 \h </w:instrText>
             </w:r>
             <w:r>
               <w:rPr>
@@ -2809,7 +2809,7 @@
                 <w:noProof/>
                 <w:webHidden/>
               </w:rPr>
-              <w:t>10</w:t>
+              <w:t>12</w:t>
             </w:r>
             <w:r>
               <w:rPr>
@@ -2832,7 +2832,7 @@
               <w:lang w:eastAsia="fr-CH"/>
             </w:rPr>
           </w:pPr>
-          <w:hyperlink w:anchor="_Toc244067508" w:history="1">
+          <w:hyperlink w:anchor="_Toc244069786" w:history="1">
             <w:r>
               <w:rPr>
                 <w:rStyle w:val="Lienhypertexte"/>
@@ -2862,7 +2862,7 @@
                 <w:noProof/>
                 <w:webHidden/>
               </w:rPr>
-              <w:instrText xml:space="preserve"> PAGEREF _Toc244067508 \h </w:instrText>
+              <w:instrText xml:space="preserve"> PAGEREF _Toc244069786 \h </w:instrText>
             </w:r>
             <w:r>
               <w:rPr>
@@ -2882,7 +2882,7 @@
                 <w:noProof/>
                 <w:webHidden/>
               </w:rPr>
-              <w:t>18</w:t>
+              <w:t>20</w:t>
             </w:r>
             <w:r>
               <w:rPr>
@@ -2905,7 +2905,7 @@
               <w:lang w:eastAsia="fr-CH"/>
             </w:rPr>
           </w:pPr>
-          <w:hyperlink w:anchor="_Toc244067509" w:history="1">
+          <w:hyperlink w:anchor="_Toc244069787" w:history="1">
             <w:r>
               <w:rPr>
                 <w:rStyle w:val="Lienhypertexte"/>
@@ -2935,7 +2935,7 @@
                 <w:noProof/>
                 <w:webHidden/>
               </w:rPr>
-              <w:instrText xml:space="preserve"> PAGEREF _Toc244067509 \h </w:instrText>
+              <w:instrText xml:space="preserve"> PAGEREF _Toc244069787 \h </w:instrText>
             </w:r>
             <w:r>
               <w:rPr>
@@ -2955,7 +2955,7 @@
                 <w:noProof/>
                 <w:webHidden/>
               </w:rPr>
-              <w:t>22</w:t>
+              <w:t>24</w:t>
             </w:r>
             <w:r>
               <w:rPr>
@@ -2978,7 +2978,7 @@
               <w:lang w:eastAsia="fr-CH"/>
             </w:rPr>
           </w:pPr>
-          <w:hyperlink w:anchor="_Toc244067510" w:history="1">
+          <w:hyperlink w:anchor="_Toc244069788" w:history="1">
             <w:r>
               <w:rPr>
                 <w:rStyle w:val="Lienhypertexte"/>
@@ -3008,7 +3008,7 @@
                 <w:noProof/>
                 <w:webHidden/>
               </w:rPr>
-              <w:instrText xml:space="preserve"> PAGEREF _Toc244067510 \h </w:instrText>
+              <w:instrText xml:space="preserve"> PAGEREF _Toc244069788 \h </w:instrText>
             </w:r>
             <w:r>
               <w:rPr>
@@ -3028,7 +3028,7 @@
                 <w:noProof/>
                 <w:webHidden/>
               </w:rPr>
-              <w:t>22</w:t>
+              <w:t>24</w:t>
             </w:r>
             <w:r>
               <w:rPr>
@@ -3051,7 +3051,7 @@
               <w:lang w:eastAsia="fr-CH"/>
             </w:rPr>
           </w:pPr>
-          <w:hyperlink w:anchor="_Toc244067511" w:history="1">
+          <w:hyperlink w:anchor="_Toc244069789" w:history="1">
             <w:r>
               <w:rPr>
                 <w:rStyle w:val="Lienhypertexte"/>
@@ -3081,7 +3081,7 @@
                 <w:noProof/>
                 <w:webHidden/>
               </w:rPr>
-              <w:instrText xml:space="preserve"> PAGEREF _Toc244067511 \h </w:instrText>
+              <w:instrText xml:space="preserve"> PAGEREF _Toc244069789 \h </w:instrText>
             </w:r>
             <w:r>
               <w:rPr>
@@ -3101,7 +3101,7 @@
                 <w:noProof/>
                 <w:webHidden/>
               </w:rPr>
-              <w:t>22</w:t>
+              <w:t>24</w:t>
             </w:r>
             <w:r>
               <w:rPr>
@@ -3122,7 +3122,7 @@
               <w:lang w:eastAsia="fr-CH"/>
             </w:rPr>
           </w:pPr>
-          <w:hyperlink w:anchor="_Toc244067512" w:history="1">
+          <w:hyperlink w:anchor="_Toc244069790" w:history="1">
             <w:r>
               <w:rPr>
                 <w:rStyle w:val="Lienhypertexte"/>
@@ -3146,7 +3146,7 @@
               <w:rPr>
                 <w:webHidden/>
               </w:rPr>
-              <w:instrText xml:space="preserve"> PAGEREF _Toc244067512 \h </w:instrText>
+              <w:instrText xml:space="preserve"> PAGEREF _Toc244069790 \h </w:instrText>
             </w:r>
             <w:r>
               <w:rPr>
@@ -3163,7 +3163,7 @@
               <w:rPr>
                 <w:webHidden/>
               </w:rPr>
-              <w:t>22</w:t>
+              <w:t>24</w:t>
             </w:r>
             <w:r>
               <w:rPr>
@@ -3183,7 +3183,7 @@
               <w:lang w:eastAsia="fr-CH"/>
             </w:rPr>
           </w:pPr>
-          <w:hyperlink w:anchor="_Toc244067513" w:history="1">
+          <w:hyperlink w:anchor="_Toc244069791" w:history="1">
             <w:r>
               <w:rPr>
                 <w:rStyle w:val="Lienhypertexte"/>
@@ -3207,7 +3207,7 @@
               <w:rPr>
                 <w:webHidden/>
               </w:rPr>
-              <w:instrText xml:space="preserve"> PAGEREF _Toc244067513 \h </w:instrText>
+              <w:instrText xml:space="preserve"> PAGEREF _Toc244069791 \h </w:instrText>
             </w:r>
             <w:r>
               <w:rPr>
@@ -3224,7 +3224,7 @@
               <w:rPr>
                 <w:webHidden/>
               </w:rPr>
-              <w:t>22</w:t>
+              <w:t>24</w:t>
             </w:r>
             <w:r>
               <w:rPr>
@@ -3244,7 +3244,7 @@
               <w:lang w:eastAsia="fr-CH"/>
             </w:rPr>
           </w:pPr>
-          <w:hyperlink w:anchor="_Toc244067514" w:history="1">
+          <w:hyperlink w:anchor="_Toc244069792" w:history="1">
             <w:r>
               <w:rPr>
                 <w:rStyle w:val="Lienhypertexte"/>
@@ -3268,7 +3268,7 @@
               <w:rPr>
                 <w:webHidden/>
               </w:rPr>
-              <w:instrText xml:space="preserve"> PAGEREF _Toc244067514 \h </w:instrText>
+              <w:instrText xml:space="preserve"> PAGEREF _Toc244069792 \h </w:instrText>
             </w:r>
             <w:r>
               <w:rPr>
@@ -3285,7 +3285,7 @@
               <w:rPr>
                 <w:webHidden/>
               </w:rPr>
-              <w:t>22</w:t>
+              <w:t>24</w:t>
             </w:r>
             <w:r>
               <w:rPr>
@@ -3305,7 +3305,7 @@
               <w:lang w:eastAsia="fr-CH"/>
             </w:rPr>
           </w:pPr>
-          <w:hyperlink w:anchor="_Toc244067515" w:history="1">
+          <w:hyperlink w:anchor="_Toc244069793" w:history="1">
             <w:r>
               <w:rPr>
                 <w:rStyle w:val="Lienhypertexte"/>
@@ -3329,7 +3329,7 @@
               <w:rPr>
                 <w:webHidden/>
               </w:rPr>
-              <w:instrText xml:space="preserve"> PAGEREF _Toc244067515 \h </w:instrText>
+              <w:instrText xml:space="preserve"> PAGEREF _Toc244069793 \h </w:instrText>
             </w:r>
             <w:r>
               <w:rPr>
@@ -3346,7 +3346,7 @@
               <w:rPr>
                 <w:webHidden/>
               </w:rPr>
-              <w:t>22</w:t>
+              <w:t>24</w:t>
             </w:r>
             <w:r>
               <w:rPr>
@@ -3473,7 +3473,7 @@
           <w:bCs/>
         </w:rPr>
       </w:pPr>
-      <w:bookmarkStart w:id="0" w:name="_Toc244067494"/>
+      <w:bookmarkStart w:id="0" w:name="_Toc244069772"/>
       <w:r>
         <w:rPr>
           <w:rFonts w:ascii="Calibri" w:hAnsi="Calibri" w:cs="Calibri"/>
@@ -3540,7 +3540,7 @@
           <w:bCs/>
         </w:rPr>
       </w:pPr>
-      <w:bookmarkStart w:id="1" w:name="_Toc244067495"/>
+      <w:bookmarkStart w:id="1" w:name="_Toc244069773"/>
       <w:r>
         <w:rPr>
           <w:rFonts w:ascii="Calibri" w:hAnsi="Calibri" w:cs="Calibri"/>
@@ -4323,7 +4323,7 @@
           <w:bCs/>
         </w:rPr>
       </w:pPr>
-      <w:bookmarkStart w:id="2" w:name="_Toc244067496"/>
+      <w:bookmarkStart w:id="2" w:name="_Toc244069774"/>
       <w:r>
         <w:rPr>
           <w:rFonts w:ascii="Calibri" w:hAnsi="Calibri" w:cs="Calibri"/>
@@ -4354,7 +4354,7 @@
           <w:szCs w:val="36"/>
         </w:rPr>
       </w:pPr>
-      <w:bookmarkStart w:id="3" w:name="_Toc244067497"/>
+      <w:bookmarkStart w:id="3" w:name="_Toc244069775"/>
       <w:r>
         <w:rPr>
           <w:rFonts w:ascii="Calibri" w:hAnsi="Calibri" w:cs="Calibri"/>
@@ -4379,7 +4379,7 @@
           <w:szCs w:val="32"/>
         </w:rPr>
       </w:pPr>
-      <w:bookmarkStart w:id="4" w:name="_Toc244067498"/>
+      <w:bookmarkStart w:id="4" w:name="_Toc244069776"/>
       <w:r>
         <w:rPr>
           <w:rFonts w:ascii="Calibri" w:hAnsi="Calibri" w:cs="Calibri"/>
@@ -4429,7 +4429,7 @@
           <w:szCs w:val="32"/>
         </w:rPr>
       </w:pPr>
-      <w:bookmarkStart w:id="5" w:name="_Toc244067499"/>
+      <w:bookmarkStart w:id="5" w:name="_Toc244069777"/>
       <w:r>
         <w:rPr>
           <w:rFonts w:ascii="Calibri" w:hAnsi="Calibri" w:cs="Calibri"/>
@@ -4676,7 +4676,7 @@
       <w:r>
         <w:br w:type="page"/>
       </w:r>
-      <w:bookmarkStart w:id="6" w:name="_Toc244067500"/>
+      <w:bookmarkStart w:id="6" w:name="_Toc244069778"/>
       <w:r>
         <w:rPr>
           <w:rFonts w:ascii="Calibri" w:hAnsi="Calibri" w:cs="Calibri"/>
@@ -5139,7 +5139,7 @@
           <w:szCs w:val="32"/>
         </w:rPr>
       </w:pPr>
-      <w:bookmarkStart w:id="7" w:name="_Toc244067501"/>
+      <w:bookmarkStart w:id="7" w:name="_Toc244069779"/>
       <w:r>
         <w:rPr>
           <w:rFonts w:ascii="Calibri" w:hAnsi="Calibri" w:cs="Calibri"/>
@@ -7936,7 +7936,7 @@
           <w:szCs w:val="32"/>
         </w:rPr>
       </w:pPr>
-      <w:bookmarkStart w:id="8" w:name="_Toc244067502"/>
+      <w:bookmarkStart w:id="8" w:name="_Toc244069780"/>
       <w:r>
         <w:rPr>
           <w:rFonts w:ascii="Calibri" w:hAnsi="Calibri" w:cs="Calibri"/>
@@ -8468,7 +8468,7 @@
           <w:szCs w:val="32"/>
         </w:rPr>
       </w:pPr>
-      <w:bookmarkStart w:id="9" w:name="_Toc244067503"/>
+      <w:bookmarkStart w:id="9" w:name="_Toc244069781"/>
       <w:r>
         <w:rPr>
           <w:rFonts w:ascii="Calibri" w:hAnsi="Calibri" w:cs="Calibri"/>
@@ -9561,7 +9561,7 @@
           <w:szCs w:val="32"/>
         </w:rPr>
       </w:pPr>
-      <w:bookmarkStart w:id="10" w:name="_Toc244067504"/>
+      <w:bookmarkStart w:id="10" w:name="_Toc244069782"/>
       <w:r>
         <w:rPr>
           <w:rFonts w:ascii="Calibri" w:hAnsi="Calibri" w:cs="Calibri"/>
@@ -9574,6 +9574,65 @@
         <w:t>3.1.7 MCD</w:t>
       </w:r>
       <w:bookmarkEnd w:id="10"/>
+    </w:p>
+    <w:p>
+      <w:pPr>
+        <w:ind w:left="284"/>
+        <w:rPr>
+          <w:rFonts w:ascii="Calibri" w:hAnsi="Calibri" w:cs="Calibri"/>
+        </w:rPr>
+      </w:pPr>
+      <w:r>
+        <w:rPr>
+          <w:rFonts w:ascii="Calibri" w:hAnsi="Calibri" w:cs="Calibri"/>
+        </w:rPr>
+        <w:t>Voici le MCD que j’ai réalisé en utilisant la méthode MERISE. Le MCD a été réalisé sur looping.</w:t>
+      </w:r>
+    </w:p>
+    <w:p>
+      <w:pPr>
+        <w:ind w:left="284"/>
+      </w:pPr>
+      <w:r>
+        <w:rPr>
+          <w:noProof/>
+        </w:rPr>
+        <w:drawing>
+          <wp:inline distT="0" distB="0" distL="0" distR="0" wp14:anchorId="1E1AC57D" wp14:editId="45382AEB">
+            <wp:extent cx="5760720" cy="4131310"/>
+            <wp:effectExtent l="0" t="0" r="0" b="2540"/>
+            <wp:docPr id="426680014" name="Image 1"/>
+            <wp:cNvGraphicFramePr>
+              <a:graphicFrameLocks xmlns:a="http://schemas.openxmlformats.org/drawingml/2006/main" noChangeAspect="1"/>
+            </wp:cNvGraphicFramePr>
+            <a:graphic xmlns:a="http://schemas.openxmlformats.org/drawingml/2006/main">
+              <a:graphicData uri="http://schemas.openxmlformats.org/drawingml/2006/picture">
+                <pic:pic xmlns:pic="http://schemas.openxmlformats.org/drawingml/2006/picture">
+                  <pic:nvPicPr>
+                    <pic:cNvPr id="426680014" name=""/>
+                    <pic:cNvPicPr/>
+                  </pic:nvPicPr>
+                  <pic:blipFill>
+                    <a:blip r:embed="rId14"/>
+                    <a:stretch>
+                      <a:fillRect/>
+                    </a:stretch>
+                  </pic:blipFill>
+                  <pic:spPr>
+                    <a:xfrm>
+                      <a:off x="0" y="0"/>
+                      <a:ext cx="5760720" cy="4131310"/>
+                    </a:xfrm>
+                    <a:prstGeom prst="rect">
+                      <a:avLst/>
+                    </a:prstGeom>
+                  </pic:spPr>
+                </pic:pic>
+              </a:graphicData>
+            </a:graphic>
+          </wp:inline>
+        </w:drawing>
+      </w:r>
     </w:p>
     <w:p>
       <w:pPr>
@@ -9609,7 +9668,7 @@
           <w:szCs w:val="32"/>
         </w:rPr>
       </w:pPr>
-      <w:bookmarkStart w:id="11" w:name="_Toc244067505"/>
+      <w:bookmarkStart w:id="11" w:name="_Toc244069783"/>
       <w:r>
         <w:rPr>
           <w:rFonts w:ascii="Calibri" w:hAnsi="Calibri" w:cs="Calibri"/>
@@ -9618,9 +9677,69 @@
           <w:sz w:val="32"/>
           <w:szCs w:val="32"/>
         </w:rPr>
+        <w:lastRenderedPageBreak/>
         <w:t>3.1.8 MLD</w:t>
       </w:r>
       <w:bookmarkEnd w:id="11"/>
+    </w:p>
+    <w:p>
+      <w:pPr>
+        <w:ind w:left="284"/>
+        <w:rPr>
+          <w:rFonts w:ascii="Calibri" w:hAnsi="Calibri" w:cs="Calibri"/>
+        </w:rPr>
+      </w:pPr>
+      <w:r>
+        <w:rPr>
+          <w:rFonts w:ascii="Calibri" w:hAnsi="Calibri" w:cs="Calibri"/>
+        </w:rPr>
+        <w:t>Voici le MLD qui a été automatiquement crée à partir du MCD. J’ai quand même dû renommer manuellement les clés étrangères afin de respecter les conventions de nommage de l’ETML.</w:t>
+      </w:r>
+    </w:p>
+    <w:p>
+      <w:pPr>
+        <w:ind w:left="284"/>
+      </w:pPr>
+      <w:r>
+        <w:rPr>
+          <w:noProof/>
+        </w:rPr>
+        <w:drawing>
+          <wp:inline distT="0" distB="0" distL="0" distR="0" wp14:anchorId="433F3320" wp14:editId="23FB82C1">
+            <wp:extent cx="5760720" cy="4069715"/>
+            <wp:effectExtent l="0" t="0" r="0" b="6985"/>
+            <wp:docPr id="2038876067" name="Image 1"/>
+            <wp:cNvGraphicFramePr>
+              <a:graphicFrameLocks xmlns:a="http://schemas.openxmlformats.org/drawingml/2006/main" noChangeAspect="1"/>
+            </wp:cNvGraphicFramePr>
+            <a:graphic xmlns:a="http://schemas.openxmlformats.org/drawingml/2006/main">
+              <a:graphicData uri="http://schemas.openxmlformats.org/drawingml/2006/picture">
+                <pic:pic xmlns:pic="http://schemas.openxmlformats.org/drawingml/2006/picture">
+                  <pic:nvPicPr>
+                    <pic:cNvPr id="2038876067" name=""/>
+                    <pic:cNvPicPr/>
+                  </pic:nvPicPr>
+                  <pic:blipFill>
+                    <a:blip r:embed="rId15"/>
+                    <a:stretch>
+                      <a:fillRect/>
+                    </a:stretch>
+                  </pic:blipFill>
+                  <pic:spPr>
+                    <a:xfrm>
+                      <a:off x="0" y="0"/>
+                      <a:ext cx="5760720" cy="4069715"/>
+                    </a:xfrm>
+                    <a:prstGeom prst="rect">
+                      <a:avLst/>
+                    </a:prstGeom>
+                  </pic:spPr>
+                </pic:pic>
+              </a:graphicData>
+            </a:graphic>
+          </wp:inline>
+        </w:drawing>
+      </w:r>
     </w:p>
     <w:p>
       <w:r>
@@ -9639,7 +9758,7 @@
           <w:szCs w:val="36"/>
         </w:rPr>
       </w:pPr>
-      <w:bookmarkStart w:id="12" w:name="_Toc244067506"/>
+      <w:bookmarkStart w:id="12" w:name="_Toc244069784"/>
       <w:r>
         <w:rPr>
           <w:rFonts w:ascii="Calibri" w:hAnsi="Calibri" w:cs="Calibri"/>
@@ -9648,6 +9767,7 @@
           <w:sz w:val="36"/>
           <w:szCs w:val="36"/>
         </w:rPr>
+        <w:lastRenderedPageBreak/>
         <w:t>3.2 Création des tables de la base de données</w:t>
       </w:r>
       <w:bookmarkEnd w:id="12"/>
@@ -9726,7 +9846,7 @@
                     <pic:cNvPicPr/>
                   </pic:nvPicPr>
                   <pic:blipFill>
-                    <a:blip r:embed="rId14"/>
+                    <a:blip r:embed="rId16"/>
                     <a:stretch>
                       <a:fillRect/>
                     </a:stretch>
@@ -9820,7 +9940,7 @@
                     <pic:cNvPicPr/>
                   </pic:nvPicPr>
                   <pic:blipFill>
-                    <a:blip r:embed="rId15"/>
+                    <a:blip r:embed="rId17"/>
                     <a:stretch>
                       <a:fillRect/>
                     </a:stretch>
@@ -9900,7 +10020,7 @@
           <w:szCs w:val="36"/>
         </w:rPr>
       </w:pPr>
-      <w:bookmarkStart w:id="13" w:name="_Toc244067507"/>
+      <w:bookmarkStart w:id="13" w:name="_Toc244069785"/>
       <w:r>
         <w:rPr>
           <w:rFonts w:ascii="Calibri" w:hAnsi="Calibri" w:cs="Calibri"/>
@@ -11532,7 +11652,7 @@
                           <pic:cNvPicPr/>
                         </pic:nvPicPr>
                         <pic:blipFill>
-                          <a:blip r:embed="rId16"/>
+                          <a:blip r:embed="rId18"/>
                           <a:stretch>
                             <a:fillRect/>
                           </a:stretch>
@@ -12599,7 +12719,7 @@
                           <pic:cNvPicPr/>
                         </pic:nvPicPr>
                         <pic:blipFill>
-                          <a:blip r:embed="rId17"/>
+                          <a:blip r:embed="rId19"/>
                           <a:stretch>
                             <a:fillRect/>
                           </a:stretch>
@@ -13734,7 +13854,7 @@
                           <pic:cNvPicPr/>
                         </pic:nvPicPr>
                         <pic:blipFill>
-                          <a:blip r:embed="rId18"/>
+                          <a:blip r:embed="rId20"/>
                           <a:stretch>
                             <a:fillRect/>
                           </a:stretch>
@@ -14852,7 +14972,7 @@
                           <pic:cNvPicPr/>
                         </pic:nvPicPr>
                         <pic:blipFill>
-                          <a:blip r:embed="rId19"/>
+                          <a:blip r:embed="rId21"/>
                           <a:stretch>
                             <a:fillRect/>
                           </a:stretch>
@@ -15970,7 +16090,7 @@
                           <pic:cNvPicPr/>
                         </pic:nvPicPr>
                         <pic:blipFill>
-                          <a:blip r:embed="rId20"/>
+                          <a:blip r:embed="rId22"/>
                           <a:stretch>
                             <a:fillRect/>
                           </a:stretch>
@@ -17148,7 +17268,7 @@
                           <pic:cNvPicPr/>
                         </pic:nvPicPr>
                         <pic:blipFill>
-                          <a:blip r:embed="rId21"/>
+                          <a:blip r:embed="rId23"/>
                           <a:stretch>
                             <a:fillRect/>
                           </a:stretch>
@@ -18245,7 +18365,7 @@
                           <pic:cNvPicPr/>
                         </pic:nvPicPr>
                         <pic:blipFill>
-                          <a:blip r:embed="rId22"/>
+                          <a:blip r:embed="rId24"/>
                           <a:stretch>
                             <a:fillRect/>
                           </a:stretch>
@@ -19342,7 +19462,7 @@
                           <pic:cNvPicPr/>
                         </pic:nvPicPr>
                         <pic:blipFill>
-                          <a:blip r:embed="rId23"/>
+                          <a:blip r:embed="rId25"/>
                           <a:stretch>
                             <a:fillRect/>
                           </a:stretch>
@@ -19414,7 +19534,7 @@
           <w:szCs w:val="36"/>
         </w:rPr>
       </w:pPr>
-      <w:bookmarkStart w:id="14" w:name="_Toc244067508"/>
+      <w:bookmarkStart w:id="14" w:name="_Toc244069786"/>
       <w:r>
         <w:rPr>
           <w:rFonts w:ascii="Calibri" w:hAnsi="Calibri" w:cs="Calibri"/>
@@ -20005,7 +20125,7 @@
                     <pic:cNvPicPr/>
                   </pic:nvPicPr>
                   <pic:blipFill>
-                    <a:blip r:embed="rId24"/>
+                    <a:blip r:embed="rId26"/>
                     <a:stretch>
                       <a:fillRect/>
                     </a:stretch>
@@ -20506,7 +20626,7 @@
                     <pic:cNvPicPr/>
                   </pic:nvPicPr>
                   <pic:blipFill>
-                    <a:blip r:embed="rId25"/>
+                    <a:blip r:embed="rId27"/>
                     <a:stretch>
                       <a:fillRect/>
                     </a:stretch>
@@ -21046,7 +21166,7 @@
                     <pic:cNvPicPr/>
                   </pic:nvPicPr>
                   <pic:blipFill>
-                    <a:blip r:embed="rId26"/>
+                    <a:blip r:embed="rId28"/>
                     <a:stretch>
                       <a:fillRect/>
                     </a:stretch>
@@ -21769,7 +21889,7 @@
                     <pic:cNvPicPr/>
                   </pic:nvPicPr>
                   <pic:blipFill>
-                    <a:blip r:embed="rId27"/>
+                    <a:blip r:embed="rId29"/>
                     <a:stretch>
                       <a:fillRect/>
                     </a:stretch>
@@ -22361,7 +22481,7 @@
                     <pic:cNvPicPr/>
                   </pic:nvPicPr>
                   <pic:blipFill>
-                    <a:blip r:embed="rId28"/>
+                    <a:blip r:embed="rId30"/>
                     <a:stretch>
                       <a:fillRect/>
                     </a:stretch>
@@ -22749,7 +22869,7 @@
           <w:szCs w:val="36"/>
         </w:rPr>
       </w:pPr>
-      <w:bookmarkStart w:id="15" w:name="_Toc244067509"/>
+      <w:bookmarkStart w:id="15" w:name="_Toc244069787"/>
       <w:r>
         <w:rPr>
           <w:rFonts w:ascii="Calibri" w:hAnsi="Calibri" w:cs="Calibri"/>
@@ -22774,7 +22894,7 @@
           <w:szCs w:val="36"/>
         </w:rPr>
       </w:pPr>
-      <w:bookmarkStart w:id="16" w:name="_Toc244067510"/>
+      <w:bookmarkStart w:id="16" w:name="_Toc244069788"/>
       <w:r>
         <w:rPr>
           <w:rFonts w:ascii="Calibri" w:hAnsi="Calibri" w:cs="Calibri"/>
@@ -22799,7 +22919,7 @@
           <w:szCs w:val="36"/>
         </w:rPr>
       </w:pPr>
-      <w:bookmarkStart w:id="17" w:name="_Toc244067511"/>
+      <w:bookmarkStart w:id="17" w:name="_Toc244069789"/>
       <w:r>
         <w:rPr>
           <w:rFonts w:ascii="Calibri" w:hAnsi="Calibri" w:cs="Calibri"/>
@@ -22822,7 +22942,7 @@
           <w:bCs/>
         </w:rPr>
       </w:pPr>
-      <w:bookmarkStart w:id="18" w:name="_Toc244067512"/>
+      <w:bookmarkStart w:id="18" w:name="_Toc244069790"/>
       <w:r>
         <w:rPr>
           <w:rFonts w:ascii="Calibri" w:hAnsi="Calibri" w:cs="Calibri"/>
@@ -22850,7 +22970,7 @@
           <w:bCs/>
         </w:rPr>
       </w:pPr>
-      <w:bookmarkStart w:id="19" w:name="_Toc244067513"/>
+      <w:bookmarkStart w:id="19" w:name="_Toc244069791"/>
       <w:r>
         <w:rPr>
           <w:rFonts w:ascii="Calibri" w:hAnsi="Calibri" w:cs="Calibri"/>
@@ -22870,7 +22990,7 @@
           <w:bCs/>
         </w:rPr>
       </w:pPr>
-      <w:bookmarkStart w:id="20" w:name="_Toc244067514"/>
+      <w:bookmarkStart w:id="20" w:name="_Toc244069792"/>
       <w:r>
         <w:rPr>
           <w:rFonts w:ascii="Calibri" w:hAnsi="Calibri" w:cs="Calibri"/>
@@ -22890,7 +23010,7 @@
           <w:bCs/>
         </w:rPr>
       </w:pPr>
-      <w:bookmarkStart w:id="21" w:name="_Toc244067515"/>
+      <w:bookmarkStart w:id="21" w:name="_Toc244069793"/>
       <w:r>
         <w:rPr>
           <w:rFonts w:ascii="Calibri" w:hAnsi="Calibri" w:cs="Calibri"/>
@@ -22902,7 +23022,7 @@
       <w:bookmarkEnd w:id="21"/>
     </w:p>
     <w:sectPr>
-      <w:footerReference w:type="first" r:id="rId29"/>
+      <w:footerReference w:type="first" r:id="rId31"/>
       <w:type w:val="continuous"/>
       <w:pgSz w:w="11906" w:h="16838"/>
       <w:pgMar w:top="1417" w:right="1417" w:bottom="1417" w:left="1417" w:header="708" w:footer="708" w:gutter="0"/>

</xml_diff>